<commit_message>
Update CLAUDE.md and both user manuals for TCP, JSON, Excel, Bytes/Words
CLAUDE.md: move completed items from §12 to §11 branch state; update §§1-6
with TCP transport, QXlsx in both apps, MessageJsonCodec, ExcelFieldCodec,
offsetUnit, wide-field decode, LiveTcpReceiver/TcpDataSender.

Manuals: add TCP live-mode/send sections, JSON whole-message import/export,
Excel field import/export, Bytes/Words offset selector, wide-field decode
note, new troubleshooting rows, glossary terms. Regenerated HTML + docx.

Co-Authored-By: Claude Sonnet 4.6 <noreply@anthropic.com>
</commit_message>
<xml_diff>
--- a/docs/manual/parser_manual.docx
+++ b/docs/manual/parser_manual.docx
@@ -21,7 +21,7 @@
         <w:t>reads and decodes</w:t>
       </w:r>
       <w:r>
-        <w:t xml:space="preserve"> UDP data — from a captured </w:t>
+        <w:t xml:space="preserve"> UDP and TCP data — from a captured </w:t>
       </w:r>
       <w:r>
         <w:rPr>
@@ -36,7 +36,7 @@
         <w:rPr>
           <w:b/>
         </w:rPr>
-        <w:t>live UDP</w:t>
+        <w:t>live UDP / TCP</w:t>
       </w:r>
       <w:r>
         <w:t xml:space="preserve"> stream — into engineering values, and exports the result to </w:t>
@@ -323,7 +323,7 @@
         <w:t>Input Mode</w:t>
       </w:r>
       <w:r>
-        <w:t xml:space="preserve"> — *File Mode* (a saved capture) or *Live Mode* (listen to UDP now). Plus </w:t>
+        <w:t xml:space="preserve"> — *File Mode* (a saved capture) or *Live Mode* (listen to UDP/TCP now). Plus </w:t>
       </w:r>
       <w:r>
         <w:rPr>
@@ -346,7 +346,7 @@
         <w:t>Input</w:t>
       </w:r>
       <w:r>
-        <w:t xml:space="preserve"> — choose the capture file (File Mode) or the listen settings (Live Mode).</w:t>
+        <w:t xml:space="preserve"> — choose the capture file (File Mode) or the listen/connect settings (Live Mode).</w:t>
       </w:r>
     </w:p>
     <w:p>
@@ -568,7 +568,25 @@
         <w:t>Live Mode</w:t>
       </w:r>
       <w:r>
-        <w:t xml:space="preserve"> (Ctrl+2) and set the listen port.</w:t>
+        <w:t xml:space="preserve"> (Ctrl+2), pick </w:t>
+      </w:r>
+      <w:r>
+        <w:rPr>
+          <w:b/>
+        </w:rPr>
+        <w:t>UDP</w:t>
+      </w:r>
+      <w:r>
+        <w:t xml:space="preserve"> or </w:t>
+      </w:r>
+      <w:r>
+        <w:rPr>
+          <w:b/>
+        </w:rPr>
+        <w:t>TCP</w:t>
+      </w:r>
+      <w:r>
+        <w:t xml:space="preserve"> transport, and set the listen port (or TCP host/port).</w:t>
       </w:r>
     </w:p>
     <w:p>
@@ -717,7 +735,7 @@
         <w:t>Live Mode</w:t>
       </w:r>
       <w:r>
-        <w:t xml:space="preserve"> (Ctrl+2) — bind a UDP port and decode datagrams as they arrive, writing per-message CSV files to a chosen folder.</w:t>
+        <w:t xml:space="preserve"> (Ctrl+2) — receive data live over the network and decode it as it arrives, writing per-message CSV files to a chosen folder.</w:t>
       </w:r>
     </w:p>
     <w:p>
@@ -763,7 +781,16 @@
         <w:t>Browse</w:t>
       </w:r>
       <w:r>
-        <w:t xml:space="preserve"> to the capture file. *Live Mode:* set the listen port (and per-message length filters) before </w:t>
+        <w:t xml:space="preserve"> to the capture file. *Live Mode:* pick a </w:t>
+      </w:r>
+      <w:r>
+        <w:rPr>
+          <w:b/>
+        </w:rPr>
+        <w:t>Transport</w:t>
+      </w:r>
+      <w:r>
+        <w:t xml:space="preserve"> (UDP or TCP), set the listen port, and optionally configure TCP-specific settings (role: Server/Client; host; frame length) before </w:t>
       </w:r>
       <w:r>
         <w:rPr>
@@ -834,7 +861,34 @@
         <w:t>Configure Fields</w:t>
       </w:r>
       <w:r>
-        <w:t xml:space="preserve"> opens the field editor (name, 1-based byte offset, data type, length, resolution / resolution expression). Fields can carry </w:t>
+        <w:t xml:space="preserve"> opens the field editor (name, 1-based byte offset, data type, length, resolution / resolution expression). An </w:t>
+      </w:r>
+      <w:r>
+        <w:rPr>
+          <w:b/>
+        </w:rPr>
+        <w:t>Offsets in</w:t>
+      </w:r>
+      <w:r>
+        <w:t xml:space="preserve"> selector lets you switch between </w:t>
+      </w:r>
+      <w:r>
+        <w:rPr>
+          <w:b/>
+        </w:rPr>
+        <w:t>Bytes</w:t>
+      </w:r>
+      <w:r>
+        <w:t xml:space="preserve"> and </w:t>
+      </w:r>
+      <w:r>
+        <w:rPr>
+          <w:b/>
+        </w:rPr>
+        <w:t>Words</w:t>
+      </w:r>
+      <w:r>
+        <w:t xml:space="preserve"> (1 word = 2 bytes) for display; field offsets are always stored in bytes internally. Fields can carry </w:t>
       </w:r>
       <w:r>
         <w:rPr>
@@ -862,6 +916,11 @@
       </w:r>
       <w:r>
         <w:t xml:space="preserve"> to validate everything first.</w:t>
+      </w:r>
+    </w:p>
+    <w:p>
+      <w:r>
+        <w:t>There is no length cap on numeric fields — fields wider than 8 bytes are decoded to exact decimal values (or resolution-scaled doubles).</w:t>
       </w:r>
     </w:p>
     <w:p>
@@ -1026,7 +1085,16 @@
         <w:t>Live Mode</w:t>
       </w:r>
       <w:r>
-        <w:t xml:space="preserve"> (Ctrl+2) → set the listen </w:t>
+        <w:t xml:space="preserve"> (Ctrl+2) → transport </w:t>
+      </w:r>
+      <w:r>
+        <w:rPr>
+          <w:b/>
+        </w:rPr>
+        <w:t>UDP</w:t>
+      </w:r>
+      <w:r>
+        <w:t xml:space="preserve"> → set the listen </w:t>
       </w:r>
       <w:r>
         <w:rPr>
@@ -1083,6 +1151,80 @@
         <w:pStyle w:val="Heading2"/>
       </w:pPr>
       <w:r>
+        <w:t>Decode a live TCP stream</w:t>
+      </w:r>
+    </w:p>
+    <w:p>
+      <w:r>
+        <w:t xml:space="preserve">1. </w:t>
+      </w:r>
+      <w:r>
+        <w:rPr>
+          <w:b/>
+        </w:rPr>
+        <w:t>Live Mode</w:t>
+      </w:r>
+      <w:r>
+        <w:t xml:space="preserve"> (Ctrl+2) → transport </w:t>
+      </w:r>
+      <w:r>
+        <w:rPr>
+          <w:b/>
+        </w:rPr>
+        <w:t>TCP</w:t>
+      </w:r>
+      <w:r>
+        <w:t>.</w:t>
+      </w:r>
+    </w:p>
+    <w:p>
+      <w:r>
+        <w:t xml:space="preserve">2. </w:t>
+      </w:r>
+      <w:r>
+        <w:t xml:space="preserve">Choose a </w:t>
+      </w:r>
+      <w:r>
+        <w:rPr>
+          <w:b/>
+        </w:rPr>
+        <w:t>Role</w:t>
+      </w:r>
+      <w:r>
+        <w:t xml:space="preserve">: *Server* (listen for incoming connections) or *Client* (connect to a remote host). Set the port (and host for Client mode). Set the </w:t>
+      </w:r>
+      <w:r>
+        <w:rPr>
+          <w:b/>
+        </w:rPr>
+        <w:t>Frame length</w:t>
+      </w:r>
+      <w:r>
+        <w:t xml:space="preserve"> so the reader knows where one message ends and the next begins.</w:t>
+      </w:r>
+    </w:p>
+    <w:p>
+      <w:r>
+        <w:t xml:space="preserve">3. </w:t>
+      </w:r>
+      <w:r>
+        <w:t xml:space="preserve">Define messages/fields → </w:t>
+      </w:r>
+      <w:r>
+        <w:rPr>
+          <w:b/>
+        </w:rPr>
+        <w:t>Start Live</w:t>
+      </w:r>
+      <w:r>
+        <w:t>. TCP data is framed and decoded the same way as UDP.</w:t>
+      </w:r>
+    </w:p>
+    <w:p>
+      <w:pPr>
+        <w:pStyle w:val="Heading2"/>
+      </w:pPr>
+      <w:r>
         <w:t>Import message/field definitions from a Word ICD</w:t>
       </w:r>
     </w:p>
@@ -1184,6 +1326,191 @@
         <w:pStyle w:val="Heading2"/>
       </w:pPr>
       <w:r>
+        <w:t>Import/export fields as Excel</w:t>
+      </w:r>
+    </w:p>
+    <w:p>
+      <w:r>
+        <w:t xml:space="preserve">In </w:t>
+      </w:r>
+      <w:r>
+        <w:rPr>
+          <w:b/>
+        </w:rPr>
+        <w:t>Configure Fields</w:t>
+      </w:r>
+      <w:r>
+        <w:t xml:space="preserve">, use the </w:t>
+      </w:r>
+      <w:r>
+        <w:rPr>
+          <w:b/>
+        </w:rPr>
+        <w:t>Excel</w:t>
+      </w:r>
+      <w:r>
+        <w:t xml:space="preserve"> menu → </w:t>
+      </w:r>
+      <w:r>
+        <w:rPr>
+          <w:b/>
+        </w:rPr>
+        <w:t>Import</w:t>
+      </w:r>
+      <w:r>
+        <w:t xml:space="preserve"> to load fields from a </w:t>
+      </w:r>
+      <w:r>
+        <w:rPr>
+          <w:rFonts w:ascii="Consolas" w:hAnsi="Consolas"/>
+          <w:color w:val="C7254E"/>
+        </w:rPr>
+        <w:t>.xlsx</w:t>
+      </w:r>
+      <w:r>
+        <w:t xml:space="preserve"> file (same column layout as CSV: Name, ByteOffset, DataType, Length, Resolution, etc.), or </w:t>
+      </w:r>
+      <w:r>
+        <w:rPr>
+          <w:b/>
+        </w:rPr>
+        <w:t>Export</w:t>
+      </w:r>
+      <w:r>
+        <w:t xml:space="preserve"> to write the current fields to Excel. Bit decoders are not carried in the spreadsheet — use JSON for those.</w:t>
+      </w:r>
+    </w:p>
+    <w:p>
+      <w:pPr>
+        <w:pStyle w:val="Heading2"/>
+      </w:pPr>
+      <w:r>
+        <w:t>Import/export fields as JSON (lossless)</w:t>
+      </w:r>
+    </w:p>
+    <w:p>
+      <w:r>
+        <w:t xml:space="preserve">In </w:t>
+      </w:r>
+      <w:r>
+        <w:rPr>
+          <w:b/>
+        </w:rPr>
+        <w:t>Configure Fields</w:t>
+      </w:r>
+      <w:r>
+        <w:t xml:space="preserve">, use the </w:t>
+      </w:r>
+      <w:r>
+        <w:rPr>
+          <w:b/>
+        </w:rPr>
+        <w:t>JSON</w:t>
+      </w:r>
+      <w:r>
+        <w:t xml:space="preserve"> menu → </w:t>
+      </w:r>
+      <w:r>
+        <w:rPr>
+          <w:b/>
+        </w:rPr>
+        <w:t>Import</w:t>
+      </w:r>
+      <w:r>
+        <w:t xml:space="preserve"> / </w:t>
+      </w:r>
+      <w:r>
+        <w:rPr>
+          <w:b/>
+        </w:rPr>
+        <w:t>Export</w:t>
+      </w:r>
+      <w:r>
+        <w:t>. The JSON format carries the full field definition including bitfield decoders, conditional decoders, and resolution expressions.</w:t>
+      </w:r>
+    </w:p>
+    <w:p>
+      <w:pPr>
+        <w:pStyle w:val="Heading2"/>
+      </w:pPr>
+      <w:r>
+        <w:t>Import/export whole messages as JSON</w:t>
+      </w:r>
+    </w:p>
+    <w:p>
+      <w:r>
+        <w:rPr>
+          <w:b/>
+        </w:rPr>
+        <w:t>File → Export Messages (JSON)</w:t>
+      </w:r>
+      <w:r>
+        <w:t xml:space="preserve"> writes all configured messages (both modes) — fields, compare options, payload length, port — to a single JSON file. </w:t>
+      </w:r>
+      <w:r>
+        <w:rPr>
+          <w:b/>
+        </w:rPr>
+        <w:t>File → Import Messages (JSON)</w:t>
+      </w:r>
+      <w:r>
+        <w:t xml:space="preserve"> loads them back, appending to the current list (clashing names are auto-renamed). The format is shared with the simulator, so you can round-trip definitions between the two apps without data loss.</w:t>
+      </w:r>
+    </w:p>
+    <w:p>
+      <w:pPr>
+        <w:pStyle w:val="Heading2"/>
+      </w:pPr>
+      <w:r>
+        <w:t>Switch offset display to Words</w:t>
+      </w:r>
+    </w:p>
+    <w:p>
+      <w:r>
+        <w:t xml:space="preserve">In </w:t>
+      </w:r>
+      <w:r>
+        <w:rPr>
+          <w:b/>
+        </w:rPr>
+        <w:t>Configure Fields</w:t>
+      </w:r>
+      <w:r>
+        <w:t xml:space="preserve">, change the </w:t>
+      </w:r>
+      <w:r>
+        <w:rPr>
+          <w:b/>
+        </w:rPr>
+        <w:t>Offsets in</w:t>
+      </w:r>
+      <w:r>
+        <w:t xml:space="preserve"> dropdown from </w:t>
+      </w:r>
+      <w:r>
+        <w:rPr>
+          <w:b/>
+        </w:rPr>
+        <w:t>Bytes</w:t>
+      </w:r>
+      <w:r>
+        <w:t xml:space="preserve"> to </w:t>
+      </w:r>
+      <w:r>
+        <w:rPr>
+          <w:b/>
+        </w:rPr>
+        <w:t>Words (2 bytes)</w:t>
+      </w:r>
+      <w:r>
+        <w:t>. The offset column will display and accept word-based offsets (1 word = 2 bytes). The underlying byte offsets are unchanged; this is purely a display convenience.</w:t>
+      </w:r>
+    </w:p>
+    <w:p>
+      <w:pPr>
+        <w:pStyle w:val="Heading2"/>
+      </w:pPr>
+      <w:r>
         <w:t>Use the simulator as a test source</w:t>
       </w:r>
     </w:p>
@@ -1198,7 +1525,7 @@
         <w:t>Live Mode</w:t>
       </w:r>
       <w:r>
-        <w:t xml:space="preserve"> port, and stream a message — a quick way to validate your field definitions end to end.</w:t>
+        <w:t xml:space="preserve"> port (UDP or TCP), and stream a message — a quick way to validate your field definitions end to end.</w:t>
       </w:r>
     </w:p>
     <w:p>
@@ -1400,7 +1727,7 @@
           <w:p>
             <w:r/>
             <w:r>
-              <w:t>Live Mode shows 0 messages</w:t>
+              <w:t>Live Mode shows 0 messages (UDP)</w:t>
             </w:r>
           </w:p>
         </w:tc>
@@ -1423,6 +1750,41 @@
             <w:r/>
             <w:r>
               <w:t>Confirm a sender is transmitting to this PC's IP and the listen port; allow the app through the firewall.</w:t>
+            </w:r>
+          </w:p>
+        </w:tc>
+      </w:tr>
+      <w:tr>
+        <w:tc>
+          <w:tcPr>
+            <w:tcW w:type="dxa" w:w="2880"/>
+          </w:tcPr>
+          <w:p>
+            <w:r/>
+            <w:r>
+              <w:t>Live Mode TCP won't connect</w:t>
+            </w:r>
+          </w:p>
+        </w:tc>
+        <w:tc>
+          <w:tcPr>
+            <w:tcW w:type="dxa" w:w="2880"/>
+          </w:tcPr>
+          <w:p>
+            <w:r/>
+            <w:r>
+              <w:t>Wrong role, host, or port</w:t>
+            </w:r>
+          </w:p>
+        </w:tc>
+        <w:tc>
+          <w:tcPr>
+            <w:tcW w:type="dxa" w:w="2880"/>
+          </w:tcPr>
+          <w:p>
+            <w:r/>
+            <w:r>
+              <w:t>Server mode listens; Client mode connects. Confirm the remote end is running and the host/port are correct.</w:t>
             </w:r>
           </w:p>
         </w:tc>
@@ -2007,10 +2369,10 @@
         <w:rPr>
           <w:b/>
         </w:rPr>
-        <w:t>Message filter</w:t>
-      </w:r>
-      <w:r>
-        <w:t xml:space="preserve"> — a rule (by port, header signature and/or payload length) selecting which datagrams map to which message definition.</w:t>
+        <w:t>TCP frame</w:t>
+      </w:r>
+      <w:r>
+        <w:t xml:space="preserve"> — a fixed-length chunk of a TCP byte stream; set the frame length to match one message.</w:t>
       </w:r>
     </w:p>
     <w:p>
@@ -2021,10 +2383,47 @@
         <w:rPr>
           <w:b/>
         </w:rPr>
+        <w:t>Message filter</w:t>
+      </w:r>
+      <w:r>
+        <w:t xml:space="preserve"> — a rule (by port, header signature and/or payload length) selecting which datagrams map to which message definition.</w:t>
+      </w:r>
+    </w:p>
+    <w:p>
+      <w:pPr>
+        <w:pStyle w:val="ListBullet"/>
+      </w:pPr>
+      <w:r>
+        <w:rPr>
+          <w:b/>
+        </w:rPr>
         <w:t>Byte offset</w:t>
       </w:r>
       <w:r>
         <w:t xml:space="preserve"> — 1-based position of a field's first byte within the payload.</w:t>
+      </w:r>
+    </w:p>
+    <w:p>
+      <w:pPr>
+        <w:pStyle w:val="ListBullet"/>
+      </w:pPr>
+      <w:r>
+        <w:rPr>
+          <w:b/>
+        </w:rPr>
+        <w:t>Word offset</w:t>
+      </w:r>
+      <w:r>
+        <w:t xml:space="preserve"> — 1-based position in 2-byte words; displayed when </w:t>
+      </w:r>
+      <w:r>
+        <w:rPr>
+          <w:b/>
+        </w:rPr>
+        <w:t>Offsets in</w:t>
+      </w:r>
+      <w:r>
+        <w:t xml:space="preserve"> is set to Words.</w:t>
       </w:r>
     </w:p>
     <w:p>

</xml_diff>

<commit_message>
Update docs for the multi-connection suite
- CLAUDE.md: shared connection model, parser/sim multi-connection wiring,
  branch state + pending E2E (already revised in the feature work)
- Parser manual: Configure Connections (adapter + port, no IP for UDP),
  per-message Connection binding, "Manage Length Filters" -> "Configure
  Messages", in-dialog JSON import/export
- Simulator manual: connection manager replaces the single Connect flow
  (Test Connection; open-on-Send), per-message Connection column, multi-
  destination workflow, legacy single-destination setups load as one
  connection; refreshed troubleshooting
- Regenerated HTML/docx + parser_manual.qrc (now also bundles the ICD
  table-picker screenshot the qrc references)

Co-Authored-By: Claude Opus 4.8 <noreply@anthropic.com>
</commit_message>
<xml_diff>
--- a/docs/manual/parser_manual.docx
+++ b/docs/manual/parser_manual.docx
@@ -781,7 +781,7 @@
         <w:t>Browse</w:t>
       </w:r>
       <w:r>
-        <w:t xml:space="preserve"> to the capture file. *Live Mode:* pick a </w:t>
+        <w:t xml:space="preserve"> to the capture file. *Live Mode:* either use the single </w:t>
       </w:r>
       <w:r>
         <w:rPr>
@@ -790,7 +790,16 @@
         <w:t>Transport</w:t>
       </w:r>
       <w:r>
-        <w:t xml:space="preserve"> (UDP or TCP), set the listen port, and optionally configure TCP-specific settings (role: Server/Client; host; frame length) before </w:t>
+        <w:t xml:space="preserve"> (UDP or TCP) + listen port row, or press </w:t>
+      </w:r>
+      <w:r>
+        <w:rPr>
+          <w:b/>
+        </w:rPr>
+        <w:t>Configure Connections…</w:t>
+      </w:r>
+      <w:r>
+        <w:t xml:space="preserve"> to define several connections at once (see below). For TCP you can also set the role (Server/Client), host and frame length before </w:t>
       </w:r>
       <w:r>
         <w:rPr>
@@ -807,39 +816,54 @@
         <w:pStyle w:val="Heading2"/>
       </w:pPr>
       <w:r>
-        <w:t>Message Filters</w:t>
+        <w:t>Connections (Live Mode)</w:t>
       </w:r>
     </w:p>
     <w:p>
-      <w:r>
-        <w:t xml:space="preserve">Select </w:t>
-      </w:r>
       <w:r>
         <w:rPr>
           <w:b/>
         </w:rPr>
-        <w:t>Port</w:t>
-      </w:r>
-      <w:r>
-        <w:t xml:space="preserve"> or </w:t>
+        <w:t>Configure Connections…</w:t>
+      </w:r>
+      <w:r>
+        <w:t xml:space="preserve"> opens a manager where you add, edit or remove receive connections. Each connection picks a network </w:t>
       </w:r>
       <w:r>
         <w:rPr>
           <w:b/>
         </w:rPr>
-        <w:t>Header</w:t>
-      </w:r>
-      <w:r>
-        <w:t xml:space="preserve"> filtering and set the number of filters. Each filter row has a port and a </w:t>
+        <w:t>adapter</w:t>
+      </w:r>
+      <w:r>
+        <w:t xml:space="preserve"> (chosen by number from the list, which always includes *Any adapter* and *Loopback*) and a </w:t>
       </w:r>
       <w:r>
         <w:rPr>
           <w:b/>
         </w:rPr>
-        <w:t>Manage Length Filters</w:t>
-      </w:r>
-      <w:r>
-        <w:t xml:space="preserve"> button (route messages by payload length) with a live message count. Header filtering lets you tell apart same-length messages by a leading signature.</w:t>
+        <w:t>port</w:t>
+      </w:r>
+      <w:r>
+        <w:t xml:space="preserve"> — for UDP you never type an IP address, just the adapter and port. TCP connections add a Listen/Connect role. When one or more connections are defined, the reader binds a separate receiver per connection on </w:t>
+      </w:r>
+      <w:r>
+        <w:rPr>
+          <w:b/>
+        </w:rPr>
+        <w:t>Start Live</w:t>
+      </w:r>
+      <w:r>
+        <w:t xml:space="preserve"> and decodes each message </w:t>
+      </w:r>
+      <w:r>
+        <w:rPr>
+          <w:b/>
+        </w:rPr>
+        <w:t>only</w:t>
+      </w:r>
+      <w:r>
+        <w:t xml:space="preserve"> against the connection it is bound to, so traffic from different adapters/ports never gets mixed. Leave the list empty to fall back to the single Transport/Port row.</w:t>
       </w:r>
     </w:p>
     <w:p>
@@ -847,12 +871,61 @@
         <w:pStyle w:val="Heading2"/>
       </w:pPr>
       <w:r>
-        <w:t>Configured Messages</w:t>
+        <w:t>Message Filters</w:t>
       </w:r>
     </w:p>
     <w:p>
       <w:r>
-        <w:t xml:space="preserve">The list of messages to decode. Each has a name, payload length, port and fields. </w:t>
+        <w:t xml:space="preserve">Select </w:t>
+      </w:r>
+      <w:r>
+        <w:rPr>
+          <w:b/>
+        </w:rPr>
+        <w:t>Port</w:t>
+      </w:r>
+      <w:r>
+        <w:t xml:space="preserve"> or </w:t>
+      </w:r>
+      <w:r>
+        <w:rPr>
+          <w:b/>
+        </w:rPr>
+        <w:t>Header</w:t>
+      </w:r>
+      <w:r>
+        <w:t xml:space="preserve"> filtering and set the number of filters. Each filter row has a port and a </w:t>
+      </w:r>
+      <w:r>
+        <w:rPr>
+          <w:b/>
+        </w:rPr>
+        <w:t>Configure Messages</w:t>
+      </w:r>
+      <w:r>
+        <w:t xml:space="preserve"> button (route messages by payload length) with a live message count. Header filtering lets you tell apart same-length messages by a leading signature.</w:t>
+      </w:r>
+    </w:p>
+    <w:p>
+      <w:pPr>
+        <w:pStyle w:val="Heading2"/>
+      </w:pPr>
+      <w:r>
+        <w:t>Configured Messages</w:t>
+      </w:r>
+    </w:p>
+    <w:p>
+      <w:r>
+        <w:t xml:space="preserve">The list of messages to decode. Each has a name, payload length, port and fields. In Live Mode, when connections are defined, a </w:t>
+      </w:r>
+      <w:r>
+        <w:rPr>
+          <w:b/>
+        </w:rPr>
+        <w:t>Connection</w:t>
+      </w:r>
+      <w:r>
+        <w:t xml:space="preserve"> column shows (and lets you set, via the Configure Messages dialog) which connection each message is decoded from. </w:t>
       </w:r>
       <w:r>
         <w:rPr>
@@ -1218,6 +1291,152 @@
       </w:r>
       <w:r>
         <w:t>. TCP data is framed and decoded the same way as UDP.</w:t>
+      </w:r>
+    </w:p>
+    <w:p>
+      <w:pPr>
+        <w:pStyle w:val="Heading2"/>
+      </w:pPr>
+      <w:r>
+        <w:t>Receive from multiple sources at once (connections)</w:t>
+      </w:r>
+    </w:p>
+    <w:p>
+      <w:r>
+        <w:t xml:space="preserve">1. </w:t>
+      </w:r>
+      <w:r>
+        <w:rPr>
+          <w:b/>
+        </w:rPr>
+        <w:t>Live Mode</w:t>
+      </w:r>
+      <w:r>
+        <w:t xml:space="preserve"> (Ctrl+2) → </w:t>
+      </w:r>
+      <w:r>
+        <w:rPr>
+          <w:b/>
+        </w:rPr>
+        <w:t>Configure Connections…</w:t>
+      </w:r>
+      <w:r>
+        <w:t xml:space="preserve"> → </w:t>
+      </w:r>
+      <w:r>
+        <w:rPr>
+          <w:b/>
+        </w:rPr>
+        <w:t>Add</w:t>
+      </w:r>
+      <w:r>
+        <w:t xml:space="preserve"> one connection per source.</w:t>
+      </w:r>
+    </w:p>
+    <w:p>
+      <w:r>
+        <w:t xml:space="preserve">2. </w:t>
+      </w:r>
+      <w:r>
+        <w:t xml:space="preserve">For each, pick the </w:t>
+      </w:r>
+      <w:r>
+        <w:rPr>
+          <w:b/>
+        </w:rPr>
+        <w:t>adapter</w:t>
+      </w:r>
+      <w:r>
+        <w:t xml:space="preserve"> (by number; *Any* and *Loopback* are always listed) and the </w:t>
+      </w:r>
+      <w:r>
+        <w:rPr>
+          <w:b/>
+        </w:rPr>
+        <w:t>port</w:t>
+      </w:r>
+      <w:r>
+        <w:t>; for UDP that is all — no IP address. For TCP also pick Listen or Connect.</w:t>
+      </w:r>
+    </w:p>
+    <w:p>
+      <w:r>
+        <w:t xml:space="preserve">3. </w:t>
+      </w:r>
+      <w:r>
+        <w:t xml:space="preserve">Press </w:t>
+      </w:r>
+      <w:r>
+        <w:rPr>
+          <w:b/>
+        </w:rPr>
+        <w:t>Configure Messages</w:t>
+      </w:r>
+      <w:r>
+        <w:t xml:space="preserve">, and in the </w:t>
+      </w:r>
+      <w:r>
+        <w:rPr>
+          <w:b/>
+        </w:rPr>
+        <w:t>Connection</w:t>
+      </w:r>
+      <w:r>
+        <w:t xml:space="preserve"> column bind each message to the connection it should be decoded from (leave a message on *(any connection)* to accept it from all of them).</w:t>
+      </w:r>
+    </w:p>
+    <w:p>
+      <w:r>
+        <w:t xml:space="preserve">4. </w:t>
+      </w:r>
+      <w:r>
+        <w:rPr>
+          <w:b/>
+        </w:rPr>
+        <w:t>Start Live</w:t>
+      </w:r>
+      <w:r>
+        <w:t xml:space="preserve"> — one receiver runs per connection and each message is only matched on its connection, so two sources on different adapters/ports are kept completely separate.</w:t>
+      </w:r>
+    </w:p>
+    <w:p>
+      <w:pPr>
+        <w:pStyle w:val="Heading2"/>
+      </w:pPr>
+      <w:r>
+        <w:t>Import/export messages while configuring (JSON)</w:t>
+      </w:r>
+    </w:p>
+    <w:p>
+      <w:r>
+        <w:t xml:space="preserve">Inside the </w:t>
+      </w:r>
+      <w:r>
+        <w:rPr>
+          <w:b/>
+        </w:rPr>
+        <w:t>Configure Messages</w:t>
+      </w:r>
+      <w:r>
+        <w:t xml:space="preserve"> dialog, </w:t>
+      </w:r>
+      <w:r>
+        <w:rPr>
+          <w:b/>
+        </w:rPr>
+        <w:t>Import JSON…</w:t>
+      </w:r>
+      <w:r>
+        <w:t xml:space="preserve"> appends message definitions from a JSON file and </w:t>
+      </w:r>
+      <w:r>
+        <w:rPr>
+          <w:b/>
+        </w:rPr>
+        <w:t>Export JSON…</w:t>
+      </w:r>
+      <w:r>
+        <w:t xml:space="preserve"> writes the current list out — the same format the simulator and the File menu use.</w:t>
       </w:r>
     </w:p>
     <w:p>

</xml_diff>

<commit_message>
Refresh both user manuals with full screenshot set + ICD walkthrough
Rewrote parser_manual.md and simulator_manual.md to embed a complete set
of UI/process screenshots (29 shots captured from the release builds) and
added a dedicated "Import from a Word ICD" walkthrough covering the shared
table picker, table settings, and build/review. Expanded the
errors/solutions tables and glossaries.

Regenerated the in-app HTML, the .docx (now image-rich), and both per-app
.qrc via docs/make_manuals.py, and rebuilt both exes so Help -> User Manual
(F1) shows the new manuals with inline screenshots.

Also: 1-line IcdTablePickerDialog.ui layout fix (rootLayout stretch).

Co-Authored-By: Claude Opus 4.8 <noreply@anthropic.com>
</commit_message>
<xml_diff>
--- a/docs/manual/parser_manual.docx
+++ b/docs/manual/parser_manual.docx
@@ -204,7 +204,7 @@
       <w:r>
         <w:drawing>
           <wp:inline xmlns:a="http://schemas.openxmlformats.org/drawingml/2006/main" xmlns:pic="http://schemas.openxmlformats.org/drawingml/2006/picture">
-            <wp:extent cx="5760720" cy="4287390"/>
+            <wp:extent cx="5760720" cy="4305569"/>
             <wp:docPr id="1" name="Picture 1"/>
             <wp:cNvGraphicFramePr>
               <a:graphicFrameLocks noChangeAspect="1"/>
@@ -225,7 +225,7 @@
                   <pic:spPr>
                     <a:xfrm>
                       <a:off x="0" y="0"/>
-                      <a:ext cx="5760720" cy="4287390"/>
+                      <a:ext cx="5760720" cy="4305569"/>
                     </a:xfrm>
                     <a:prstGeom prst="rect"/>
                   </pic:spPr>
@@ -265,7 +265,7 @@
       <w:r>
         <w:drawing>
           <wp:inline xmlns:a="http://schemas.openxmlformats.org/drawingml/2006/main" xmlns:pic="http://schemas.openxmlformats.org/drawingml/2006/picture">
-            <wp:extent cx="5760720" cy="5640466"/>
+            <wp:extent cx="5760720" cy="5672593"/>
             <wp:docPr id="2" name="Picture 2"/>
             <wp:cNvGraphicFramePr>
               <a:graphicFrameLocks noChangeAspect="1"/>
@@ -286,7 +286,7 @@
                   <pic:spPr>
                     <a:xfrm>
                       <a:off x="0" y="0"/>
-                      <a:ext cx="5760720" cy="5640466"/>
+                      <a:ext cx="5760720" cy="5672593"/>
                     </a:xfrm>
                     <a:prstGeom prst="rect"/>
                   </pic:spPr>
@@ -459,7 +459,7 @@
       <w:r>
         <w:drawing>
           <wp:inline xmlns:a="http://schemas.openxmlformats.org/drawingml/2006/main" xmlns:pic="http://schemas.openxmlformats.org/drawingml/2006/picture">
-            <wp:extent cx="5760720" cy="5640466"/>
+            <wp:extent cx="5760720" cy="5672593"/>
             <wp:docPr id="3" name="Picture 3"/>
             <wp:cNvGraphicFramePr>
               <a:graphicFrameLocks noChangeAspect="1"/>
@@ -480,7 +480,7 @@
                   <pic:spPr>
                     <a:xfrm>
                       <a:off x="0" y="0"/>
-                      <a:ext cx="5760720" cy="5640466"/>
+                      <a:ext cx="5760720" cy="5672593"/>
                     </a:xfrm>
                     <a:prstGeom prst="rect"/>
                   </pic:spPr>
@@ -668,369 +668,54 @@
       </w:r>
     </w:p>
     <w:p>
-      <w:pPr>
-        <w:pBdr>
-          <w:bottom w:val="single" w:sz="6" w:space="1" w:color="BBBBBB"/>
-        </w:pBdr>
-      </w:pPr>
+      <w:r>
+        <w:t>After importing the sample ICD, the main window shows the configured messages ready to decode:</w:t>
+      </w:r>
     </w:p>
     <w:p>
-      <w:pPr>
-        <w:pStyle w:val="Heading1"/>
-      </w:pPr>
-      <w:r>
-        <w:t>The main window, panel by panel</w:t>
+      <w:r>
+        <w:drawing>
+          <wp:inline xmlns:a="http://schemas.openxmlformats.org/drawingml/2006/main" xmlns:pic="http://schemas.openxmlformats.org/drawingml/2006/picture">
+            <wp:extent cx="5760720" cy="6618798"/>
+            <wp:docPr id="4" name="Picture 4"/>
+            <wp:cNvGraphicFramePr>
+              <a:graphicFrameLocks noChangeAspect="1"/>
+            </wp:cNvGraphicFramePr>
+            <a:graphic>
+              <a:graphicData uri="http://schemas.openxmlformats.org/drawingml/2006/picture">
+                <pic:pic>
+                  <pic:nvPicPr>
+                    <pic:cNvPr id="0" name="main-configured.png"/>
+                    <pic:cNvPicPr/>
+                  </pic:nvPicPr>
+                  <pic:blipFill>
+                    <a:blip r:embed="rId12"/>
+                    <a:stretch>
+                      <a:fillRect/>
+                    </a:stretch>
+                  </pic:blipFill>
+                  <pic:spPr>
+                    <a:xfrm>
+                      <a:off x="0" y="0"/>
+                      <a:ext cx="5760720" cy="6618798"/>
+                    </a:xfrm>
+                    <a:prstGeom prst="rect"/>
+                  </pic:spPr>
+                </pic:pic>
+              </a:graphicData>
+            </a:graphic>
+          </wp:inline>
+        </w:drawing>
       </w:r>
     </w:p>
     <w:p>
-      <w:pPr>
-        <w:pStyle w:val="Heading2"/>
-      </w:pPr>
-      <w:r>
-        <w:t>Input Mode</w:t>
-      </w:r>
-    </w:p>
-    <w:p>
-      <w:pPr>
-        <w:pStyle w:val="ListBullet"/>
-      </w:pPr>
       <w:r>
         <w:rPr>
-          <w:b/>
+          <w:i/>
+          <w:color w:val="666666"/>
+          <w:sz w:val="18"/>
         </w:rPr>
-        <w:t>File Mode</w:t>
-      </w:r>
-      <w:r>
-        <w:t xml:space="preserve"> (Ctrl+1) — decode a saved </w:t>
-      </w:r>
-      <w:r>
-        <w:rPr>
-          <w:rFonts w:ascii="Consolas" w:hAnsi="Consolas"/>
-          <w:color w:val="C7254E"/>
-        </w:rPr>
-        <w:t>.pcap</w:t>
-      </w:r>
-      <w:r>
-        <w:t>/</w:t>
-      </w:r>
-      <w:r>
-        <w:rPr>
-          <w:rFonts w:ascii="Consolas" w:hAnsi="Consolas"/>
-          <w:color w:val="C7254E"/>
-        </w:rPr>
-        <w:t>.pcapng</w:t>
-      </w:r>
-      <w:r>
-        <w:t xml:space="preserve"> capture.</w:t>
-      </w:r>
-    </w:p>
-    <w:p>
-      <w:pPr>
-        <w:pStyle w:val="ListBullet"/>
-      </w:pPr>
-      <w:r>
-        <w:rPr>
-          <w:b/>
-        </w:rPr>
-        <w:t>Live Mode</w:t>
-      </w:r>
-      <w:r>
-        <w:t xml:space="preserve"> (Ctrl+2) — receive data live over the network and decode it as it arrives, writing per-message CSV files to a chosen folder.</w:t>
-      </w:r>
-    </w:p>
-    <w:p>
-      <w:pPr>
-        <w:pStyle w:val="ListBullet"/>
-      </w:pPr>
-      <w:r>
-        <w:rPr>
-          <w:b/>
-        </w:rPr>
-        <w:t>Import ICD…</w:t>
-      </w:r>
-      <w:r>
-        <w:t xml:space="preserve"> — build message/field definitions from a Word </w:t>
-      </w:r>
-      <w:r>
-        <w:rPr>
-          <w:rFonts w:ascii="Consolas" w:hAnsi="Consolas"/>
-          <w:color w:val="C7254E"/>
-        </w:rPr>
-        <w:t>.docx</w:t>
-      </w:r>
-      <w:r>
-        <w:t xml:space="preserve"> ICD.</w:t>
-      </w:r>
-    </w:p>
-    <w:p>
-      <w:pPr>
-        <w:pStyle w:val="Heading2"/>
-      </w:pPr>
-      <w:r>
-        <w:t>Input</w:t>
-      </w:r>
-    </w:p>
-    <w:p>
-      <w:r>
-        <w:t xml:space="preserve">*File Mode:* </w:t>
-      </w:r>
-      <w:r>
-        <w:rPr>
-          <w:b/>
-        </w:rPr>
-        <w:t>Browse</w:t>
-      </w:r>
-      <w:r>
-        <w:t xml:space="preserve"> to the capture file. *Live Mode:* either use the single </w:t>
-      </w:r>
-      <w:r>
-        <w:rPr>
-          <w:b/>
-        </w:rPr>
-        <w:t>Transport</w:t>
-      </w:r>
-      <w:r>
-        <w:t xml:space="preserve"> (UDP or TCP) + listen port row, or press </w:t>
-      </w:r>
-      <w:r>
-        <w:rPr>
-          <w:b/>
-        </w:rPr>
-        <w:t>Configure Connections…</w:t>
-      </w:r>
-      <w:r>
-        <w:t xml:space="preserve"> to define several connections at once (see below). For TCP you can also set the role (Server/Client), host and frame length before </w:t>
-      </w:r>
-      <w:r>
-        <w:rPr>
-          <w:b/>
-        </w:rPr>
-        <w:t>Start Live</w:t>
-      </w:r>
-      <w:r>
-        <w:t>.</w:t>
-      </w:r>
-    </w:p>
-    <w:p>
-      <w:pPr>
-        <w:pStyle w:val="Heading2"/>
-      </w:pPr>
-      <w:r>
-        <w:t>Connections (Live Mode)</w:t>
-      </w:r>
-    </w:p>
-    <w:p>
-      <w:r>
-        <w:rPr>
-          <w:b/>
-        </w:rPr>
-        <w:t>Configure Connections…</w:t>
-      </w:r>
-      <w:r>
-        <w:t xml:space="preserve"> opens a manager where you add, edit or remove receive connections. Each connection picks a network </w:t>
-      </w:r>
-      <w:r>
-        <w:rPr>
-          <w:b/>
-        </w:rPr>
-        <w:t>adapter</w:t>
-      </w:r>
-      <w:r>
-        <w:t xml:space="preserve"> (chosen by number from the list, which always includes *Any adapter* and *Loopback*) and a </w:t>
-      </w:r>
-      <w:r>
-        <w:rPr>
-          <w:b/>
-        </w:rPr>
-        <w:t>port</w:t>
-      </w:r>
-      <w:r>
-        <w:t xml:space="preserve"> — for UDP you never type an IP address, just the adapter and port. TCP connections add a Listen/Connect role. When one or more connections are defined, the reader binds a separate receiver per connection on </w:t>
-      </w:r>
-      <w:r>
-        <w:rPr>
-          <w:b/>
-        </w:rPr>
-        <w:t>Start Live</w:t>
-      </w:r>
-      <w:r>
-        <w:t xml:space="preserve"> and decodes each message </w:t>
-      </w:r>
-      <w:r>
-        <w:rPr>
-          <w:b/>
-        </w:rPr>
-        <w:t>only</w:t>
-      </w:r>
-      <w:r>
-        <w:t xml:space="preserve"> against the connection it is bound to, so traffic from different adapters/ports never gets mixed. Leave the list empty to fall back to the single Transport/Port row.</w:t>
-      </w:r>
-    </w:p>
-    <w:p>
-      <w:pPr>
-        <w:pStyle w:val="Heading2"/>
-      </w:pPr>
-      <w:r>
-        <w:t>Message Filters</w:t>
-      </w:r>
-    </w:p>
-    <w:p>
-      <w:r>
-        <w:t xml:space="preserve">Select </w:t>
-      </w:r>
-      <w:r>
-        <w:rPr>
-          <w:b/>
-        </w:rPr>
-        <w:t>Port</w:t>
-      </w:r>
-      <w:r>
-        <w:t xml:space="preserve"> or </w:t>
-      </w:r>
-      <w:r>
-        <w:rPr>
-          <w:b/>
-        </w:rPr>
-        <w:t>Header</w:t>
-      </w:r>
-      <w:r>
-        <w:t xml:space="preserve"> filtering and set the number of filters. Each filter row has a port and a </w:t>
-      </w:r>
-      <w:r>
-        <w:rPr>
-          <w:b/>
-        </w:rPr>
-        <w:t>Configure Messages</w:t>
-      </w:r>
-      <w:r>
-        <w:t xml:space="preserve"> button (route messages by payload length) with a live message count. Header filtering lets you tell apart same-length messages by a leading signature.</w:t>
-      </w:r>
-    </w:p>
-    <w:p>
-      <w:pPr>
-        <w:pStyle w:val="Heading2"/>
-      </w:pPr>
-      <w:r>
-        <w:t>Configured Messages</w:t>
-      </w:r>
-    </w:p>
-    <w:p>
-      <w:r>
-        <w:t xml:space="preserve">The list of messages to decode. Each has a name, payload length, port and fields. In Live Mode, when connections are defined, a </w:t>
-      </w:r>
-      <w:r>
-        <w:rPr>
-          <w:b/>
-        </w:rPr>
-        <w:t>Connection</w:t>
-      </w:r>
-      <w:r>
-        <w:t xml:space="preserve"> column shows (and lets you set, via the Configure Messages dialog) which connection each message is decoded from. </w:t>
-      </w:r>
-      <w:r>
-        <w:rPr>
-          <w:b/>
-        </w:rPr>
-        <w:t>Configure Fields</w:t>
-      </w:r>
-      <w:r>
-        <w:t xml:space="preserve"> opens the field editor (name, 1-based byte offset, data type, length, resolution / resolution expression). An </w:t>
-      </w:r>
-      <w:r>
-        <w:rPr>
-          <w:b/>
-        </w:rPr>
-        <w:t>Offsets in</w:t>
-      </w:r>
-      <w:r>
-        <w:t xml:space="preserve"> selector lets you switch between </w:t>
-      </w:r>
-      <w:r>
-        <w:rPr>
-          <w:b/>
-        </w:rPr>
-        <w:t>Bytes</w:t>
-      </w:r>
-      <w:r>
-        <w:t xml:space="preserve"> and </w:t>
-      </w:r>
-      <w:r>
-        <w:rPr>
-          <w:b/>
-        </w:rPr>
-        <w:t>Words</w:t>
-      </w:r>
-      <w:r>
-        <w:t xml:space="preserve"> (1 word = 2 bytes) for display; field offsets are always stored in bytes internally. Fields can carry </w:t>
-      </w:r>
-      <w:r>
-        <w:rPr>
-          <w:b/>
-        </w:rPr>
-        <w:t>bitfield decoders</w:t>
-      </w:r>
-      <w:r>
-        <w:t xml:space="preserve"> and </w:t>
-      </w:r>
-      <w:r>
-        <w:rPr>
-          <w:b/>
-        </w:rPr>
-        <w:t>conditional bitfield decoders</w:t>
-      </w:r>
-      <w:r>
-        <w:t xml:space="preserve"> that expand a byte/word into named bit meanings. Tick </w:t>
-      </w:r>
-      <w:r>
-        <w:rPr>
-          <w:b/>
-        </w:rPr>
-        <w:t>Verify all configured messages before export</w:t>
-      </w:r>
-      <w:r>
-        <w:t xml:space="preserve"> to validate everything first.</w:t>
-      </w:r>
-    </w:p>
-    <w:p>
-      <w:r>
-        <w:t>There is no length cap on numeric fields — fields wider than 8 bytes are decoded to exact decimal values (or resolution-scaled doubles).</w:t>
-      </w:r>
-    </w:p>
-    <w:p>
-      <w:pPr>
-        <w:pStyle w:val="Heading2"/>
-      </w:pPr>
-      <w:r>
-        <w:t>Start &amp; Output</w:t>
-      </w:r>
-    </w:p>
-    <w:p>
-      <w:r>
-        <w:rPr>
-          <w:b/>
-        </w:rPr>
-        <w:t>Start</w:t>
-      </w:r>
-      <w:r>
-        <w:t xml:space="preserve"> (F5) parses the input, applies the filters, decodes each message's fields and writes the output (CSV, or Excel via the export options). The </w:t>
-      </w:r>
-      <w:r>
-        <w:rPr>
-          <w:b/>
-        </w:rPr>
-        <w:t>Output Preview</w:t>
-      </w:r>
-      <w:r>
-        <w:t xml:space="preserve"> shows a sample of the decoded rows. In Live Mode, </w:t>
-      </w:r>
-      <w:r>
-        <w:rPr>
-          <w:b/>
-        </w:rPr>
-        <w:t>Stop</w:t>
-      </w:r>
-      <w:r>
-        <w:t xml:space="preserve"> (Shift+F5) ends the capture.</w:t>
+        <w:t>Main window with two messages configured from an ICD</w:t>
       </w:r>
     </w:p>
     <w:p>
@@ -1045,7 +730,7 @@
         <w:pStyle w:val="Heading1"/>
       </w:pPr>
       <w:r>
-        <w:t>Common functions</w:t>
+        <w:t>The main window, panel by panel</w:t>
       </w:r>
     </w:p>
     <w:p>
@@ -1053,13 +738,13 @@
         <w:pStyle w:val="Heading2"/>
       </w:pPr>
       <w:r>
-        <w:t>Decode a capture file to CSV</w:t>
+        <w:t>Input Mode</w:t>
       </w:r>
     </w:p>
     <w:p>
-      <w:r>
-        <w:t xml:space="preserve">1. </w:t>
-      </w:r>
+      <w:pPr>
+        <w:pStyle w:val="ListBullet"/>
+      </w:pPr>
       <w:r>
         <w:rPr>
           <w:b/>
@@ -1067,16 +752,7 @@
         <w:t>File Mode</w:t>
       </w:r>
       <w:r>
-        <w:t xml:space="preserve"> (Ctrl+1) → </w:t>
-      </w:r>
-      <w:r>
-        <w:rPr>
-          <w:b/>
-        </w:rPr>
-        <w:t>Browse</w:t>
-      </w:r>
-      <w:r>
-        <w:t xml:space="preserve"> to the </w:t>
+        <w:t xml:space="preserve"> (Ctrl+1) — decode a saved </w:t>
       </w:r>
       <w:r>
         <w:rPr>
@@ -1096,25 +772,27 @@
         <w:t>.pcapng</w:t>
       </w:r>
       <w:r>
-        <w:t>.</w:t>
+        <w:t xml:space="preserve"> capture.</w:t>
       </w:r>
     </w:p>
     <w:p>
-      <w:r>
-        <w:t xml:space="preserve">2. </w:t>
-      </w:r>
-      <w:r>
-        <w:t xml:space="preserve">Add a </w:t>
-      </w:r>
+      <w:pPr>
+        <w:pStyle w:val="ListBullet"/>
+      </w:pPr>
       <w:r>
         <w:rPr>
           <w:b/>
         </w:rPr>
-        <w:t>Port</w:t>
-      </w:r>
-      <w:r>
-        <w:t xml:space="preserve"> filter (e.g. 5000) and define the message + fields (or </w:t>
-      </w:r>
+        <w:t>Live Mode</w:t>
+      </w:r>
+      <w:r>
+        <w:t xml:space="preserve"> (Ctrl+2) — receive data live over the network and decode it as it arrives, writing per-message CSV files to a chosen folder.</w:t>
+      </w:r>
+    </w:p>
+    <w:p>
+      <w:pPr>
+        <w:pStyle w:val="ListBullet"/>
+      </w:pPr>
       <w:r>
         <w:rPr>
           <w:b/>
@@ -1122,21 +800,17 @@
         <w:t>Import ICD…</w:t>
       </w:r>
       <w:r>
-        <w:t>).</w:t>
-      </w:r>
-    </w:p>
-    <w:p>
-      <w:r>
-        <w:t xml:space="preserve">3. </w:t>
+        <w:t xml:space="preserve"> — build message/field definitions from a Word </w:t>
       </w:r>
       <w:r>
         <w:rPr>
-          <w:b/>
+          <w:rFonts w:ascii="Consolas" w:hAnsi="Consolas"/>
+          <w:color w:val="C7254E"/>
         </w:rPr>
-        <w:t>Start</w:t>
-      </w:r>
-      <w:r>
-        <w:t xml:space="preserve"> (F5). The decoded rows appear in the preview and a CSV is written.</w:t>
+        <w:t>.docx</w:t>
+      </w:r>
+      <w:r>
+        <w:t xml:space="preserve"> ICD (see *Import from a Word ICD*).</w:t>
       </w:r>
     </w:p>
     <w:p>
@@ -1144,61 +818,39 @@
         <w:pStyle w:val="Heading2"/>
       </w:pPr>
       <w:r>
-        <w:t>Decode a live UDP stream</w:t>
+        <w:t>Input</w:t>
       </w:r>
     </w:p>
     <w:p>
       <w:r>
-        <w:t xml:space="preserve">1. </w:t>
+        <w:t xml:space="preserve">*File Mode:* </w:t>
       </w:r>
       <w:r>
         <w:rPr>
           <w:b/>
         </w:rPr>
-        <w:t>Live Mode</w:t>
-      </w:r>
-      <w:r>
-        <w:t xml:space="preserve"> (Ctrl+2) → transport </w:t>
+        <w:t>Browse</w:t>
+      </w:r>
+      <w:r>
+        <w:t xml:space="preserve"> to the capture file. *Live Mode:* either use the single </w:t>
       </w:r>
       <w:r>
         <w:rPr>
           <w:b/>
         </w:rPr>
-        <w:t>UDP</w:t>
-      </w:r>
-      <w:r>
-        <w:t xml:space="preserve"> → set the listen </w:t>
+        <w:t>Transport</w:t>
+      </w:r>
+      <w:r>
+        <w:t xml:space="preserve"> (UDP or TCP) + listen port row, or press </w:t>
       </w:r>
       <w:r>
         <w:rPr>
           <w:b/>
         </w:rPr>
-        <w:t>port</w:t>
-      </w:r>
-      <w:r>
-        <w:t>.</w:t>
-      </w:r>
-    </w:p>
-    <w:p>
-      <w:r>
-        <w:t xml:space="preserve">2. </w:t>
-      </w:r>
-      <w:r>
-        <w:t xml:space="preserve">Define messages/fields and (optionally) per-message </w:t>
-      </w:r>
-      <w:r>
-        <w:rPr>
-          <w:b/>
-        </w:rPr>
-        <w:t>length filters</w:t>
-      </w:r>
-      <w:r>
-        <w:t>.</w:t>
-      </w:r>
-    </w:p>
-    <w:p>
-      <w:r>
-        <w:t xml:space="preserve">3. </w:t>
+        <w:t>Configure Connections…</w:t>
+      </w:r>
+      <w:r>
+        <w:t xml:space="preserve"> to define several connections at once (see below). For TCP you can also set the role (Server/Client), host and frame length before </w:t>
       </w:r>
       <w:r>
         <w:rPr>
@@ -1207,16 +859,53 @@
         <w:t>Start Live</w:t>
       </w:r>
       <w:r>
-        <w:t xml:space="preserve">, pick an output folder; one CSV per message is written as datagrams arrive. </w:t>
-      </w:r>
+        <w:t>.</w:t>
+      </w:r>
+    </w:p>
+    <w:p>
+      <w:r>
+        <w:drawing>
+          <wp:inline xmlns:a="http://schemas.openxmlformats.org/drawingml/2006/main" xmlns:pic="http://schemas.openxmlformats.org/drawingml/2006/picture">
+            <wp:extent cx="5760720" cy="6618798"/>
+            <wp:docPr id="5" name="Picture 5"/>
+            <wp:cNvGraphicFramePr>
+              <a:graphicFrameLocks noChangeAspect="1"/>
+            </wp:cNvGraphicFramePr>
+            <a:graphic>
+              <a:graphicData uri="http://schemas.openxmlformats.org/drawingml/2006/picture">
+                <pic:pic>
+                  <pic:nvPicPr>
+                    <pic:cNvPr id="0" name="main-live.png"/>
+                    <pic:cNvPicPr/>
+                  </pic:nvPicPr>
+                  <pic:blipFill>
+                    <a:blip r:embed="rId13"/>
+                    <a:stretch>
+                      <a:fillRect/>
+                    </a:stretch>
+                  </pic:blipFill>
+                  <pic:spPr>
+                    <a:xfrm>
+                      <a:off x="0" y="0"/>
+                      <a:ext cx="5760720" cy="6618798"/>
+                    </a:xfrm>
+                    <a:prstGeom prst="rect"/>
+                  </pic:spPr>
+                </pic:pic>
+              </a:graphicData>
+            </a:graphic>
+          </wp:inline>
+        </w:drawing>
+      </w:r>
+    </w:p>
+    <w:p>
       <w:r>
         <w:rPr>
-          <w:b/>
+          <w:i/>
+          <w:color w:val="666666"/>
+          <w:sz w:val="18"/>
         </w:rPr>
-        <w:t>Stop</w:t>
-      </w:r>
-      <w:r>
-        <w:t xml:space="preserve"> when done.</w:t>
+        <w:t>Live Mode — transport, bind port, multicast, and live statistics</w:t>
       </w:r>
     </w:p>
     <w:p>
@@ -1224,64 +913,36 @@
         <w:pStyle w:val="Heading2"/>
       </w:pPr>
       <w:r>
-        <w:t>Decode a live TCP stream</w:t>
+        <w:t>Connections (Live Mode)</w:t>
       </w:r>
     </w:p>
     <w:p>
-      <w:r>
-        <w:t xml:space="preserve">1. </w:t>
-      </w:r>
       <w:r>
         <w:rPr>
           <w:b/>
         </w:rPr>
-        <w:t>Live Mode</w:t>
-      </w:r>
-      <w:r>
-        <w:t xml:space="preserve"> (Ctrl+2) → transport </w:t>
+        <w:t>Configure Connections…</w:t>
+      </w:r>
+      <w:r>
+        <w:t xml:space="preserve"> opens a manager where you add, edit or remove receive connections. Each connection picks a network </w:t>
       </w:r>
       <w:r>
         <w:rPr>
           <w:b/>
         </w:rPr>
-        <w:t>TCP</w:t>
-      </w:r>
-      <w:r>
-        <w:t>.</w:t>
-      </w:r>
-    </w:p>
-    <w:p>
-      <w:r>
-        <w:t xml:space="preserve">2. </w:t>
-      </w:r>
-      <w:r>
-        <w:t xml:space="preserve">Choose a </w:t>
+        <w:t>adapter</w:t>
+      </w:r>
+      <w:r>
+        <w:t xml:space="preserve"> (chosen by number from the list, which always includes *Any adapter* and *Loopback*) and a </w:t>
       </w:r>
       <w:r>
         <w:rPr>
           <w:b/>
         </w:rPr>
-        <w:t>Role</w:t>
-      </w:r>
-      <w:r>
-        <w:t xml:space="preserve">: *Server* (listen for incoming connections) or *Client* (connect to a remote host). Set the port (and host for Client mode). Set the </w:t>
-      </w:r>
-      <w:r>
-        <w:rPr>
-          <w:b/>
-        </w:rPr>
-        <w:t>Frame length</w:t>
-      </w:r>
-      <w:r>
-        <w:t xml:space="preserve"> so the reader knows where one message ends and the next begins.</w:t>
-      </w:r>
-    </w:p>
-    <w:p>
-      <w:r>
-        <w:t xml:space="preserve">3. </w:t>
-      </w:r>
-      <w:r>
-        <w:t xml:space="preserve">Define messages/fields → </w:t>
+        <w:t>port</w:t>
+      </w:r>
+      <w:r>
+        <w:t xml:space="preserve"> — for UDP you never type an IP address, just the adapter and port. TCP connections add a Listen/Connect role. When one or more connections are defined, the reader binds a separate receiver per connection on </w:t>
       </w:r>
       <w:r>
         <w:rPr>
@@ -1290,7 +951,62 @@
         <w:t>Start Live</w:t>
       </w:r>
       <w:r>
-        <w:t>. TCP data is framed and decoded the same way as UDP.</w:t>
+        <w:t xml:space="preserve"> and decodes each message </w:t>
+      </w:r>
+      <w:r>
+        <w:rPr>
+          <w:b/>
+        </w:rPr>
+        <w:t>only</w:t>
+      </w:r>
+      <w:r>
+        <w:t xml:space="preserve"> against the connection it is bound to, so traffic from different adapters/ports never gets mixed. Leave the list empty to fall back to the single Transport/Port row.</w:t>
+      </w:r>
+    </w:p>
+    <w:p>
+      <w:r>
+        <w:drawing>
+          <wp:inline xmlns:a="http://schemas.openxmlformats.org/drawingml/2006/main" xmlns:pic="http://schemas.openxmlformats.org/drawingml/2006/picture">
+            <wp:extent cx="5760720" cy="3333584"/>
+            <wp:docPr id="6" name="Picture 6"/>
+            <wp:cNvGraphicFramePr>
+              <a:graphicFrameLocks noChangeAspect="1"/>
+            </wp:cNvGraphicFramePr>
+            <a:graphic>
+              <a:graphicData uri="http://schemas.openxmlformats.org/drawingml/2006/picture">
+                <pic:pic>
+                  <pic:nvPicPr>
+                    <pic:cNvPr id="0" name="connections.png"/>
+                    <pic:cNvPicPr/>
+                  </pic:nvPicPr>
+                  <pic:blipFill>
+                    <a:blip r:embed="rId14"/>
+                    <a:stretch>
+                      <a:fillRect/>
+                    </a:stretch>
+                  </pic:blipFill>
+                  <pic:spPr>
+                    <a:xfrm>
+                      <a:off x="0" y="0"/>
+                      <a:ext cx="5760720" cy="3333584"/>
+                    </a:xfrm>
+                    <a:prstGeom prst="rect"/>
+                  </pic:spPr>
+                </pic:pic>
+              </a:graphicData>
+            </a:graphic>
+          </wp:inline>
+        </w:drawing>
+      </w:r>
+    </w:p>
+    <w:p>
+      <w:r>
+        <w:rPr>
+          <w:i/>
+          <w:color w:val="666666"/>
+          <w:sz w:val="18"/>
+        </w:rPr>
+        <w:t>Configure Connections — bind each receiver to one adapter + port</w:t>
       </w:r>
     </w:p>
     <w:p>
@@ -1298,73 +1014,30 @@
         <w:pStyle w:val="Heading2"/>
       </w:pPr>
       <w:r>
-        <w:t>Receive from multiple sources at once (connections)</w:t>
+        <w:t>Message Filters</w:t>
       </w:r>
     </w:p>
     <w:p>
       <w:r>
-        <w:t xml:space="preserve">1. </w:t>
+        <w:t xml:space="preserve">Select </w:t>
       </w:r>
       <w:r>
         <w:rPr>
           <w:b/>
         </w:rPr>
-        <w:t>Live Mode</w:t>
-      </w:r>
-      <w:r>
-        <w:t xml:space="preserve"> (Ctrl+2) → </w:t>
+        <w:t>Port</w:t>
+      </w:r>
+      <w:r>
+        <w:t xml:space="preserve"> or </w:t>
       </w:r>
       <w:r>
         <w:rPr>
           <w:b/>
         </w:rPr>
-        <w:t>Configure Connections…</w:t>
-      </w:r>
-      <w:r>
-        <w:t xml:space="preserve"> → </w:t>
-      </w:r>
-      <w:r>
-        <w:rPr>
-          <w:b/>
-        </w:rPr>
-        <w:t>Add</w:t>
-      </w:r>
-      <w:r>
-        <w:t xml:space="preserve"> one connection per source.</w:t>
-      </w:r>
-    </w:p>
-    <w:p>
-      <w:r>
-        <w:t xml:space="preserve">2. </w:t>
-      </w:r>
-      <w:r>
-        <w:t xml:space="preserve">For each, pick the </w:t>
-      </w:r>
-      <w:r>
-        <w:rPr>
-          <w:b/>
-        </w:rPr>
-        <w:t>adapter</w:t>
-      </w:r>
-      <w:r>
-        <w:t xml:space="preserve"> (by number; *Any* and *Loopback* are always listed) and the </w:t>
-      </w:r>
-      <w:r>
-        <w:rPr>
-          <w:b/>
-        </w:rPr>
-        <w:t>port</w:t>
-      </w:r>
-      <w:r>
-        <w:t>; for UDP that is all — no IP address. For TCP also pick Listen or Connect.</w:t>
-      </w:r>
-    </w:p>
-    <w:p>
-      <w:r>
-        <w:t xml:space="preserve">3. </w:t>
-      </w:r>
-      <w:r>
-        <w:t xml:space="preserve">Press </w:t>
+        <w:t>Header</w:t>
+      </w:r>
+      <w:r>
+        <w:t xml:space="preserve"> filtering and set the number of filters. Each filter row has a port and a </w:t>
       </w:r>
       <w:r>
         <w:rPr>
@@ -1373,30 +1046,127 @@
         <w:t>Configure Messages</w:t>
       </w:r>
       <w:r>
-        <w:t xml:space="preserve">, and in the </w:t>
+        <w:t xml:space="preserve"> button (route messages by payload length) with a live message count. Header filtering lets you tell apart same-length messages by a leading signature.</w:t>
+      </w:r>
+    </w:p>
+    <w:p>
+      <w:r>
+        <w:t xml:space="preserve">The </w:t>
       </w:r>
       <w:r>
         <w:rPr>
           <w:b/>
         </w:rPr>
-        <w:t>Connection</w:t>
-      </w:r>
-      <w:r>
-        <w:t xml:space="preserve"> column bind each message to the connection it should be decoded from (leave a message on *(any connection)* to accept it from all of them).</w:t>
+        <w:t>Configure Messages</w:t>
+      </w:r>
+      <w:r>
+        <w:t xml:space="preserve"> dialog manages the message definitions on a port — add, edit, remove, and import/export them as JSON, plus reach each message's fields and compare options:</w:t>
       </w:r>
     </w:p>
     <w:p>
       <w:r>
-        <w:t xml:space="preserve">4. </w:t>
+        <w:drawing>
+          <wp:inline xmlns:a="http://schemas.openxmlformats.org/drawingml/2006/main" xmlns:pic="http://schemas.openxmlformats.org/drawingml/2006/picture">
+            <wp:extent cx="5760720" cy="3464529"/>
+            <wp:docPr id="7" name="Picture 7"/>
+            <wp:cNvGraphicFramePr>
+              <a:graphicFrameLocks noChangeAspect="1"/>
+            </wp:cNvGraphicFramePr>
+            <a:graphic>
+              <a:graphicData uri="http://schemas.openxmlformats.org/drawingml/2006/picture">
+                <pic:pic>
+                  <pic:nvPicPr>
+                    <pic:cNvPr id="0" name="configure-messages.png"/>
+                    <pic:cNvPicPr/>
+                  </pic:nvPicPr>
+                  <pic:blipFill>
+                    <a:blip r:embed="rId15"/>
+                    <a:stretch>
+                      <a:fillRect/>
+                    </a:stretch>
+                  </pic:blipFill>
+                  <pic:spPr>
+                    <a:xfrm>
+                      <a:off x="0" y="0"/>
+                      <a:ext cx="5760720" cy="3464529"/>
+                    </a:xfrm>
+                    <a:prstGeom prst="rect"/>
+                  </pic:spPr>
+                </pic:pic>
+              </a:graphicData>
+            </a:graphic>
+          </wp:inline>
+        </w:drawing>
+      </w:r>
+    </w:p>
+    <w:p>
+      <w:r>
+        <w:rPr>
+          <w:i/>
+          <w:color w:val="666666"/>
+          <w:sz w:val="18"/>
+        </w:rPr>
+        <w:t>Configure Messages — message definitions for a port</w:t>
+      </w:r>
+    </w:p>
+    <w:p>
+      <w:r>
+        <w:t xml:space="preserve">Each message's identity (name, payload length, optional header signature, data format) is edited in the </w:t>
       </w:r>
       <w:r>
         <w:rPr>
           <w:b/>
         </w:rPr>
-        <w:t>Start Live</w:t>
-      </w:r>
-      <w:r>
-        <w:t xml:space="preserve"> — one receiver runs per connection and each message is only matched on its connection, so two sources on different adapters/ports are kept completely separate.</w:t>
+        <w:t>Message Definition</w:t>
+      </w:r>
+      <w:r>
+        <w:t xml:space="preserve"> dialog:</w:t>
+      </w:r>
+    </w:p>
+    <w:p>
+      <w:r>
+        <w:drawing>
+          <wp:inline xmlns:a="http://schemas.openxmlformats.org/drawingml/2006/main" xmlns:pic="http://schemas.openxmlformats.org/drawingml/2006/picture">
+            <wp:extent cx="4972050" cy="3638551"/>
+            <wp:docPr id="8" name="Picture 8"/>
+            <wp:cNvGraphicFramePr>
+              <a:graphicFrameLocks noChangeAspect="1"/>
+            </wp:cNvGraphicFramePr>
+            <a:graphic>
+              <a:graphicData uri="http://schemas.openxmlformats.org/drawingml/2006/picture">
+                <pic:pic>
+                  <pic:nvPicPr>
+                    <pic:cNvPr id="0" name="message-def.png"/>
+                    <pic:cNvPicPr/>
+                  </pic:nvPicPr>
+                  <pic:blipFill>
+                    <a:blip r:embed="rId16"/>
+                    <a:stretch>
+                      <a:fillRect/>
+                    </a:stretch>
+                  </pic:blipFill>
+                  <pic:spPr>
+                    <a:xfrm>
+                      <a:off x="0" y="0"/>
+                      <a:ext cx="4972050" cy="3638551"/>
+                    </a:xfrm>
+                    <a:prstGeom prst="rect"/>
+                  </pic:spPr>
+                </pic:pic>
+              </a:graphicData>
+            </a:graphic>
+          </wp:inline>
+        </w:drawing>
+      </w:r>
+    </w:p>
+    <w:p>
+      <w:r>
+        <w:rPr>
+          <w:i/>
+          <w:color w:val="666666"/>
+          <w:sz w:val="18"/>
+        </w:rPr>
+        <w:t>Editing a message definition</w:t>
       </w:r>
     </w:p>
     <w:p>
@@ -1404,39 +1174,135 @@
         <w:pStyle w:val="Heading2"/>
       </w:pPr>
       <w:r>
-        <w:t>Import/export messages while configuring (JSON)</w:t>
+        <w:t>Configured Messages</w:t>
       </w:r>
     </w:p>
     <w:p>
       <w:r>
-        <w:t xml:space="preserve">Inside the </w:t>
+        <w:t xml:space="preserve">The list of messages to decode. Each has a name, payload length, port and fields. In Live Mode, when connections are defined, a </w:t>
       </w:r>
       <w:r>
         <w:rPr>
           <w:b/>
         </w:rPr>
-        <w:t>Configure Messages</w:t>
-      </w:r>
-      <w:r>
-        <w:t xml:space="preserve"> dialog, </w:t>
+        <w:t>Connection</w:t>
+      </w:r>
+      <w:r>
+        <w:t xml:space="preserve"> column shows (and lets you set, via the Configure Messages dialog) which connection each message is decoded from. </w:t>
       </w:r>
       <w:r>
         <w:rPr>
           <w:b/>
         </w:rPr>
-        <w:t>Import JSON…</w:t>
-      </w:r>
-      <w:r>
-        <w:t xml:space="preserve"> appends message definitions from a JSON file and </w:t>
+        <w:t>Configure Fields</w:t>
+      </w:r>
+      <w:r>
+        <w:t xml:space="preserve"> opens the field editor (name, 1-based byte offset, data type, length, resolution / resolution expression). An </w:t>
       </w:r>
       <w:r>
         <w:rPr>
           <w:b/>
         </w:rPr>
-        <w:t>Export JSON…</w:t>
-      </w:r>
-      <w:r>
-        <w:t xml:space="preserve"> writes the current list out — the same format the simulator and the File menu use.</w:t>
+        <w:t>Offsets in</w:t>
+      </w:r>
+      <w:r>
+        <w:t xml:space="preserve"> selector lets you switch between </w:t>
+      </w:r>
+      <w:r>
+        <w:rPr>
+          <w:b/>
+        </w:rPr>
+        <w:t>Bytes</w:t>
+      </w:r>
+      <w:r>
+        <w:t xml:space="preserve"> and </w:t>
+      </w:r>
+      <w:r>
+        <w:rPr>
+          <w:b/>
+        </w:rPr>
+        <w:t>Words</w:t>
+      </w:r>
+      <w:r>
+        <w:t xml:space="preserve"> (1 word = 2 bytes) for display; field offsets are always stored in bytes internally. Fields can carry </w:t>
+      </w:r>
+      <w:r>
+        <w:rPr>
+          <w:b/>
+        </w:rPr>
+        <w:t>bitfield decoders</w:t>
+      </w:r>
+      <w:r>
+        <w:t xml:space="preserve"> and </w:t>
+      </w:r>
+      <w:r>
+        <w:rPr>
+          <w:b/>
+        </w:rPr>
+        <w:t>conditional bitfield decoders</w:t>
+      </w:r>
+      <w:r>
+        <w:t xml:space="preserve"> that expand a byte/word into named bit meanings. Tick </w:t>
+      </w:r>
+      <w:r>
+        <w:rPr>
+          <w:b/>
+        </w:rPr>
+        <w:t>Verify all configured messages before export</w:t>
+      </w:r>
+      <w:r>
+        <w:t xml:space="preserve"> to validate everything first.</w:t>
+      </w:r>
+    </w:p>
+    <w:p>
+      <w:r>
+        <w:drawing>
+          <wp:inline xmlns:a="http://schemas.openxmlformats.org/drawingml/2006/main" xmlns:pic="http://schemas.openxmlformats.org/drawingml/2006/picture">
+            <wp:extent cx="5760720" cy="2636113"/>
+            <wp:docPr id="9" name="Picture 9"/>
+            <wp:cNvGraphicFramePr>
+              <a:graphicFrameLocks noChangeAspect="1"/>
+            </wp:cNvGraphicFramePr>
+            <a:graphic>
+              <a:graphicData uri="http://schemas.openxmlformats.org/drawingml/2006/picture">
+                <pic:pic>
+                  <pic:nvPicPr>
+                    <pic:cNvPr id="0" name="field-config.png"/>
+                    <pic:cNvPicPr/>
+                  </pic:nvPicPr>
+                  <pic:blipFill>
+                    <a:blip r:embed="rId17"/>
+                    <a:stretch>
+                      <a:fillRect/>
+                    </a:stretch>
+                  </pic:blipFill>
+                  <pic:spPr>
+                    <a:xfrm>
+                      <a:off x="0" y="0"/>
+                      <a:ext cx="5760720" cy="2636113"/>
+                    </a:xfrm>
+                    <a:prstGeom prst="rect"/>
+                  </pic:spPr>
+                </pic:pic>
+              </a:graphicData>
+            </a:graphic>
+          </wp:inline>
+        </w:drawing>
+      </w:r>
+    </w:p>
+    <w:p>
+      <w:r>
+        <w:rPr>
+          <w:i/>
+          <w:color w:val="666666"/>
+          <w:sz w:val="18"/>
+        </w:rPr>
+        <w:t>Configure Fields — name, offset, type, length, resolution, decoders, and CSV/JSON/Excel menus</w:t>
+      </w:r>
+    </w:p>
+    <w:p>
+      <w:r>
+        <w:t>There is no length cap on numeric fields — fields wider than 8 bytes are decoded to exact decimal values (or resolution-scaled doubles).</w:t>
       </w:r>
     </w:p>
     <w:p>
@@ -1444,10 +1310,166 @@
         <w:pStyle w:val="Heading2"/>
       </w:pPr>
       <w:r>
-        <w:t>Import message/field definitions from a Word ICD</w:t>
+        <w:t>Start and Output</w:t>
       </w:r>
     </w:p>
     <w:p>
+      <w:r>
+        <w:rPr>
+          <w:b/>
+        </w:rPr>
+        <w:t>Start</w:t>
+      </w:r>
+      <w:r>
+        <w:t xml:space="preserve"> (F5) parses the input, applies the filters, decodes each message's fields and writes the output (CSV, or Excel via the export options). The </w:t>
+      </w:r>
+      <w:r>
+        <w:rPr>
+          <w:b/>
+        </w:rPr>
+        <w:t>Output Preview</w:t>
+      </w:r>
+      <w:r>
+        <w:t xml:space="preserve"> shows a sample of the decoded rows. In Live Mode, </w:t>
+      </w:r>
+      <w:r>
+        <w:rPr>
+          <w:b/>
+        </w:rPr>
+        <w:t>Stop</w:t>
+      </w:r>
+      <w:r>
+        <w:t xml:space="preserve"> (Shift+F5) ends the capture.</w:t>
+      </w:r>
+    </w:p>
+    <w:p>
+      <w:r>
+        <w:drawing>
+          <wp:inline xmlns:a="http://schemas.openxmlformats.org/drawingml/2006/main" xmlns:pic="http://schemas.openxmlformats.org/drawingml/2006/picture">
+            <wp:extent cx="5760720" cy="6618798"/>
+            <wp:docPr id="10" name="Picture 10"/>
+            <wp:cNvGraphicFramePr>
+              <a:graphicFrameLocks noChangeAspect="1"/>
+            </wp:cNvGraphicFramePr>
+            <a:graphic>
+              <a:graphicData uri="http://schemas.openxmlformats.org/drawingml/2006/picture">
+                <pic:pic>
+                  <pic:nvPicPr>
+                    <pic:cNvPr id="0" name="output-preview.png"/>
+                    <pic:cNvPicPr/>
+                  </pic:nvPicPr>
+                  <pic:blipFill>
+                    <a:blip r:embed="rId18"/>
+                    <a:stretch>
+                      <a:fillRect/>
+                    </a:stretch>
+                  </pic:blipFill>
+                  <pic:spPr>
+                    <a:xfrm>
+                      <a:off x="0" y="0"/>
+                      <a:ext cx="5760720" cy="6618798"/>
+                    </a:xfrm>
+                    <a:prstGeom prst="rect"/>
+                  </pic:spPr>
+                </pic:pic>
+              </a:graphicData>
+            </a:graphic>
+          </wp:inline>
+        </w:drawing>
+      </w:r>
+    </w:p>
+    <w:p>
+      <w:r>
+        <w:rPr>
+          <w:i/>
+          <w:color w:val="666666"/>
+          <w:sz w:val="18"/>
+        </w:rPr>
+        <w:t>Output Preview filled with decoded rows after a successful export</w:t>
+      </w:r>
+    </w:p>
+    <w:p>
+      <w:pPr>
+        <w:pBdr>
+          <w:bottom w:val="single" w:sz="6" w:space="1" w:color="BBBBBB"/>
+        </w:pBdr>
+      </w:pPr>
+    </w:p>
+    <w:p>
+      <w:pPr>
+        <w:pStyle w:val="Heading1"/>
+      </w:pPr>
+      <w:r>
+        <w:t>Common functions</w:t>
+      </w:r>
+    </w:p>
+    <w:p>
+      <w:pPr>
+        <w:pStyle w:val="Heading2"/>
+      </w:pPr>
+      <w:r>
+        <w:t>Decode a capture file to CSV</w:t>
+      </w:r>
+    </w:p>
+    <w:p>
+      <w:r>
+        <w:t xml:space="preserve">1. </w:t>
+      </w:r>
+      <w:r>
+        <w:rPr>
+          <w:b/>
+        </w:rPr>
+        <w:t>File Mode</w:t>
+      </w:r>
+      <w:r>
+        <w:t xml:space="preserve"> (Ctrl+1) → </w:t>
+      </w:r>
+      <w:r>
+        <w:rPr>
+          <w:b/>
+        </w:rPr>
+        <w:t>Browse</w:t>
+      </w:r>
+      <w:r>
+        <w:t xml:space="preserve"> to the </w:t>
+      </w:r>
+      <w:r>
+        <w:rPr>
+          <w:rFonts w:ascii="Consolas" w:hAnsi="Consolas"/>
+          <w:color w:val="C7254E"/>
+        </w:rPr>
+        <w:t>.pcap</w:t>
+      </w:r>
+      <w:r>
+        <w:t>/</w:t>
+      </w:r>
+      <w:r>
+        <w:rPr>
+          <w:rFonts w:ascii="Consolas" w:hAnsi="Consolas"/>
+          <w:color w:val="C7254E"/>
+        </w:rPr>
+        <w:t>.pcapng</w:t>
+      </w:r>
+      <w:r>
+        <w:t>.</w:t>
+      </w:r>
+    </w:p>
+    <w:p>
+      <w:r>
+        <w:t xml:space="preserve">2. </w:t>
+      </w:r>
+      <w:r>
+        <w:t xml:space="preserve">Add a </w:t>
+      </w:r>
+      <w:r>
+        <w:rPr>
+          <w:b/>
+        </w:rPr>
+        <w:t>Port</w:t>
+      </w:r>
+      <w:r>
+        <w:t xml:space="preserve"> filter (e.g. 5000) and define the message + fields (or </w:t>
+      </w:r>
       <w:r>
         <w:rPr>
           <w:b/>
@@ -1455,7 +1477,816 @@
         <w:t>Import ICD…</w:t>
       </w:r>
       <w:r>
-        <w:t xml:space="preserve"> → pick the </w:t>
+        <w:t>).</w:t>
+      </w:r>
+    </w:p>
+    <w:p>
+      <w:r>
+        <w:t xml:space="preserve">3. </w:t>
+      </w:r>
+      <w:r>
+        <w:rPr>
+          <w:b/>
+        </w:rPr>
+        <w:t>Start</w:t>
+      </w:r>
+      <w:r>
+        <w:t xml:space="preserve"> (F5). The decoded rows appear in the preview and a CSV is written.</w:t>
+      </w:r>
+    </w:p>
+    <w:p>
+      <w:pPr>
+        <w:pStyle w:val="Heading2"/>
+      </w:pPr>
+      <w:r>
+        <w:t>Decode a live UDP stream</w:t>
+      </w:r>
+    </w:p>
+    <w:p>
+      <w:r>
+        <w:t xml:space="preserve">1. </w:t>
+      </w:r>
+      <w:r>
+        <w:rPr>
+          <w:b/>
+        </w:rPr>
+        <w:t>Live Mode</w:t>
+      </w:r>
+      <w:r>
+        <w:t xml:space="preserve"> (Ctrl+2) → transport </w:t>
+      </w:r>
+      <w:r>
+        <w:rPr>
+          <w:b/>
+        </w:rPr>
+        <w:t>UDP</w:t>
+      </w:r>
+      <w:r>
+        <w:t xml:space="preserve"> → set the listen </w:t>
+      </w:r>
+      <w:r>
+        <w:rPr>
+          <w:b/>
+        </w:rPr>
+        <w:t>port</w:t>
+      </w:r>
+      <w:r>
+        <w:t>.</w:t>
+      </w:r>
+    </w:p>
+    <w:p>
+      <w:r>
+        <w:t xml:space="preserve">2. </w:t>
+      </w:r>
+      <w:r>
+        <w:t xml:space="preserve">Define messages/fields and (optionally) per-message </w:t>
+      </w:r>
+      <w:r>
+        <w:rPr>
+          <w:b/>
+        </w:rPr>
+        <w:t>length filters</w:t>
+      </w:r>
+      <w:r>
+        <w:t>.</w:t>
+      </w:r>
+    </w:p>
+    <w:p>
+      <w:r>
+        <w:t xml:space="preserve">3. </w:t>
+      </w:r>
+      <w:r>
+        <w:rPr>
+          <w:b/>
+        </w:rPr>
+        <w:t>Start Live</w:t>
+      </w:r>
+      <w:r>
+        <w:t xml:space="preserve">, pick an output folder; one CSV per message is written as datagrams arrive. </w:t>
+      </w:r>
+      <w:r>
+        <w:rPr>
+          <w:b/>
+        </w:rPr>
+        <w:t>Stop</w:t>
+      </w:r>
+      <w:r>
+        <w:t xml:space="preserve"> when done.</w:t>
+      </w:r>
+    </w:p>
+    <w:p>
+      <w:pPr>
+        <w:pStyle w:val="Heading2"/>
+      </w:pPr>
+      <w:r>
+        <w:t>Decode a live TCP stream</w:t>
+      </w:r>
+    </w:p>
+    <w:p>
+      <w:r>
+        <w:t xml:space="preserve">1. </w:t>
+      </w:r>
+      <w:r>
+        <w:rPr>
+          <w:b/>
+        </w:rPr>
+        <w:t>Live Mode</w:t>
+      </w:r>
+      <w:r>
+        <w:t xml:space="preserve"> (Ctrl+2) → transport </w:t>
+      </w:r>
+      <w:r>
+        <w:rPr>
+          <w:b/>
+        </w:rPr>
+        <w:t>TCP</w:t>
+      </w:r>
+      <w:r>
+        <w:t>.</w:t>
+      </w:r>
+    </w:p>
+    <w:p>
+      <w:r>
+        <w:t xml:space="preserve">2. </w:t>
+      </w:r>
+      <w:r>
+        <w:t xml:space="preserve">Choose a </w:t>
+      </w:r>
+      <w:r>
+        <w:rPr>
+          <w:b/>
+        </w:rPr>
+        <w:t>Role</w:t>
+      </w:r>
+      <w:r>
+        <w:t xml:space="preserve">: *Server* (listen for incoming connections) or *Client* (connect to a remote host). Set the port (and host for Client mode). Set the </w:t>
+      </w:r>
+      <w:r>
+        <w:rPr>
+          <w:b/>
+        </w:rPr>
+        <w:t>Frame length</w:t>
+      </w:r>
+      <w:r>
+        <w:t xml:space="preserve"> so the reader knows where one message ends and the next begins.</w:t>
+      </w:r>
+    </w:p>
+    <w:p>
+      <w:r>
+        <w:t xml:space="preserve">3. </w:t>
+      </w:r>
+      <w:r>
+        <w:t xml:space="preserve">Define messages/fields → </w:t>
+      </w:r>
+      <w:r>
+        <w:rPr>
+          <w:b/>
+        </w:rPr>
+        <w:t>Start Live</w:t>
+      </w:r>
+      <w:r>
+        <w:t>. TCP data is framed and decoded the same way as UDP.</w:t>
+      </w:r>
+    </w:p>
+    <w:p>
+      <w:pPr>
+        <w:pStyle w:val="Heading2"/>
+      </w:pPr>
+      <w:r>
+        <w:t>Receive from multiple sources at once (connections)</w:t>
+      </w:r>
+    </w:p>
+    <w:p>
+      <w:r>
+        <w:t xml:space="preserve">1. </w:t>
+      </w:r>
+      <w:r>
+        <w:rPr>
+          <w:b/>
+        </w:rPr>
+        <w:t>Live Mode</w:t>
+      </w:r>
+      <w:r>
+        <w:t xml:space="preserve"> (Ctrl+2) → </w:t>
+      </w:r>
+      <w:r>
+        <w:rPr>
+          <w:b/>
+        </w:rPr>
+        <w:t>Configure Connections…</w:t>
+      </w:r>
+      <w:r>
+        <w:t xml:space="preserve"> → </w:t>
+      </w:r>
+      <w:r>
+        <w:rPr>
+          <w:b/>
+        </w:rPr>
+        <w:t>Add</w:t>
+      </w:r>
+      <w:r>
+        <w:t xml:space="preserve"> one connection per source.</w:t>
+      </w:r>
+    </w:p>
+    <w:p>
+      <w:r>
+        <w:t xml:space="preserve">2. </w:t>
+      </w:r>
+      <w:r>
+        <w:t xml:space="preserve">For each, pick the </w:t>
+      </w:r>
+      <w:r>
+        <w:rPr>
+          <w:b/>
+        </w:rPr>
+        <w:t>adapter</w:t>
+      </w:r>
+      <w:r>
+        <w:t xml:space="preserve"> (by number; *Any* and *Loopback* are always listed) and the </w:t>
+      </w:r>
+      <w:r>
+        <w:rPr>
+          <w:b/>
+        </w:rPr>
+        <w:t>port</w:t>
+      </w:r>
+      <w:r>
+        <w:t>; for UDP that is all — no IP address. For TCP also pick Listen or Connect.</w:t>
+      </w:r>
+    </w:p>
+    <w:p>
+      <w:r>
+        <w:t xml:space="preserve">3. </w:t>
+      </w:r>
+      <w:r>
+        <w:t xml:space="preserve">Press </w:t>
+      </w:r>
+      <w:r>
+        <w:rPr>
+          <w:b/>
+        </w:rPr>
+        <w:t>Configure Messages</w:t>
+      </w:r>
+      <w:r>
+        <w:t xml:space="preserve">, and in the </w:t>
+      </w:r>
+      <w:r>
+        <w:rPr>
+          <w:b/>
+        </w:rPr>
+        <w:t>Connection</w:t>
+      </w:r>
+      <w:r>
+        <w:t xml:space="preserve"> column bind each message to the connection it should be decoded from (leave a message on *(any connection)* to accept it from all of them).</w:t>
+      </w:r>
+    </w:p>
+    <w:p>
+      <w:r>
+        <w:t xml:space="preserve">4. </w:t>
+      </w:r>
+      <w:r>
+        <w:rPr>
+          <w:b/>
+        </w:rPr>
+        <w:t>Start Live</w:t>
+      </w:r>
+      <w:r>
+        <w:t xml:space="preserve"> — one receiver runs per connection and each message is only matched on its connection, so two sources on different adapters/ports are kept completely separate.</w:t>
+      </w:r>
+    </w:p>
+    <w:p>
+      <w:pPr>
+        <w:pStyle w:val="Heading2"/>
+      </w:pPr>
+      <w:r>
+        <w:t>Import/export messages while configuring (JSON)</w:t>
+      </w:r>
+    </w:p>
+    <w:p>
+      <w:r>
+        <w:t xml:space="preserve">Inside the </w:t>
+      </w:r>
+      <w:r>
+        <w:rPr>
+          <w:b/>
+        </w:rPr>
+        <w:t>Configure Messages</w:t>
+      </w:r>
+      <w:r>
+        <w:t xml:space="preserve"> dialog, </w:t>
+      </w:r>
+      <w:r>
+        <w:rPr>
+          <w:b/>
+        </w:rPr>
+        <w:t>Import JSON…</w:t>
+      </w:r>
+      <w:r>
+        <w:t xml:space="preserve"> appends message definitions from a JSON file and </w:t>
+      </w:r>
+      <w:r>
+        <w:rPr>
+          <w:b/>
+        </w:rPr>
+        <w:t>Export JSON…</w:t>
+      </w:r>
+      <w:r>
+        <w:t xml:space="preserve"> writes the current list out — the same format the simulator and the File menu use.</w:t>
+      </w:r>
+    </w:p>
+    <w:p>
+      <w:pPr>
+        <w:pStyle w:val="Heading2"/>
+      </w:pPr>
+      <w:r>
+        <w:t>Import message/field definitions from a Word ICD</w:t>
+      </w:r>
+    </w:p>
+    <w:p>
+      <w:r>
+        <w:t xml:space="preserve">See the dedicated </w:t>
+      </w:r>
+      <w:r>
+        <w:rPr>
+          <w:b/>
+        </w:rPr>
+        <w:t>Import from a Word ICD</w:t>
+      </w:r>
+      <w:r>
+        <w:t xml:space="preserve"> section below.</w:t>
+      </w:r>
+    </w:p>
+    <w:p>
+      <w:pPr>
+        <w:pStyle w:val="Heading2"/>
+      </w:pPr>
+      <w:r>
+        <w:t>Add a bitfield decoder to a field</w:t>
+      </w:r>
+    </w:p>
+    <w:p>
+      <w:r>
+        <w:t xml:space="preserve">In </w:t>
+      </w:r>
+      <w:r>
+        <w:rPr>
+          <w:b/>
+        </w:rPr>
+        <w:t>Configure Fields</w:t>
+      </w:r>
+      <w:r>
+        <w:t xml:space="preserve">, select the field and press </w:t>
+      </w:r>
+      <w:r>
+        <w:rPr>
+          <w:b/>
+        </w:rPr>
+        <w:t>Bitfield Decoder</w:t>
+      </w:r>
+      <w:r>
+        <w:t xml:space="preserve"> (or the </w:t>
+      </w:r>
+      <w:r>
+        <w:rPr>
+          <w:b/>
+        </w:rPr>
+        <w:t>Edit</w:t>
+      </w:r>
+      <w:r>
+        <w:t xml:space="preserve"> button in the field's *Bit Decoder* column). Define one or more rules — a label, the bit positions, the rule type and the meaning of each pattern. On export, the field expands into readable per-bit columns.</w:t>
+      </w:r>
+    </w:p>
+    <w:p>
+      <w:r>
+        <w:drawing>
+          <wp:inline xmlns:a="http://schemas.openxmlformats.org/drawingml/2006/main" xmlns:pic="http://schemas.openxmlformats.org/drawingml/2006/picture">
+            <wp:extent cx="5760720" cy="3518414"/>
+            <wp:docPr id="11" name="Picture 11"/>
+            <wp:cNvGraphicFramePr>
+              <a:graphicFrameLocks noChangeAspect="1"/>
+            </wp:cNvGraphicFramePr>
+            <a:graphic>
+              <a:graphicData uri="http://schemas.openxmlformats.org/drawingml/2006/picture">
+                <pic:pic>
+                  <pic:nvPicPr>
+                    <pic:cNvPr id="0" name="bitfield-decoder.png"/>
+                    <pic:cNvPicPr/>
+                  </pic:nvPicPr>
+                  <pic:blipFill>
+                    <a:blip r:embed="rId19"/>
+                    <a:stretch>
+                      <a:fillRect/>
+                    </a:stretch>
+                  </pic:blipFill>
+                  <pic:spPr>
+                    <a:xfrm>
+                      <a:off x="0" y="0"/>
+                      <a:ext cx="5760720" cy="3518414"/>
+                    </a:xfrm>
+                    <a:prstGeom prst="rect"/>
+                  </pic:spPr>
+                </pic:pic>
+              </a:graphicData>
+            </a:graphic>
+          </wp:inline>
+        </w:drawing>
+      </w:r>
+    </w:p>
+    <w:p>
+      <w:r>
+        <w:rPr>
+          <w:i/>
+          <w:color w:val="666666"/>
+          <w:sz w:val="18"/>
+        </w:rPr>
+        <w:t>Bitfield Decoder — the rule list for a field</w:t>
+      </w:r>
+    </w:p>
+    <w:p>
+      <w:r>
+        <w:t>Each rule is edited in its own dialog (label, bit positions, rule type, and the binary-pattern → meaning mapping):</w:t>
+      </w:r>
+    </w:p>
+    <w:p>
+      <w:r>
+        <w:drawing>
+          <wp:inline xmlns:a="http://schemas.openxmlformats.org/drawingml/2006/main" xmlns:pic="http://schemas.openxmlformats.org/drawingml/2006/picture">
+            <wp:extent cx="5760720" cy="4650500"/>
+            <wp:docPr id="12" name="Picture 12"/>
+            <wp:cNvGraphicFramePr>
+              <a:graphicFrameLocks noChangeAspect="1"/>
+            </wp:cNvGraphicFramePr>
+            <a:graphic>
+              <a:graphicData uri="http://schemas.openxmlformats.org/drawingml/2006/picture">
+                <pic:pic>
+                  <pic:nvPicPr>
+                    <pic:cNvPr id="0" name="bitfield-rule.png"/>
+                    <pic:cNvPicPr/>
+                  </pic:nvPicPr>
+                  <pic:blipFill>
+                    <a:blip r:embed="rId20"/>
+                    <a:stretch>
+                      <a:fillRect/>
+                    </a:stretch>
+                  </pic:blipFill>
+                  <pic:spPr>
+                    <a:xfrm>
+                      <a:off x="0" y="0"/>
+                      <a:ext cx="5760720" cy="4650500"/>
+                    </a:xfrm>
+                    <a:prstGeom prst="rect"/>
+                  </pic:spPr>
+                </pic:pic>
+              </a:graphicData>
+            </a:graphic>
+          </wp:inline>
+        </w:drawing>
+      </w:r>
+    </w:p>
+    <w:p>
+      <w:r>
+        <w:rPr>
+          <w:i/>
+          <w:color w:val="666666"/>
+          <w:sz w:val="18"/>
+        </w:rPr>
+        <w:t>Adding a bitfield decode rule</w:t>
+      </w:r>
+    </w:p>
+    <w:p>
+      <w:r>
+        <w:rPr>
+          <w:b/>
+        </w:rPr>
+        <w:t>Conditional</w:t>
+      </w:r>
+      <w:r>
+        <w:t xml:space="preserve"> decoders switch the bit meanings based on a controller field's value — choose the controller field, then add a profile (a set of rules) per controller value:</w:t>
+      </w:r>
+    </w:p>
+    <w:p>
+      <w:r>
+        <w:drawing>
+          <wp:inline xmlns:a="http://schemas.openxmlformats.org/drawingml/2006/main" xmlns:pic="http://schemas.openxmlformats.org/drawingml/2006/picture">
+            <wp:extent cx="5760720" cy="4747680"/>
+            <wp:docPr id="13" name="Picture 13"/>
+            <wp:cNvGraphicFramePr>
+              <a:graphicFrameLocks noChangeAspect="1"/>
+            </wp:cNvGraphicFramePr>
+            <a:graphic>
+              <a:graphicData uri="http://schemas.openxmlformats.org/drawingml/2006/picture">
+                <pic:pic>
+                  <pic:nvPicPr>
+                    <pic:cNvPr id="0" name="conditional-decoder.png"/>
+                    <pic:cNvPicPr/>
+                  </pic:nvPicPr>
+                  <pic:blipFill>
+                    <a:blip r:embed="rId21"/>
+                    <a:stretch>
+                      <a:fillRect/>
+                    </a:stretch>
+                  </pic:blipFill>
+                  <pic:spPr>
+                    <a:xfrm>
+                      <a:off x="0" y="0"/>
+                      <a:ext cx="5760720" cy="4747680"/>
+                    </a:xfrm>
+                    <a:prstGeom prst="rect"/>
+                  </pic:spPr>
+                </pic:pic>
+              </a:graphicData>
+            </a:graphic>
+          </wp:inline>
+        </w:drawing>
+      </w:r>
+    </w:p>
+    <w:p>
+      <w:r>
+        <w:rPr>
+          <w:i/>
+          <w:color w:val="666666"/>
+          <w:sz w:val="18"/>
+        </w:rPr>
+        <w:t>Conditional Decoder — bit meanings that depend on another field</w:t>
+      </w:r>
+    </w:p>
+    <w:p>
+      <w:pPr>
+        <w:pStyle w:val="Heading2"/>
+      </w:pPr>
+      <w:r>
+        <w:t>Export to Excel</w:t>
+      </w:r>
+    </w:p>
+    <w:p>
+      <w:r>
+        <w:t xml:space="preserve">Use the export options to write </w:t>
+      </w:r>
+      <w:r>
+        <w:rPr>
+          <w:rFonts w:ascii="Consolas" w:hAnsi="Consolas"/>
+          <w:color w:val="C7254E"/>
+        </w:rPr>
+        <w:t>.xlsx</w:t>
+      </w:r>
+      <w:r>
+        <w:t xml:space="preserve"> instead of CSV (one sheet per message). See the Excel export notes for carrying the bundled library to another PC.</w:t>
+      </w:r>
+    </w:p>
+    <w:p>
+      <w:pPr>
+        <w:pStyle w:val="Heading2"/>
+      </w:pPr>
+      <w:r>
+        <w:t>Import/export fields as Excel</w:t>
+      </w:r>
+    </w:p>
+    <w:p>
+      <w:r>
+        <w:t xml:space="preserve">In </w:t>
+      </w:r>
+      <w:r>
+        <w:rPr>
+          <w:b/>
+        </w:rPr>
+        <w:t>Configure Fields</w:t>
+      </w:r>
+      <w:r>
+        <w:t xml:space="preserve">, use the </w:t>
+      </w:r>
+      <w:r>
+        <w:rPr>
+          <w:b/>
+        </w:rPr>
+        <w:t>Excel</w:t>
+      </w:r>
+      <w:r>
+        <w:t xml:space="preserve"> menu → </w:t>
+      </w:r>
+      <w:r>
+        <w:rPr>
+          <w:b/>
+        </w:rPr>
+        <w:t>Import</w:t>
+      </w:r>
+      <w:r>
+        <w:t xml:space="preserve"> to load fields from a </w:t>
+      </w:r>
+      <w:r>
+        <w:rPr>
+          <w:rFonts w:ascii="Consolas" w:hAnsi="Consolas"/>
+          <w:color w:val="C7254E"/>
+        </w:rPr>
+        <w:t>.xlsx</w:t>
+      </w:r>
+      <w:r>
+        <w:t xml:space="preserve"> file (same column layout as CSV: Name, ByteOffset, DataType, Length, Resolution, etc.), or </w:t>
+      </w:r>
+      <w:r>
+        <w:rPr>
+          <w:b/>
+        </w:rPr>
+        <w:t>Export</w:t>
+      </w:r>
+      <w:r>
+        <w:t xml:space="preserve"> to write the current fields to Excel. Bit decoders are not carried in the spreadsheet — use JSON for those.</w:t>
+      </w:r>
+    </w:p>
+    <w:p>
+      <w:pPr>
+        <w:pStyle w:val="Heading2"/>
+      </w:pPr>
+      <w:r>
+        <w:t>Import/export fields as JSON (lossless)</w:t>
+      </w:r>
+    </w:p>
+    <w:p>
+      <w:r>
+        <w:t xml:space="preserve">In </w:t>
+      </w:r>
+      <w:r>
+        <w:rPr>
+          <w:b/>
+        </w:rPr>
+        <w:t>Configure Fields</w:t>
+      </w:r>
+      <w:r>
+        <w:t xml:space="preserve">, use the </w:t>
+      </w:r>
+      <w:r>
+        <w:rPr>
+          <w:b/>
+        </w:rPr>
+        <w:t>JSON</w:t>
+      </w:r>
+      <w:r>
+        <w:t xml:space="preserve"> menu → </w:t>
+      </w:r>
+      <w:r>
+        <w:rPr>
+          <w:b/>
+        </w:rPr>
+        <w:t>Import</w:t>
+      </w:r>
+      <w:r>
+        <w:t xml:space="preserve"> / </w:t>
+      </w:r>
+      <w:r>
+        <w:rPr>
+          <w:b/>
+        </w:rPr>
+        <w:t>Export</w:t>
+      </w:r>
+      <w:r>
+        <w:t>. The JSON format carries the full field definition including bitfield decoders, conditional decoders, and resolution expressions.</w:t>
+      </w:r>
+    </w:p>
+    <w:p>
+      <w:pPr>
+        <w:pStyle w:val="Heading2"/>
+      </w:pPr>
+      <w:r>
+        <w:t>Import/export whole messages as JSON</w:t>
+      </w:r>
+    </w:p>
+    <w:p>
+      <w:r>
+        <w:rPr>
+          <w:b/>
+        </w:rPr>
+        <w:t>File → Export Messages (JSON)</w:t>
+      </w:r>
+      <w:r>
+        <w:t xml:space="preserve"> writes all configured messages (both modes) — fields, compare options, payload length, port — to a single JSON file. </w:t>
+      </w:r>
+      <w:r>
+        <w:rPr>
+          <w:b/>
+        </w:rPr>
+        <w:t>File → Import Messages (JSON)</w:t>
+      </w:r>
+      <w:r>
+        <w:t xml:space="preserve"> loads them back, appending to the current list (clashing names are auto-renamed). The format is shared with the simulator, so you can round-trip definitions between the two apps without data loss.</w:t>
+      </w:r>
+    </w:p>
+    <w:p>
+      <w:pPr>
+        <w:pStyle w:val="Heading2"/>
+      </w:pPr>
+      <w:r>
+        <w:t>Switch offset display to Words</w:t>
+      </w:r>
+    </w:p>
+    <w:p>
+      <w:r>
+        <w:t xml:space="preserve">In </w:t>
+      </w:r>
+      <w:r>
+        <w:rPr>
+          <w:b/>
+        </w:rPr>
+        <w:t>Configure Fields</w:t>
+      </w:r>
+      <w:r>
+        <w:t xml:space="preserve">, change the </w:t>
+      </w:r>
+      <w:r>
+        <w:rPr>
+          <w:b/>
+        </w:rPr>
+        <w:t>Offsets in</w:t>
+      </w:r>
+      <w:r>
+        <w:t xml:space="preserve"> dropdown from </w:t>
+      </w:r>
+      <w:r>
+        <w:rPr>
+          <w:b/>
+        </w:rPr>
+        <w:t>Bytes</w:t>
+      </w:r>
+      <w:r>
+        <w:t xml:space="preserve"> to </w:t>
+      </w:r>
+      <w:r>
+        <w:rPr>
+          <w:b/>
+        </w:rPr>
+        <w:t>Words (2 bytes)</w:t>
+      </w:r>
+      <w:r>
+        <w:t>. The offset column will display and accept word-based offsets (1 word = 2 bytes). The underlying byte offsets are unchanged; this is purely a display convenience.</w:t>
+      </w:r>
+    </w:p>
+    <w:p>
+      <w:pPr>
+        <w:pStyle w:val="Heading2"/>
+      </w:pPr>
+      <w:r>
+        <w:t>Use the simulator as a test source</w:t>
+      </w:r>
+    </w:p>
+    <w:p>
+      <w:r>
+        <w:t xml:space="preserve">Run *Universal Data Simulator*, point it at this app's </w:t>
+      </w:r>
+      <w:r>
+        <w:rPr>
+          <w:b/>
+        </w:rPr>
+        <w:t>Live Mode</w:t>
+      </w:r>
+      <w:r>
+        <w:t xml:space="preserve"> port (UDP or TCP), and stream a message — a quick way to validate your field definitions end to end.</w:t>
+      </w:r>
+    </w:p>
+    <w:p>
+      <w:pPr>
+        <w:pBdr>
+          <w:bottom w:val="single" w:sz="6" w:space="1" w:color="BBBBBB"/>
+        </w:pBdr>
+      </w:pPr>
+    </w:p>
+    <w:p>
+      <w:pPr>
+        <w:pStyle w:val="Heading1"/>
+      </w:pPr>
+      <w:r>
+        <w:t>Import from a Word ICD</w:t>
+      </w:r>
+    </w:p>
+    <w:p>
+      <w:r>
+        <w:t xml:space="preserve">The reader can build complete message and field definitions straight from a Word </w:t>
+      </w:r>
+      <w:r>
+        <w:rPr>
+          <w:b/>
+        </w:rPr>
+        <w:t>`.docx`</w:t>
+      </w:r>
+      <w:r>
+        <w:t xml:space="preserve"> Interface Control Document, so you never have to retype byte offsets, lengths and types by hand.</w:t>
+      </w:r>
+    </w:p>
+    <w:p>
+      <w:r>
+        <w:rPr>
+          <w:b/>
+        </w:rPr>
+        <w:t>1. Open the importer.</w:t>
+      </w:r>
+      <w:r>
+        <w:t xml:space="preserve"> Press </w:t>
+      </w:r>
+      <w:r>
+        <w:rPr>
+          <w:b/>
+        </w:rPr>
+        <w:t>Import ICD…</w:t>
+      </w:r>
+      <w:r>
+        <w:t xml:space="preserve"> (Ctrl+I) and pick the </w:t>
       </w:r>
       <w:r>
         <w:rPr>
@@ -1465,7 +2296,250 @@
         <w:t>.docx</w:t>
       </w:r>
       <w:r>
-        <w:t xml:space="preserve"> → tick the tables that hold field definitions → </w:t>
+        <w:t>. The reader scans every table in the document and opens the import dialog.</w:t>
+      </w:r>
+    </w:p>
+    <w:p>
+      <w:r>
+        <w:drawing>
+          <wp:inline xmlns:a="http://schemas.openxmlformats.org/drawingml/2006/main" xmlns:pic="http://schemas.openxmlformats.org/drawingml/2006/picture">
+            <wp:extent cx="5760720" cy="4199146"/>
+            <wp:docPr id="14" name="Picture 14"/>
+            <wp:cNvGraphicFramePr>
+              <a:graphicFrameLocks noChangeAspect="1"/>
+            </wp:cNvGraphicFramePr>
+            <a:graphic>
+              <a:graphicData uri="http://schemas.openxmlformats.org/drawingml/2006/picture">
+                <pic:pic>
+                  <pic:nvPicPr>
+                    <pic:cNvPr id="0" name="icd-import.png"/>
+                    <pic:cNvPicPr/>
+                  </pic:nvPicPr>
+                  <pic:blipFill>
+                    <a:blip r:embed="rId22"/>
+                    <a:stretch>
+                      <a:fillRect/>
+                    </a:stretch>
+                  </pic:blipFill>
+                  <pic:spPr>
+                    <a:xfrm>
+                      <a:off x="0" y="0"/>
+                      <a:ext cx="5760720" cy="4199146"/>
+                    </a:xfrm>
+                    <a:prstGeom prst="rect"/>
+                  </pic:spPr>
+                </pic:pic>
+              </a:graphicData>
+            </a:graphic>
+          </wp:inline>
+        </w:drawing>
+      </w:r>
+    </w:p>
+    <w:p>
+      <w:r>
+        <w:rPr>
+          <w:i/>
+          <w:color w:val="666666"/>
+          <w:sz w:val="18"/>
+        </w:rPr>
+        <w:t>Import ICD — table summary, selected tables, and the build/review area</w:t>
+      </w:r>
+    </w:p>
+    <w:p>
+      <w:r>
+        <w:rPr>
+          <w:b/>
+        </w:rPr>
+        <w:t>2. Choose which tables to import.</w:t>
+      </w:r>
+      <w:r>
+        <w:t xml:space="preserve"> Press </w:t>
+      </w:r>
+      <w:r>
+        <w:rPr>
+          <w:b/>
+        </w:rPr>
+        <w:t>Select Tables…</w:t>
+      </w:r>
+      <w:r>
+        <w:t xml:space="preserve"> to open the table picker. The left pane lists every table in the document with a checkbox; the right pane renders the full table as a live preview. Clicking a row scrolls the preview to it, and clicking a heading in the preview selects the row. Likely field-definition tables are pre-ticked. Use </w:t>
+      </w:r>
+      <w:r>
+        <w:rPr>
+          <w:b/>
+        </w:rPr>
+        <w:t>Check All</w:t>
+      </w:r>
+      <w:r>
+        <w:t xml:space="preserve"> / </w:t>
+      </w:r>
+      <w:r>
+        <w:rPr>
+          <w:b/>
+        </w:rPr>
+        <w:t>Uncheck All</w:t>
+      </w:r>
+      <w:r>
+        <w:t xml:space="preserve"> and the summary line at the bottom to confirm your selection, then press </w:t>
+      </w:r>
+      <w:r>
+        <w:rPr>
+          <w:b/>
+        </w:rPr>
+        <w:t>OK</w:t>
+      </w:r>
+      <w:r>
+        <w:t>.</w:t>
+      </w:r>
+    </w:p>
+    <w:p>
+      <w:r>
+        <w:drawing>
+          <wp:inline xmlns:a="http://schemas.openxmlformats.org/drawingml/2006/main" xmlns:pic="http://schemas.openxmlformats.org/drawingml/2006/picture">
+            <wp:extent cx="5760720" cy="3894091"/>
+            <wp:docPr id="15" name="Picture 15"/>
+            <wp:cNvGraphicFramePr>
+              <a:graphicFrameLocks noChangeAspect="1"/>
+            </wp:cNvGraphicFramePr>
+            <a:graphic>
+              <a:graphicData uri="http://schemas.openxmlformats.org/drawingml/2006/picture">
+                <pic:pic>
+                  <pic:nvPicPr>
+                    <pic:cNvPr id="0" name="icd-table-picker.png"/>
+                    <pic:cNvPicPr/>
+                  </pic:nvPicPr>
+                  <pic:blipFill>
+                    <a:blip r:embed="rId23"/>
+                    <a:stretch>
+                      <a:fillRect/>
+                    </a:stretch>
+                  </pic:blipFill>
+                  <pic:spPr>
+                    <a:xfrm>
+                      <a:off x="0" y="0"/>
+                      <a:ext cx="5760720" cy="3894091"/>
+                    </a:xfrm>
+                    <a:prstGeom prst="rect"/>
+                  </pic:spPr>
+                </pic:pic>
+              </a:graphicData>
+            </a:graphic>
+          </wp:inline>
+        </w:drawing>
+      </w:r>
+    </w:p>
+    <w:p>
+      <w:r>
+        <w:rPr>
+          <w:i/>
+          <w:color w:val="666666"/>
+          <w:sz w:val="18"/>
+        </w:rPr>
+        <w:t>Select Tables — checkable list on the left, live HTML preview on the right</w:t>
+      </w:r>
+    </w:p>
+    <w:p>
+      <w:r>
+        <w:rPr>
+          <w:b/>
+        </w:rPr>
+        <w:t>3. Map the columns (if needed).</w:t>
+      </w:r>
+      <w:r>
+        <w:t xml:space="preserve"> Each selected table appears in box 2. Open </w:t>
+      </w:r>
+      <w:r>
+        <w:rPr>
+          <w:b/>
+        </w:rPr>
+        <w:t>Settings</w:t>
+      </w:r>
+      <w:r>
+        <w:t xml:space="preserve"> on a table to map its columns (Name, Byte Offset, Data Type, Length, Resolution, Description), set the </w:t>
+      </w:r>
+      <w:r>
+        <w:rPr>
+          <w:b/>
+        </w:rPr>
+        <w:t>Offset base</w:t>
+      </w:r>
+      <w:r>
+        <w:t xml:space="preserve"> (0- or 1-based), choose where the </w:t>
+      </w:r>
+      <w:r>
+        <w:rPr>
+          <w:b/>
+        </w:rPr>
+        <w:t>message name</w:t>
+      </w:r>
+      <w:r>
+        <w:t xml:space="preserve"> comes from, and merge continuation tables. </w:t>
+      </w:r>
+      <w:r>
+        <w:rPr>
+          <w:b/>
+        </w:rPr>
+        <w:t>Auto-detect columns from this table</w:t>
+      </w:r>
+      <w:r>
+        <w:t xml:space="preserve"> does its best guess automatically.</w:t>
+      </w:r>
+    </w:p>
+    <w:p>
+      <w:r>
+        <w:drawing>
+          <wp:inline xmlns:a="http://schemas.openxmlformats.org/drawingml/2006/main" xmlns:pic="http://schemas.openxmlformats.org/drawingml/2006/picture">
+            <wp:extent cx="5760720" cy="5271602"/>
+            <wp:docPr id="16" name="Picture 16"/>
+            <wp:cNvGraphicFramePr>
+              <a:graphicFrameLocks noChangeAspect="1"/>
+            </wp:cNvGraphicFramePr>
+            <a:graphic>
+              <a:graphicData uri="http://schemas.openxmlformats.org/drawingml/2006/picture">
+                <pic:pic>
+                  <pic:nvPicPr>
+                    <pic:cNvPr id="0" name="icd-table-settings.png"/>
+                    <pic:cNvPicPr/>
+                  </pic:nvPicPr>
+                  <pic:blipFill>
+                    <a:blip r:embed="rId24"/>
+                    <a:stretch>
+                      <a:fillRect/>
+                    </a:stretch>
+                  </pic:blipFill>
+                  <pic:spPr>
+                    <a:xfrm>
+                      <a:off x="0" y="0"/>
+                      <a:ext cx="5760720" cy="5271602"/>
+                    </a:xfrm>
+                    <a:prstGeom prst="rect"/>
+                  </pic:spPr>
+                </pic:pic>
+              </a:graphicData>
+            </a:graphic>
+          </wp:inline>
+        </w:drawing>
+      </w:r>
+    </w:p>
+    <w:p>
+      <w:r>
+        <w:rPr>
+          <w:i/>
+          <w:color w:val="666666"/>
+          <w:sz w:val="18"/>
+        </w:rPr>
+        <w:t>Table Settings — column mapping, offset base, and message identity</w:t>
+      </w:r>
+    </w:p>
+    <w:p>
+      <w:r>
+        <w:rPr>
+          <w:b/>
+        </w:rPr>
+        <w:t>4. Build &amp; review.</w:t>
+      </w:r>
+      <w:r>
+        <w:t xml:space="preserve"> Press </w:t>
       </w:r>
       <w:r>
         <w:rPr>
@@ -1474,7 +2548,73 @@
         <w:t>Build / Preview</w:t>
       </w:r>
       <w:r>
-        <w:t xml:space="preserve"> → review (the column mapping and offset base are auto-detected and editable) → </w:t>
+        <w:t xml:space="preserve"> to expand the tables into messages and fields. Review (and edit) every value in the tree — double-click a message row to change its port, length or header; the *Decoder* column shows decoders auto-derived from "0x01 - MEANING" description text. Any problems are listed under </w:t>
+      </w:r>
+      <w:r>
+        <w:rPr>
+          <w:b/>
+        </w:rPr>
+        <w:t>Warnings</w:t>
+      </w:r>
+      <w:r>
+        <w:t>.</w:t>
+      </w:r>
+    </w:p>
+    <w:p>
+      <w:r>
+        <w:drawing>
+          <wp:inline xmlns:a="http://schemas.openxmlformats.org/drawingml/2006/main" xmlns:pic="http://schemas.openxmlformats.org/drawingml/2006/picture">
+            <wp:extent cx="5760720" cy="4199146"/>
+            <wp:docPr id="17" name="Picture 17"/>
+            <wp:cNvGraphicFramePr>
+              <a:graphicFrameLocks noChangeAspect="1"/>
+            </wp:cNvGraphicFramePr>
+            <a:graphic>
+              <a:graphicData uri="http://schemas.openxmlformats.org/drawingml/2006/picture">
+                <pic:pic>
+                  <pic:nvPicPr>
+                    <pic:cNvPr id="0" name="icd-review.png"/>
+                    <pic:cNvPicPr/>
+                  </pic:nvPicPr>
+                  <pic:blipFill>
+                    <a:blip r:embed="rId25"/>
+                    <a:stretch>
+                      <a:fillRect/>
+                    </a:stretch>
+                  </pic:blipFill>
+                  <pic:spPr>
+                    <a:xfrm>
+                      <a:off x="0" y="0"/>
+                      <a:ext cx="5760720" cy="4199146"/>
+                    </a:xfrm>
+                    <a:prstGeom prst="rect"/>
+                  </pic:spPr>
+                </pic:pic>
+              </a:graphicData>
+            </a:graphic>
+          </wp:inline>
+        </w:drawing>
+      </w:r>
+    </w:p>
+    <w:p>
+      <w:r>
+        <w:rPr>
+          <w:i/>
+          <w:color w:val="666666"/>
+          <w:sz w:val="18"/>
+        </w:rPr>
+        <w:t>Build / Preview — the drafted messages and fields, ready to import</w:t>
+      </w:r>
+    </w:p>
+    <w:p>
+      <w:r>
+        <w:rPr>
+          <w:b/>
+        </w:rPr>
+        <w:t>5. Import.</w:t>
+      </w:r>
+      <w:r>
+        <w:t xml:space="preserve"> Press </w:t>
       </w:r>
       <w:r>
         <w:rPr>
@@ -1483,268 +2623,7 @@
         <w:t>OK</w:t>
       </w:r>
       <w:r>
-        <w:t>. The drafted messages appear in *Configured Messages*.</w:t>
-      </w:r>
-    </w:p>
-    <w:p>
-      <w:pPr>
-        <w:pStyle w:val="Heading2"/>
-      </w:pPr>
-      <w:r>
-        <w:t>Add a bitfield decoder to a field</w:t>
-      </w:r>
-    </w:p>
-    <w:p>
-      <w:r>
-        <w:t xml:space="preserve">In </w:t>
-      </w:r>
-      <w:r>
-        <w:rPr>
-          <w:b/>
-        </w:rPr>
-        <w:t>Configure Fields</w:t>
-      </w:r>
-      <w:r>
-        <w:t xml:space="preserve">, open the field's decoder and define bit ranges → names/meanings. On export, the field expands into readable per-bit columns. </w:t>
-      </w:r>
-      <w:r>
-        <w:rPr>
-          <w:b/>
-        </w:rPr>
-        <w:t>Conditional</w:t>
-      </w:r>
-      <w:r>
-        <w:t xml:space="preserve"> decoders switch the bit meanings based on a controller field's value.</w:t>
-      </w:r>
-    </w:p>
-    <w:p>
-      <w:pPr>
-        <w:pStyle w:val="Heading2"/>
-      </w:pPr>
-      <w:r>
-        <w:t>Export to Excel</w:t>
-      </w:r>
-    </w:p>
-    <w:p>
-      <w:r>
-        <w:t xml:space="preserve">Use the export options to write </w:t>
-      </w:r>
-      <w:r>
-        <w:rPr>
-          <w:rFonts w:ascii="Consolas" w:hAnsi="Consolas"/>
-          <w:color w:val="C7254E"/>
-        </w:rPr>
-        <w:t>.xlsx</w:t>
-      </w:r>
-      <w:r>
-        <w:t xml:space="preserve"> instead of CSV (one sheet per message). See the Excel export notes for carrying the bundled library to another PC.</w:t>
-      </w:r>
-    </w:p>
-    <w:p>
-      <w:pPr>
-        <w:pStyle w:val="Heading2"/>
-      </w:pPr>
-      <w:r>
-        <w:t>Import/export fields as Excel</w:t>
-      </w:r>
-    </w:p>
-    <w:p>
-      <w:r>
-        <w:t xml:space="preserve">In </w:t>
-      </w:r>
-      <w:r>
-        <w:rPr>
-          <w:b/>
-        </w:rPr>
-        <w:t>Configure Fields</w:t>
-      </w:r>
-      <w:r>
-        <w:t xml:space="preserve">, use the </w:t>
-      </w:r>
-      <w:r>
-        <w:rPr>
-          <w:b/>
-        </w:rPr>
-        <w:t>Excel</w:t>
-      </w:r>
-      <w:r>
-        <w:t xml:space="preserve"> menu → </w:t>
-      </w:r>
-      <w:r>
-        <w:rPr>
-          <w:b/>
-        </w:rPr>
-        <w:t>Import</w:t>
-      </w:r>
-      <w:r>
-        <w:t xml:space="preserve"> to load fields from a </w:t>
-      </w:r>
-      <w:r>
-        <w:rPr>
-          <w:rFonts w:ascii="Consolas" w:hAnsi="Consolas"/>
-          <w:color w:val="C7254E"/>
-        </w:rPr>
-        <w:t>.xlsx</w:t>
-      </w:r>
-      <w:r>
-        <w:t xml:space="preserve"> file (same column layout as CSV: Name, ByteOffset, DataType, Length, Resolution, etc.), or </w:t>
-      </w:r>
-      <w:r>
-        <w:rPr>
-          <w:b/>
-        </w:rPr>
-        <w:t>Export</w:t>
-      </w:r>
-      <w:r>
-        <w:t xml:space="preserve"> to write the current fields to Excel. Bit decoders are not carried in the spreadsheet — use JSON for those.</w:t>
-      </w:r>
-    </w:p>
-    <w:p>
-      <w:pPr>
-        <w:pStyle w:val="Heading2"/>
-      </w:pPr>
-      <w:r>
-        <w:t>Import/export fields as JSON (lossless)</w:t>
-      </w:r>
-    </w:p>
-    <w:p>
-      <w:r>
-        <w:t xml:space="preserve">In </w:t>
-      </w:r>
-      <w:r>
-        <w:rPr>
-          <w:b/>
-        </w:rPr>
-        <w:t>Configure Fields</w:t>
-      </w:r>
-      <w:r>
-        <w:t xml:space="preserve">, use the </w:t>
-      </w:r>
-      <w:r>
-        <w:rPr>
-          <w:b/>
-        </w:rPr>
-        <w:t>JSON</w:t>
-      </w:r>
-      <w:r>
-        <w:t xml:space="preserve"> menu → </w:t>
-      </w:r>
-      <w:r>
-        <w:rPr>
-          <w:b/>
-        </w:rPr>
-        <w:t>Import</w:t>
-      </w:r>
-      <w:r>
-        <w:t xml:space="preserve"> / </w:t>
-      </w:r>
-      <w:r>
-        <w:rPr>
-          <w:b/>
-        </w:rPr>
-        <w:t>Export</w:t>
-      </w:r>
-      <w:r>
-        <w:t>. The JSON format carries the full field definition including bitfield decoders, conditional decoders, and resolution expressions.</w:t>
-      </w:r>
-    </w:p>
-    <w:p>
-      <w:pPr>
-        <w:pStyle w:val="Heading2"/>
-      </w:pPr>
-      <w:r>
-        <w:t>Import/export whole messages as JSON</w:t>
-      </w:r>
-    </w:p>
-    <w:p>
-      <w:r>
-        <w:rPr>
-          <w:b/>
-        </w:rPr>
-        <w:t>File → Export Messages (JSON)</w:t>
-      </w:r>
-      <w:r>
-        <w:t xml:space="preserve"> writes all configured messages (both modes) — fields, compare options, payload length, port — to a single JSON file. </w:t>
-      </w:r>
-      <w:r>
-        <w:rPr>
-          <w:b/>
-        </w:rPr>
-        <w:t>File → Import Messages (JSON)</w:t>
-      </w:r>
-      <w:r>
-        <w:t xml:space="preserve"> loads them back, appending to the current list (clashing names are auto-renamed). The format is shared with the simulator, so you can round-trip definitions between the two apps without data loss.</w:t>
-      </w:r>
-    </w:p>
-    <w:p>
-      <w:pPr>
-        <w:pStyle w:val="Heading2"/>
-      </w:pPr>
-      <w:r>
-        <w:t>Switch offset display to Words</w:t>
-      </w:r>
-    </w:p>
-    <w:p>
-      <w:r>
-        <w:t xml:space="preserve">In </w:t>
-      </w:r>
-      <w:r>
-        <w:rPr>
-          <w:b/>
-        </w:rPr>
-        <w:t>Configure Fields</w:t>
-      </w:r>
-      <w:r>
-        <w:t xml:space="preserve">, change the </w:t>
-      </w:r>
-      <w:r>
-        <w:rPr>
-          <w:b/>
-        </w:rPr>
-        <w:t>Offsets in</w:t>
-      </w:r>
-      <w:r>
-        <w:t xml:space="preserve"> dropdown from </w:t>
-      </w:r>
-      <w:r>
-        <w:rPr>
-          <w:b/>
-        </w:rPr>
-        <w:t>Bytes</w:t>
-      </w:r>
-      <w:r>
-        <w:t xml:space="preserve"> to </w:t>
-      </w:r>
-      <w:r>
-        <w:rPr>
-          <w:b/>
-        </w:rPr>
-        <w:t>Words (2 bytes)</w:t>
-      </w:r>
-      <w:r>
-        <w:t>. The offset column will display and accept word-based offsets (1 word = 2 bytes). The underlying byte offsets are unchanged; this is purely a display convenience.</w:t>
-      </w:r>
-    </w:p>
-    <w:p>
-      <w:pPr>
-        <w:pStyle w:val="Heading2"/>
-      </w:pPr>
-      <w:r>
-        <w:t>Use the simulator as a test source</w:t>
-      </w:r>
-    </w:p>
-    <w:p>
-      <w:r>
-        <w:t xml:space="preserve">Run *Universal Data Simulator*, point it at this app's </w:t>
-      </w:r>
-      <w:r>
-        <w:rPr>
-          <w:b/>
-        </w:rPr>
-        <w:t>Live Mode</w:t>
-      </w:r>
-      <w:r>
-        <w:t xml:space="preserve"> port (UDP or TCP), and stream a message — a quick way to validate your field definitions end to end.</w:t>
+        <w:t>. The drafted messages are added to *Configured Messages* (clashing names are auto-renamed), ready to decode.</w:t>
       </w:r>
     </w:p>
     <w:p>
@@ -1934,6 +2813,68 @@
             </w:r>
             <w:r>
               <w:t>/length filters match the traffic; widen or remove a filter to confirm.</w:t>
+            </w:r>
+          </w:p>
+        </w:tc>
+      </w:tr>
+      <w:tr>
+        <w:tc>
+          <w:tcPr>
+            <w:tcW w:type="dxa" w:w="2880"/>
+          </w:tcPr>
+          <w:p>
+            <w:r/>
+            <w:r>
+              <w:t>"Message Not Found" on export</w:t>
+            </w:r>
+          </w:p>
+        </w:tc>
+        <w:tc>
+          <w:tcPr>
+            <w:tcW w:type="dxa" w:w="2880"/>
+          </w:tcPr>
+          <w:p>
+            <w:r/>
+            <w:r>
+              <w:t>A configured message's length/port never appears in the capture</w:t>
+            </w:r>
+          </w:p>
+        </w:tc>
+        <w:tc>
+          <w:tcPr>
+            <w:tcW w:type="dxa" w:w="2880"/>
+          </w:tcPr>
+          <w:p>
+            <w:r/>
+            <w:r>
+              <w:t xml:space="preserve">Match the message </w:t>
+            </w:r>
+            <w:r>
+              <w:rPr>
+                <w:b/>
+              </w:rPr>
+              <w:t>Payload Length</w:t>
+            </w:r>
+            <w:r>
+              <w:t xml:space="preserve"> and </w:t>
+            </w:r>
+            <w:r>
+              <w:rPr>
+                <w:b/>
+              </w:rPr>
+              <w:t>Port</w:t>
+            </w:r>
+            <w:r>
+              <w:t xml:space="preserve"> to the real packets, or untick </w:t>
+            </w:r>
+            <w:r>
+              <w:rPr>
+                <w:b/>
+              </w:rPr>
+              <w:t>Verify all configured messages before export</w:t>
+            </w:r>
+            <w:r>
+              <w:t>.</w:t>
             </w:r>
           </w:p>
         </w:tc>
@@ -2184,6 +3125,50 @@
           <w:p>
             <w:r/>
             <w:r>
+              <w:t>ICD import found no/empty tables</w:t>
+            </w:r>
+          </w:p>
+        </w:tc>
+        <w:tc>
+          <w:tcPr>
+            <w:tcW w:type="dxa" w:w="2880"/>
+          </w:tcPr>
+          <w:p>
+            <w:r/>
+            <w:r>
+              <w:t>Wrong tables ticked, or a non-table layout</w:t>
+            </w:r>
+          </w:p>
+        </w:tc>
+        <w:tc>
+          <w:tcPr>
+            <w:tcW w:type="dxa" w:w="2880"/>
+          </w:tcPr>
+          <w:p>
+            <w:r/>
+            <w:r>
+              <w:t xml:space="preserve">Re-open </w:t>
+            </w:r>
+            <w:r>
+              <w:rPr>
+                <w:b/>
+              </w:rPr>
+              <w:t>Select Tables…</w:t>
+            </w:r>
+            <w:r>
+              <w:t xml:space="preserve"> and tick the tables that actually hold field rows; check the live preview.</w:t>
+            </w:r>
+          </w:p>
+        </w:tc>
+      </w:tr>
+      <w:tr>
+        <w:tc>
+          <w:tcPr>
+            <w:tcW w:type="dxa" w:w="2880"/>
+          </w:tcPr>
+          <w:p>
+            <w:r/>
+            <w:r>
               <w:t>Export fails / no file written</w:t>
             </w:r>
           </w:p>
@@ -2681,6 +3666,34 @@
       </w:r>
       <w:r>
         <w:t xml:space="preserve"> — expands a numeric field into named per-bit meanings.</w:t>
+      </w:r>
+    </w:p>
+    <w:p>
+      <w:pPr>
+        <w:pStyle w:val="ListBullet"/>
+      </w:pPr>
+      <w:r>
+        <w:rPr>
+          <w:b/>
+        </w:rPr>
+        <w:t>Conditional decoder</w:t>
+      </w:r>
+      <w:r>
+        <w:t xml:space="preserve"> — a bitfield decoder whose meanings depend on a controller field's value.</w:t>
+      </w:r>
+    </w:p>
+    <w:p>
+      <w:pPr>
+        <w:pStyle w:val="ListBullet"/>
+      </w:pPr>
+      <w:r>
+        <w:rPr>
+          <w:b/>
+        </w:rPr>
+        <w:t>Connection (Live Mode)</w:t>
+      </w:r>
+      <w:r>
+        <w:t xml:space="preserve"> — a receiver bound to one adapter + port; messages are matched only on the connection they are bound to.</w:t>
       </w:r>
     </w:p>
     <w:p>

</xml_diff>

<commit_message>
ICD: drop unreliable page numbers; refresh parser manual for the new UI
ICD import: Word .docx page numbers come from stale "lastRenderedPageBreak"
render hints, so a table on page 3 was often labelled page 1. Per request, the
page number is removed everywhere it was shown (table picker list + HTML preview,
and both apps' import dialogs); labels are now a sequential "Table N: <heading>"
(+ size). The pageNumber/tableOnPage fields remain in the struct but are no
longer displayed.

Manuals: rewrote the parser manual for the single Message Definitions box
(removed the Message Filters / Configured Messages descriptions; each message now
carries its own UDP port + length + optional header), and recaptured the parser
main-window screenshots (light / dark / live) showing the new layout. Regenerated
in-app HTML + docx and rebuilt both exes.

Co-Authored-By: Claude Opus 4.8 <noreply@anthropic.com>
</commit_message>
<xml_diff>
--- a/docs/manual/parser_manual.docx
+++ b/docs/manual/parser_manual.docx
@@ -319,7 +319,7 @@
       <w:r>
         <w:drawing>
           <wp:inline xmlns:a="http://schemas.openxmlformats.org/drawingml/2006/main" xmlns:pic="http://schemas.openxmlformats.org/drawingml/2006/picture">
-            <wp:extent cx="5760720" cy="5672593"/>
+            <wp:extent cx="5760720" cy="3263169"/>
             <wp:docPr id="2" name="Picture 2"/>
             <wp:cNvGraphicFramePr>
               <a:graphicFrameLocks noChangeAspect="1"/>
@@ -340,7 +340,7 @@
                   <pic:spPr>
                     <a:xfrm>
                       <a:off x="0" y="0"/>
-                      <a:ext cx="5760720" cy="5672593"/>
+                      <a:ext cx="5760720" cy="3263169"/>
                     </a:xfrm>
                     <a:prstGeom prst="rect"/>
                   </pic:spPr>
@@ -400,7 +400,7 @@
         <w:t>Input</w:t>
       </w:r>
       <w:r>
-        <w:t xml:space="preserve"> — choose the capture file (File Mode) or the listen/connect settings (Live Mode).</w:t>
+        <w:t xml:space="preserve"> — choose the capture file (File Mode) or the connections (Live Mode).</w:t>
       </w:r>
     </w:p>
     <w:p>
@@ -411,19 +411,28 @@
         <w:rPr>
           <w:b/>
         </w:rPr>
-        <w:t>Message Filters</w:t>
-      </w:r>
-      <w:r>
-        <w:t xml:space="preserve"> — by </w:t>
+        <w:t>Message Definitions</w:t>
+      </w:r>
+      <w:r>
+        <w:t xml:space="preserve"> — one editable list of messages; each carries its own </w:t>
       </w:r>
       <w:r>
         <w:rPr>
           <w:b/>
         </w:rPr>
-        <w:t>Port</w:t>
-      </w:r>
-      <w:r>
-        <w:t xml:space="preserve"> and/or </w:t>
+        <w:t>UDP Port</w:t>
+      </w:r>
+      <w:r>
+        <w:t xml:space="preserve">, </w:t>
+      </w:r>
+      <w:r>
+        <w:rPr>
+          <w:b/>
+        </w:rPr>
+        <w:t>Payload Length</w:t>
+      </w:r>
+      <w:r>
+        <w:t xml:space="preserve">, optional </w:t>
       </w:r>
       <w:r>
         <w:rPr>
@@ -432,35 +441,12 @@
         <w:t>Header</w:t>
       </w:r>
       <w:r>
-        <w:t xml:space="preserve">, with per-message </w:t>
-      </w:r>
-      <w:r>
-        <w:rPr>
-          <w:b/>
-        </w:rPr>
-        <w:t>Length filters</w:t>
-      </w:r>
-      <w:r>
-        <w:t>.</w:t>
+        <w:t xml:space="preserve"> and fields. This is both the routing key and what drives decoding.</w:t>
       </w:r>
     </w:p>
     <w:p>
       <w:r>
         <w:t xml:space="preserve">4. </w:t>
-      </w:r>
-      <w:r>
-        <w:rPr>
-          <w:b/>
-        </w:rPr>
-        <w:t>Configured Messages</w:t>
-      </w:r>
-      <w:r>
-        <w:t xml:space="preserve"> — the message/field definitions that drive decoding.</w:t>
-      </w:r>
-    </w:p>
-    <w:p>
-      <w:r>
-        <w:t xml:space="preserve">5. </w:t>
       </w:r>
       <w:r>
         <w:rPr>
@@ -474,7 +460,7 @@
     </w:p>
     <w:p>
       <w:r>
-        <w:t xml:space="preserve">6. </w:t>
+        <w:t xml:space="preserve">5. </w:t>
       </w:r>
       <w:r>
         <w:rPr>
@@ -513,7 +499,7 @@
       <w:r>
         <w:drawing>
           <wp:inline xmlns:a="http://schemas.openxmlformats.org/drawingml/2006/main" xmlns:pic="http://schemas.openxmlformats.org/drawingml/2006/picture">
-            <wp:extent cx="5760720" cy="5672593"/>
+            <wp:extent cx="5760720" cy="3263169"/>
             <wp:docPr id="3" name="Picture 3"/>
             <wp:cNvGraphicFramePr>
               <a:graphicFrameLocks noChangeAspect="1"/>
@@ -534,7 +520,7 @@
                   <pic:spPr>
                     <a:xfrm>
                       <a:off x="0" y="0"/>
-                      <a:ext cx="5760720" cy="5672593"/>
+                      <a:ext cx="5760720" cy="3263169"/>
                     </a:xfrm>
                     <a:prstGeom prst="rect"/>
                   </pic:spPr>
@@ -639,33 +625,69 @@
         <w:t xml:space="preserve">2. </w:t>
       </w:r>
       <w:r>
-        <w:t xml:space="preserve">Set a </w:t>
+        <w:t xml:space="preserve">Press </w:t>
       </w:r>
       <w:r>
         <w:rPr>
           <w:b/>
         </w:rPr>
-        <w:t>Message Filter</w:t>
-      </w:r>
-      <w:r>
-        <w:t xml:space="preserve"> (e.g. Port 5000) so only the traffic you care about is decoded.</w:t>
-      </w:r>
-    </w:p>
-    <w:p>
-      <w:r>
-        <w:t xml:space="preserve">3. </w:t>
-      </w:r>
-      <w:r>
-        <w:t xml:space="preserve">Define one or more </w:t>
+        <w:t>Add Message</w:t>
+      </w:r>
+      <w:r>
+        <w:t xml:space="preserve"> and give it a </w:t>
       </w:r>
       <w:r>
         <w:rPr>
           <w:b/>
         </w:rPr>
-        <w:t>messages</w:t>
-      </w:r>
-      <w:r>
-        <w:t xml:space="preserve"> and their </w:t>
+        <w:t>UDP Port</w:t>
+      </w:r>
+      <w:r>
+        <w:t xml:space="preserve"> (e.g. 5000), </w:t>
+      </w:r>
+      <w:r>
+        <w:rPr>
+          <w:b/>
+        </w:rPr>
+        <w:t>Payload Length</w:t>
+      </w:r>
+      <w:r>
+        <w:t xml:space="preserve">, and optional </w:t>
+      </w:r>
+      <w:r>
+        <w:rPr>
+          <w:b/>
+        </w:rPr>
+        <w:t>Header</w:t>
+      </w:r>
+      <w:r>
+        <w:t xml:space="preserve">; repeat for each message you want to decode (or </w:t>
+      </w:r>
+      <w:r>
+        <w:rPr>
+          <w:b/>
+        </w:rPr>
+        <w:t>Import ICD…</w:t>
+      </w:r>
+      <w:r>
+        <w:t xml:space="preserve"> to generate them).</w:t>
+      </w:r>
+    </w:p>
+    <w:p>
+      <w:r>
+        <w:t xml:space="preserve">3. </w:t>
+      </w:r>
+      <w:r>
+        <w:t xml:space="preserve">Select a message and press </w:t>
+      </w:r>
+      <w:r>
+        <w:rPr>
+          <w:b/>
+        </w:rPr>
+        <w:t>Configure Fields</w:t>
+      </w:r>
+      <w:r>
+        <w:t xml:space="preserve"> to define its </w:t>
       </w:r>
       <w:r>
         <w:rPr>
@@ -674,8 +696,119 @@
         <w:t>fields</w:t>
       </w:r>
       <w:r>
-        <w:t xml:space="preserve"> (name, byte offset, type, length, resolution), or </w:t>
-      </w:r>
+        <w:t xml:space="preserve"> (name, byte offset, type, length, resolution).</w:t>
+      </w:r>
+    </w:p>
+    <w:p>
+      <w:r>
+        <w:t xml:space="preserve">4. </w:t>
+      </w:r>
+      <w:r>
+        <w:t xml:space="preserve">Press </w:t>
+      </w:r>
+      <w:r>
+        <w:rPr>
+          <w:b/>
+        </w:rPr>
+        <w:t>Start</w:t>
+      </w:r>
+      <w:r>
+        <w:t xml:space="preserve"> (F5). The </w:t>
+      </w:r>
+      <w:r>
+        <w:rPr>
+          <w:b/>
+        </w:rPr>
+        <w:t>Output Preview</w:t>
+      </w:r>
+      <w:r>
+        <w:t xml:space="preserve"> fills in and an Excel file is written to your </w:t>
+      </w:r>
+      <w:r>
+        <w:rPr>
+          <w:b/>
+        </w:rPr>
+        <w:t>Output Files</w:t>
+      </w:r>
+      <w:r>
+        <w:t xml:space="preserve"> folder.</w:t>
+      </w:r>
+    </w:p>
+    <w:p>
+      <w:pPr>
+        <w:pBdr>
+          <w:bottom w:val="single" w:sz="6" w:space="1" w:color="BBBBBB"/>
+        </w:pBdr>
+      </w:pPr>
+    </w:p>
+    <w:p>
+      <w:pPr>
+        <w:pStyle w:val="Heading1"/>
+      </w:pPr>
+      <w:r>
+        <w:t>The main window, panel by panel</w:t>
+      </w:r>
+    </w:p>
+    <w:p>
+      <w:pPr>
+        <w:pStyle w:val="Heading2"/>
+      </w:pPr>
+      <w:r>
+        <w:t>Input Mode</w:t>
+      </w:r>
+    </w:p>
+    <w:p>
+      <w:pPr>
+        <w:pStyle w:val="ListBullet"/>
+      </w:pPr>
+      <w:r>
+        <w:rPr>
+          <w:b/>
+        </w:rPr>
+        <w:t>File Mode</w:t>
+      </w:r>
+      <w:r>
+        <w:t xml:space="preserve"> (Ctrl+1) — decode a saved </w:t>
+      </w:r>
+      <w:r>
+        <w:rPr>
+          <w:rFonts w:ascii="Consolas" w:hAnsi="Consolas"/>
+          <w:color w:val="C7254E"/>
+        </w:rPr>
+        <w:t>.pcap</w:t>
+      </w:r>
+      <w:r>
+        <w:t>/</w:t>
+      </w:r>
+      <w:r>
+        <w:rPr>
+          <w:rFonts w:ascii="Consolas" w:hAnsi="Consolas"/>
+          <w:color w:val="C7254E"/>
+        </w:rPr>
+        <w:t>.pcapng</w:t>
+      </w:r>
+      <w:r>
+        <w:t xml:space="preserve"> capture.</w:t>
+      </w:r>
+    </w:p>
+    <w:p>
+      <w:pPr>
+        <w:pStyle w:val="ListBullet"/>
+      </w:pPr>
+      <w:r>
+        <w:rPr>
+          <w:b/>
+        </w:rPr>
+        <w:t>Live Mode</w:t>
+      </w:r>
+      <w:r>
+        <w:t xml:space="preserve"> (Ctrl+2) — receive data live over the network and decode it as it arrives, writing per-message Excel files to a chosen folder.</w:t>
+      </w:r>
+    </w:p>
+    <w:p>
+      <w:pPr>
+        <w:pStyle w:val="ListBullet"/>
+      </w:pPr>
       <w:r>
         <w:rPr>
           <w:b/>
@@ -683,54 +816,118 @@
         <w:t>Import ICD…</w:t>
       </w:r>
       <w:r>
-        <w:t xml:space="preserve"> to generate them from a Word document.</w:t>
+        <w:t xml:space="preserve"> — build message/field definitions from a Word </w:t>
+      </w:r>
+      <w:r>
+        <w:rPr>
+          <w:rFonts w:ascii="Consolas" w:hAnsi="Consolas"/>
+          <w:color w:val="C7254E"/>
+        </w:rPr>
+        <w:t>.docx</w:t>
+      </w:r>
+      <w:r>
+        <w:t xml:space="preserve"> ICD (see *Import from a Word ICD*).</w:t>
       </w:r>
     </w:p>
     <w:p>
-      <w:r>
-        <w:t xml:space="preserve">4. </w:t>
-      </w:r>
-      <w:r>
-        <w:t xml:space="preserve">Press </w:t>
+      <w:pPr>
+        <w:pStyle w:val="Heading2"/>
+      </w:pPr>
+      <w:r>
+        <w:t>Input</w:t>
+      </w:r>
+    </w:p>
+    <w:p>
+      <w:r>
+        <w:t xml:space="preserve">*File Mode:* </w:t>
       </w:r>
       <w:r>
         <w:rPr>
           <w:b/>
         </w:rPr>
-        <w:t>Start</w:t>
-      </w:r>
-      <w:r>
-        <w:t xml:space="preserve"> (F5). The </w:t>
+        <w:t>Browse</w:t>
+      </w:r>
+      <w:r>
+        <w:t xml:space="preserve"> to the capture file. *Live Mode:* all transport settings now live in one place — press </w:t>
       </w:r>
       <w:r>
         <w:rPr>
           <w:b/>
         </w:rPr>
-        <w:t>Output Preview</w:t>
-      </w:r>
-      <w:r>
-        <w:t xml:space="preserve"> fills in and an Excel file is written to your </w:t>
+        <w:t>Configure Connections…</w:t>
+      </w:r>
+      <w:r>
+        <w:t xml:space="preserve"> to define your connection(s). The main window itself shows only the </w:t>
       </w:r>
       <w:r>
         <w:rPr>
           <w:b/>
         </w:rPr>
-        <w:t>Output Files</w:t>
-      </w:r>
-      <w:r>
-        <w:t xml:space="preserve"> folder.</w:t>
+        <w:t>Configure Connections…</w:t>
+      </w:r>
+      <w:r>
+        <w:t xml:space="preserve"> button, the </w:t>
+      </w:r>
+      <w:r>
+        <w:rPr>
+          <w:b/>
+        </w:rPr>
+        <w:t>Configure Messages</w:t>
+      </w:r>
+      <w:r>
+        <w:t xml:space="preserve"> button, </w:t>
+      </w:r>
+      <w:r>
+        <w:rPr>
+          <w:b/>
+        </w:rPr>
+        <w:t>Start/Stop Live</w:t>
+      </w:r>
+      <w:r>
+        <w:t xml:space="preserve">, and a live </w:t>
+      </w:r>
+      <w:r>
+        <w:rPr>
+          <w:b/>
+        </w:rPr>
+        <w:t>status</w:t>
+      </w:r>
+      <w:r>
+        <w:t xml:space="preserve"> grid (Status, Packets received, </w:t>
+      </w:r>
+      <w:r>
+        <w:rPr>
+          <w:b/>
+        </w:rPr>
+        <w:t>Packets matched</w:t>
+      </w:r>
+      <w:r>
+        <w:t xml:space="preserve">, Rows written, Short packets, Last error). You must define </w:t>
+      </w:r>
+      <w:r>
+        <w:rPr>
+          <w:b/>
+        </w:rPr>
+        <w:t>at least one connection</w:t>
+      </w:r>
+      <w:r>
+        <w:t xml:space="preserve"> before </w:t>
+      </w:r>
+      <w:r>
+        <w:rPr>
+          <w:b/>
+        </w:rPr>
+        <w:t>Start Live</w:t>
+      </w:r>
+      <w:r>
+        <w:t>.</w:t>
       </w:r>
     </w:p>
     <w:p>
       <w:r>
-        <w:t>After importing the sample ICD, the main window shows the configured messages ready to decode:</w:t>
-      </w:r>
-    </w:p>
-    <w:p>
-      <w:r>
         <w:drawing>
           <wp:inline xmlns:a="http://schemas.openxmlformats.org/drawingml/2006/main" xmlns:pic="http://schemas.openxmlformats.org/drawingml/2006/picture">
-            <wp:extent cx="5760720" cy="6618798"/>
+            <wp:extent cx="5760720" cy="3263169"/>
             <wp:docPr id="4" name="Picture 4"/>
             <wp:cNvGraphicFramePr>
               <a:graphicFrameLocks noChangeAspect="1"/>
@@ -739,11 +936,644 @@
               <a:graphicData uri="http://schemas.openxmlformats.org/drawingml/2006/picture">
                 <pic:pic>
                   <pic:nvPicPr>
-                    <pic:cNvPr id="0" name="main-configured.png"/>
+                    <pic:cNvPr id="0" name="main-live.png"/>
                     <pic:cNvPicPr/>
                   </pic:nvPicPr>
                   <pic:blipFill>
                     <a:blip r:embed="rId12"/>
+                    <a:stretch>
+                      <a:fillRect/>
+                    </a:stretch>
+                  </pic:blipFill>
+                  <pic:spPr>
+                    <a:xfrm>
+                      <a:off x="0" y="0"/>
+                      <a:ext cx="5760720" cy="3263169"/>
+                    </a:xfrm>
+                    <a:prstGeom prst="rect"/>
+                  </pic:spPr>
+                </pic:pic>
+              </a:graphicData>
+            </a:graphic>
+          </wp:inline>
+        </w:drawing>
+      </w:r>
+    </w:p>
+    <w:p>
+      <w:r>
+        <w:rPr>
+          <w:i/>
+          <w:color w:val="666666"/>
+          <w:sz w:val="18"/>
+        </w:rPr>
+        <w:t>Live Mode — Configure Connections plus the live status / packet-match grid</w:t>
+      </w:r>
+    </w:p>
+    <w:p>
+      <w:pPr>
+        <w:pStyle w:val="Heading2"/>
+      </w:pPr>
+      <w:r>
+        <w:t>Connections (Live Mode)</w:t>
+      </w:r>
+    </w:p>
+    <w:p>
+      <w:r>
+        <w:rPr>
+          <w:b/>
+        </w:rPr>
+        <w:t>Configure Connections…</w:t>
+      </w:r>
+      <w:r>
+        <w:t xml:space="preserve"> opens a manager where you add, edit or remove receive connections. Each connection picks a network </w:t>
+      </w:r>
+      <w:r>
+        <w:rPr>
+          <w:b/>
+        </w:rPr>
+        <w:t>adapter</w:t>
+      </w:r>
+      <w:r>
+        <w:t xml:space="preserve"> (chosen by number from the list, which always includes *Any adapter* and *Loopback*) and a </w:t>
+      </w:r>
+      <w:r>
+        <w:rPr>
+          <w:b/>
+        </w:rPr>
+        <w:t>port</w:t>
+      </w:r>
+      <w:r>
+        <w:t xml:space="preserve"> — for UDP you never type an IP address, just the adapter and port. TCP connections add a Listen/Connect role. The reader binds a separate receiver per connection on </w:t>
+      </w:r>
+      <w:r>
+        <w:rPr>
+          <w:b/>
+        </w:rPr>
+        <w:t>Start Live</w:t>
+      </w:r>
+      <w:r>
+        <w:t xml:space="preserve"> and decodes each message </w:t>
+      </w:r>
+      <w:r>
+        <w:rPr>
+          <w:b/>
+        </w:rPr>
+        <w:t>only</w:t>
+      </w:r>
+      <w:r>
+        <w:t xml:space="preserve"> against the connection it is bound to, so traffic from different adapters/ports never gets mixed. (Transport, port and adapter are configured here only — there is no separate Transport/Port row in the main window.)</w:t>
+      </w:r>
+    </w:p>
+    <w:p>
+      <w:r>
+        <w:drawing>
+          <wp:inline xmlns:a="http://schemas.openxmlformats.org/drawingml/2006/main" xmlns:pic="http://schemas.openxmlformats.org/drawingml/2006/picture">
+            <wp:extent cx="5760720" cy="3333584"/>
+            <wp:docPr id="5" name="Picture 5"/>
+            <wp:cNvGraphicFramePr>
+              <a:graphicFrameLocks noChangeAspect="1"/>
+            </wp:cNvGraphicFramePr>
+            <a:graphic>
+              <a:graphicData uri="http://schemas.openxmlformats.org/drawingml/2006/picture">
+                <pic:pic>
+                  <pic:nvPicPr>
+                    <pic:cNvPr id="0" name="connections.png"/>
+                    <pic:cNvPicPr/>
+                  </pic:nvPicPr>
+                  <pic:blipFill>
+                    <a:blip r:embed="rId13"/>
+                    <a:stretch>
+                      <a:fillRect/>
+                    </a:stretch>
+                  </pic:blipFill>
+                  <pic:spPr>
+                    <a:xfrm>
+                      <a:off x="0" y="0"/>
+                      <a:ext cx="5760720" cy="3333584"/>
+                    </a:xfrm>
+                    <a:prstGeom prst="rect"/>
+                  </pic:spPr>
+                </pic:pic>
+              </a:graphicData>
+            </a:graphic>
+          </wp:inline>
+        </w:drawing>
+      </w:r>
+    </w:p>
+    <w:p>
+      <w:r>
+        <w:rPr>
+          <w:i/>
+          <w:color w:val="666666"/>
+          <w:sz w:val="18"/>
+        </w:rPr>
+        <w:t>Configure Connections — bind each receiver to one adapter + port</w:t>
+      </w:r>
+    </w:p>
+    <w:p>
+      <w:pPr>
+        <w:pStyle w:val="Heading2"/>
+      </w:pPr>
+      <w:r>
+        <w:t>Message Definitions (File Mode)</w:t>
+      </w:r>
+    </w:p>
+    <w:p>
+      <w:r>
+        <w:t xml:space="preserve">File mode uses a </w:t>
+      </w:r>
+      <w:r>
+        <w:rPr>
+          <w:b/>
+        </w:rPr>
+        <w:t>single editable list of messages</w:t>
+      </w:r>
+      <w:r>
+        <w:t xml:space="preserve"> — there is no separate "Message Filters" section any more. Each row is one message with its </w:t>
+      </w:r>
+      <w:r>
+        <w:rPr>
+          <w:b/>
+        </w:rPr>
+        <w:t>own</w:t>
+      </w:r>
+      <w:r>
+        <w:t xml:space="preserve"> routing key: </w:t>
+      </w:r>
+      <w:r>
+        <w:rPr>
+          <w:b/>
+        </w:rPr>
+        <w:t>Message Name</w:t>
+      </w:r>
+      <w:r>
+        <w:t xml:space="preserve">, </w:t>
+      </w:r>
+      <w:r>
+        <w:rPr>
+          <w:b/>
+        </w:rPr>
+        <w:t>UDP Port</w:t>
+      </w:r>
+      <w:r>
+        <w:t xml:space="preserve">, </w:t>
+      </w:r>
+      <w:r>
+        <w:rPr>
+          <w:b/>
+        </w:rPr>
+        <w:t>Payload Length</w:t>
+      </w:r>
+      <w:r>
+        <w:t xml:space="preserve">, an optional </w:t>
+      </w:r>
+      <w:r>
+        <w:rPr>
+          <w:b/>
+        </w:rPr>
+        <w:t>Header</w:t>
+      </w:r>
+      <w:r>
+        <w:t xml:space="preserve"> (hex signature to tell apart same-length messages on the same port), its </w:t>
+      </w:r>
+      <w:r>
+        <w:rPr>
+          <w:b/>
+        </w:rPr>
+        <w:t>Fields</w:t>
+      </w:r>
+      <w:r>
+        <w:t xml:space="preserve">, and a </w:t>
+      </w:r>
+      <w:r>
+        <w:rPr>
+          <w:b/>
+        </w:rPr>
+        <w:t>Configure Fields</w:t>
+      </w:r>
+      <w:r>
+        <w:t xml:space="preserve"> button. The buttons below the table are </w:t>
+      </w:r>
+      <w:r>
+        <w:rPr>
+          <w:b/>
+        </w:rPr>
+        <w:t>Add Message</w:t>
+      </w:r>
+      <w:r>
+        <w:t xml:space="preserve">, </w:t>
+      </w:r>
+      <w:r>
+        <w:rPr>
+          <w:b/>
+        </w:rPr>
+        <w:t>Edit</w:t>
+      </w:r>
+      <w:r>
+        <w:t xml:space="preserve">, </w:t>
+      </w:r>
+      <w:r>
+        <w:rPr>
+          <w:b/>
+        </w:rPr>
+        <w:t>Remove</w:t>
+      </w:r>
+      <w:r>
+        <w:t xml:space="preserve">, </w:t>
+      </w:r>
+      <w:r>
+        <w:rPr>
+          <w:b/>
+        </w:rPr>
+        <w:t>Import JSON…</w:t>
+      </w:r>
+      <w:r>
+        <w:t xml:space="preserve"> and </w:t>
+      </w:r>
+      <w:r>
+        <w:rPr>
+          <w:b/>
+        </w:rPr>
+        <w:t>Export JSON…</w:t>
+      </w:r>
+      <w:r>
+        <w:t xml:space="preserve">, plus the </w:t>
+      </w:r>
+      <w:r>
+        <w:rPr>
+          <w:b/>
+        </w:rPr>
+        <w:t>Verify all configured messages before export</w:t>
+      </w:r>
+      <w:r>
+        <w:t xml:space="preserve"> checkbox.</w:t>
+      </w:r>
+    </w:p>
+    <w:p>
+      <w:r>
+        <w:drawing>
+          <wp:inline xmlns:a="http://schemas.openxmlformats.org/drawingml/2006/main" xmlns:pic="http://schemas.openxmlformats.org/drawingml/2006/picture">
+            <wp:extent cx="5760720" cy="3263169"/>
+            <wp:docPr id="6" name="Picture 6"/>
+            <wp:cNvGraphicFramePr>
+              <a:graphicFrameLocks noChangeAspect="1"/>
+            </wp:cNvGraphicFramePr>
+            <a:graphic>
+              <a:graphicData uri="http://schemas.openxmlformats.org/drawingml/2006/picture">
+                <pic:pic>
+                  <pic:nvPicPr>
+                    <pic:cNvPr id="0" name="main-light.png"/>
+                    <pic:cNvPicPr/>
+                  </pic:nvPicPr>
+                  <pic:blipFill>
+                    <a:blip r:embed="rId10"/>
+                    <a:stretch>
+                      <a:fillRect/>
+                    </a:stretch>
+                  </pic:blipFill>
+                  <pic:spPr>
+                    <a:xfrm>
+                      <a:off x="0" y="0"/>
+                      <a:ext cx="5760720" cy="3263169"/>
+                    </a:xfrm>
+                    <a:prstGeom prst="rect"/>
+                  </pic:spPr>
+                </pic:pic>
+              </a:graphicData>
+            </a:graphic>
+          </wp:inline>
+        </w:drawing>
+      </w:r>
+    </w:p>
+    <w:p>
+      <w:r>
+        <w:rPr>
+          <w:i/>
+          <w:color w:val="666666"/>
+          <w:sz w:val="18"/>
+        </w:rPr>
+        <w:t>Message Definitions — one editable list; each message carries its own port, length and header</w:t>
+      </w:r>
+    </w:p>
+    <w:p>
+      <w:r>
+        <w:rPr>
+          <w:b/>
+        </w:rPr>
+        <w:t>Add Message</w:t>
+      </w:r>
+      <w:r>
+        <w:t xml:space="preserve"> / </w:t>
+      </w:r>
+      <w:r>
+        <w:rPr>
+          <w:b/>
+        </w:rPr>
+        <w:t>Edit</w:t>
+      </w:r>
+      <w:r>
+        <w:t xml:space="preserve"> open the </w:t>
+      </w:r>
+      <w:r>
+        <w:rPr>
+          <w:b/>
+        </w:rPr>
+        <w:t>Message Definition</w:t>
+      </w:r>
+      <w:r>
+        <w:t xml:space="preserve"> dialog, where you set the name, </w:t>
+      </w:r>
+      <w:r>
+        <w:rPr>
+          <w:b/>
+        </w:rPr>
+        <w:t>UDP Port</w:t>
+      </w:r>
+      <w:r>
+        <w:t>, payload length, optional header and data format (HEX / NMEA):</w:t>
+      </w:r>
+    </w:p>
+    <w:p>
+      <w:r>
+        <w:drawing>
+          <wp:inline xmlns:a="http://schemas.openxmlformats.org/drawingml/2006/main" xmlns:pic="http://schemas.openxmlformats.org/drawingml/2006/picture">
+            <wp:extent cx="4972050" cy="3638551"/>
+            <wp:docPr id="7" name="Picture 7"/>
+            <wp:cNvGraphicFramePr>
+              <a:graphicFrameLocks noChangeAspect="1"/>
+            </wp:cNvGraphicFramePr>
+            <a:graphic>
+              <a:graphicData uri="http://schemas.openxmlformats.org/drawingml/2006/picture">
+                <pic:pic>
+                  <pic:nvPicPr>
+                    <pic:cNvPr id="0" name="message-def.png"/>
+                    <pic:cNvPicPr/>
+                  </pic:nvPicPr>
+                  <pic:blipFill>
+                    <a:blip r:embed="rId14"/>
+                    <a:stretch>
+                      <a:fillRect/>
+                    </a:stretch>
+                  </pic:blipFill>
+                  <pic:spPr>
+                    <a:xfrm>
+                      <a:off x="0" y="0"/>
+                      <a:ext cx="4972050" cy="3638551"/>
+                    </a:xfrm>
+                    <a:prstGeom prst="rect"/>
+                  </pic:spPr>
+                </pic:pic>
+              </a:graphicData>
+            </a:graphic>
+          </wp:inline>
+        </w:drawing>
+      </w:r>
+    </w:p>
+    <w:p>
+      <w:r>
+        <w:rPr>
+          <w:i/>
+          <w:color w:val="666666"/>
+          <w:sz w:val="18"/>
+        </w:rPr>
+        <w:t>Editing a message definition — name, UDP port, length, optional header, format</w:t>
+      </w:r>
+    </w:p>
+    <w:p>
+      <w:r>
+        <w:rPr>
+          <w:b/>
+        </w:rPr>
+        <w:t>Configure Fields</w:t>
+      </w:r>
+      <w:r>
+        <w:t xml:space="preserve"> opens the field editor (name, 1-based byte offset, data type, length, resolution / resolution expression). The field table is </w:t>
+      </w:r>
+      <w:r>
+        <w:rPr>
+          <w:b/>
+        </w:rPr>
+        <w:t>fully editable</w:t>
+      </w:r>
+      <w:r>
+        <w:t xml:space="preserve">: edit any cell inline, </w:t>
+      </w:r>
+      <w:r>
+        <w:rPr>
+          <w:b/>
+        </w:rPr>
+        <w:t>multi-select</w:t>
+      </w:r>
+      <w:r>
+        <w:t xml:space="preserve"> rows (Ctrl/Shift-click), and </w:t>
+      </w:r>
+      <w:r>
+        <w:rPr>
+          <w:b/>
+        </w:rPr>
+        <w:t>drag a row to reorder</w:t>
+      </w:r>
+      <w:r>
+        <w:t xml:space="preserve"> it (or use </w:t>
+      </w:r>
+      <w:r>
+        <w:rPr>
+          <w:b/>
+        </w:rPr>
+        <w:t>Alt+Up / Alt+Down</w:t>
+      </w:r>
+      <w:r>
+        <w:t xml:space="preserve">) — decoders move with the row. An </w:t>
+      </w:r>
+      <w:r>
+        <w:rPr>
+          <w:b/>
+        </w:rPr>
+        <w:t>Offsets in</w:t>
+      </w:r>
+      <w:r>
+        <w:t xml:space="preserve"> selector lets you switch between </w:t>
+      </w:r>
+      <w:r>
+        <w:rPr>
+          <w:b/>
+        </w:rPr>
+        <w:t>Bytes</w:t>
+      </w:r>
+      <w:r>
+        <w:t xml:space="preserve"> and </w:t>
+      </w:r>
+      <w:r>
+        <w:rPr>
+          <w:b/>
+        </w:rPr>
+        <w:t>Words</w:t>
+      </w:r>
+      <w:r>
+        <w:t xml:space="preserve"> (1 word = 2 bytes) for display; field offsets are always stored in bytes internally. Fields can carry </w:t>
+      </w:r>
+      <w:r>
+        <w:rPr>
+          <w:b/>
+        </w:rPr>
+        <w:t>bitfield decoders</w:t>
+      </w:r>
+      <w:r>
+        <w:t xml:space="preserve"> and </w:t>
+      </w:r>
+      <w:r>
+        <w:rPr>
+          <w:b/>
+        </w:rPr>
+        <w:t>conditional bitfield decoders</w:t>
+      </w:r>
+      <w:r>
+        <w:t xml:space="preserve"> that expand a byte/word into named bit meanings. Tick </w:t>
+      </w:r>
+      <w:r>
+        <w:rPr>
+          <w:b/>
+        </w:rPr>
+        <w:t>Verify all configured messages before export</w:t>
+      </w:r>
+      <w:r>
+        <w:t xml:space="preserve"> to validate everything first.</w:t>
+      </w:r>
+    </w:p>
+    <w:p>
+      <w:r>
+        <w:drawing>
+          <wp:inline xmlns:a="http://schemas.openxmlformats.org/drawingml/2006/main" xmlns:pic="http://schemas.openxmlformats.org/drawingml/2006/picture">
+            <wp:extent cx="5760720" cy="2636113"/>
+            <wp:docPr id="8" name="Picture 8"/>
+            <wp:cNvGraphicFramePr>
+              <a:graphicFrameLocks noChangeAspect="1"/>
+            </wp:cNvGraphicFramePr>
+            <a:graphic>
+              <a:graphicData uri="http://schemas.openxmlformats.org/drawingml/2006/picture">
+                <pic:pic>
+                  <pic:nvPicPr>
+                    <pic:cNvPr id="0" name="field-config.png"/>
+                    <pic:cNvPicPr/>
+                  </pic:nvPicPr>
+                  <pic:blipFill>
+                    <a:blip r:embed="rId15"/>
+                    <a:stretch>
+                      <a:fillRect/>
+                    </a:stretch>
+                  </pic:blipFill>
+                  <pic:spPr>
+                    <a:xfrm>
+                      <a:off x="0" y="0"/>
+                      <a:ext cx="5760720" cy="2636113"/>
+                    </a:xfrm>
+                    <a:prstGeom prst="rect"/>
+                  </pic:spPr>
+                </pic:pic>
+              </a:graphicData>
+            </a:graphic>
+          </wp:inline>
+        </w:drawing>
+      </w:r>
+    </w:p>
+    <w:p>
+      <w:r>
+        <w:rPr>
+          <w:i/>
+          <w:color w:val="666666"/>
+          <w:sz w:val="18"/>
+        </w:rPr>
+        <w:t>Configure Fields — editable, drag-reorderable field table with JSON / Excel menus</w:t>
+      </w:r>
+    </w:p>
+    <w:p>
+      <w:r>
+        <w:t>There is no length cap on numeric fields — fields wider than 8 bytes are decoded to exact decimal values (or resolution-scaled doubles).</w:t>
+      </w:r>
+    </w:p>
+    <w:p>
+      <w:pPr>
+        <w:pStyle w:val="Heading2"/>
+      </w:pPr>
+      <w:r>
+        <w:t>Start and Output</w:t>
+      </w:r>
+    </w:p>
+    <w:p>
+      <w:r>
+        <w:rPr>
+          <w:b/>
+        </w:rPr>
+        <w:t>Start</w:t>
+      </w:r>
+      <w:r>
+        <w:t xml:space="preserve"> (F5) parses the input, applies the filters, decodes each message's fields and writes the output as </w:t>
+      </w:r>
+      <w:r>
+        <w:rPr>
+          <w:b/>
+        </w:rPr>
+        <w:t>Excel</w:t>
+      </w:r>
+      <w:r>
+        <w:t xml:space="preserve"> (</w:t>
+      </w:r>
+      <w:r>
+        <w:rPr>
+          <w:rFonts w:ascii="Consolas" w:hAnsi="Consolas"/>
+          <w:color w:val="C7254E"/>
+        </w:rPr>
+        <w:t>.xlsx</w:t>
+      </w:r>
+      <w:r>
+        <w:t xml:space="preserve">, one sheet/file per message). Every export dialog opens in your </w:t>
+      </w:r>
+      <w:r>
+        <w:rPr>
+          <w:b/>
+        </w:rPr>
+        <w:t>Documents → UniversalDataSuite → Output Files</w:t>
+      </w:r>
+      <w:r>
+        <w:t xml:space="preserve"> folder by default (you can still browse elsewhere). The </w:t>
+      </w:r>
+      <w:r>
+        <w:rPr>
+          <w:b/>
+        </w:rPr>
+        <w:t>Output Preview</w:t>
+      </w:r>
+      <w:r>
+        <w:t xml:space="preserve"> shows a sample of the decoded rows. In Live Mode, </w:t>
+      </w:r>
+      <w:r>
+        <w:rPr>
+          <w:b/>
+        </w:rPr>
+        <w:t>Stop</w:t>
+      </w:r>
+      <w:r>
+        <w:t xml:space="preserve"> (Shift+F5) ends the capture and writes the per-message Excel files.</w:t>
+      </w:r>
+    </w:p>
+    <w:p>
+      <w:r>
+        <w:drawing>
+          <wp:inline xmlns:a="http://schemas.openxmlformats.org/drawingml/2006/main" xmlns:pic="http://schemas.openxmlformats.org/drawingml/2006/picture">
+            <wp:extent cx="5760720" cy="6618798"/>
+            <wp:docPr id="9" name="Picture 9"/>
+            <wp:cNvGraphicFramePr>
+              <a:graphicFrameLocks noChangeAspect="1"/>
+            </wp:cNvGraphicFramePr>
+            <a:graphic>
+              <a:graphicData uri="http://schemas.openxmlformats.org/drawingml/2006/picture">
+                <pic:pic>
+                  <pic:nvPicPr>
+                    <pic:cNvPr id="0" name="output-preview.png"/>
+                    <pic:cNvPicPr/>
+                  </pic:nvPicPr>
+                  <pic:blipFill>
+                    <a:blip r:embed="rId16"/>
                     <a:stretch>
                       <a:fillRect/>
                     </a:stretch>
@@ -769,7 +1599,7 @@
           <w:color w:val="666666"/>
           <w:sz w:val="18"/>
         </w:rPr>
-        <w:t>Main window with two messages configured from an ICD</w:t>
+        <w:t>Output Preview filled with decoded rows after a successful export</w:t>
       </w:r>
     </w:p>
     <w:p>
@@ -784,7 +1614,7 @@
         <w:pStyle w:val="Heading1"/>
       </w:pPr>
       <w:r>
-        <w:t>The main window, panel by panel</w:t>
+        <w:t>Common functions</w:t>
       </w:r>
     </w:p>
     <w:p>
@@ -792,13 +1622,13 @@
         <w:pStyle w:val="Heading2"/>
       </w:pPr>
       <w:r>
-        <w:t>Input Mode</w:t>
+        <w:t>Decode a capture file to Excel</w:t>
       </w:r>
     </w:p>
     <w:p>
-      <w:pPr>
-        <w:pStyle w:val="ListBullet"/>
-      </w:pPr>
+      <w:r>
+        <w:t xml:space="preserve">1. </w:t>
+      </w:r>
       <w:r>
         <w:rPr>
           <w:b/>
@@ -806,7 +1636,16 @@
         <w:t>File Mode</w:t>
       </w:r>
       <w:r>
-        <w:t xml:space="preserve"> (Ctrl+1) — decode a saved </w:t>
+        <w:t xml:space="preserve"> (Ctrl+1) → </w:t>
+      </w:r>
+      <w:r>
+        <w:rPr>
+          <w:b/>
+        </w:rPr>
+        <w:t>Browse</w:t>
+      </w:r>
+      <w:r>
+        <w:t xml:space="preserve"> to the </w:t>
       </w:r>
       <w:r>
         <w:rPr>
@@ -826,27 +1665,49 @@
         <w:t>.pcapng</w:t>
       </w:r>
       <w:r>
-        <w:t xml:space="preserve"> capture.</w:t>
+        <w:t>.</w:t>
       </w:r>
     </w:p>
     <w:p>
-      <w:pPr>
-        <w:pStyle w:val="ListBullet"/>
-      </w:pPr>
+      <w:r>
+        <w:t xml:space="preserve">2. </w:t>
+      </w:r>
       <w:r>
         <w:rPr>
           <w:b/>
         </w:rPr>
-        <w:t>Live Mode</w:t>
-      </w:r>
-      <w:r>
-        <w:t xml:space="preserve"> (Ctrl+2) — receive data live over the network and decode it as it arrives, writing per-message Excel files to a chosen folder.</w:t>
-      </w:r>
-    </w:p>
-    <w:p>
-      <w:pPr>
-        <w:pStyle w:val="ListBullet"/>
-      </w:pPr>
+        <w:t>Add Message</w:t>
+      </w:r>
+      <w:r>
+        <w:t xml:space="preserve"> with its </w:t>
+      </w:r>
+      <w:r>
+        <w:rPr>
+          <w:b/>
+        </w:rPr>
+        <w:t>UDP Port</w:t>
+      </w:r>
+      <w:r>
+        <w:t xml:space="preserve"> (e.g. 5000) + </w:t>
+      </w:r>
+      <w:r>
+        <w:rPr>
+          <w:b/>
+        </w:rPr>
+        <w:t>Payload Length</w:t>
+      </w:r>
+      <w:r>
+        <w:t xml:space="preserve">, then </w:t>
+      </w:r>
+      <w:r>
+        <w:rPr>
+          <w:b/>
+        </w:rPr>
+        <w:t>Configure Fields</w:t>
+      </w:r>
+      <w:r>
+        <w:t xml:space="preserve"> (or </w:t>
+      </w:r>
       <w:r>
         <w:rPr>
           <w:b/>
@@ -854,17 +1715,40 @@
         <w:t>Import ICD…</w:t>
       </w:r>
       <w:r>
-        <w:t xml:space="preserve"> — build message/field definitions from a Word </w:t>
+        <w:t>). Packets are routed to a message by Port + Length (+ optional Header).</w:t>
+      </w:r>
+    </w:p>
+    <w:p>
+      <w:r>
+        <w:t xml:space="preserve">3. </w:t>
+      </w:r>
+      <w:r>
+        <w:rPr>
+          <w:b/>
+        </w:rPr>
+        <w:t>Start</w:t>
+      </w:r>
+      <w:r>
+        <w:t xml:space="preserve"> (F5). The decoded rows appear in the preview and an </w:t>
       </w:r>
       <w:r>
         <w:rPr>
           <w:rFonts w:ascii="Consolas" w:hAnsi="Consolas"/>
           <w:color w:val="C7254E"/>
         </w:rPr>
-        <w:t>.docx</w:t>
-      </w:r>
-      <w:r>
-        <w:t xml:space="preserve"> ICD (see *Import from a Word ICD*).</w:t>
+        <w:t>.xlsx</w:t>
+      </w:r>
+      <w:r>
+        <w:t xml:space="preserve"> is written to </w:t>
+      </w:r>
+      <w:r>
+        <w:rPr>
+          <w:b/>
+        </w:rPr>
+        <w:t>Output Files</w:t>
+      </w:r>
+      <w:r>
+        <w:t>.</w:t>
       </w:r>
     </w:p>
     <w:p>
@@ -872,21 +1756,21 @@
         <w:pStyle w:val="Heading2"/>
       </w:pPr>
       <w:r>
-        <w:t>Input</w:t>
+        <w:t>Decode a live UDP stream</w:t>
       </w:r>
     </w:p>
     <w:p>
       <w:r>
-        <w:t xml:space="preserve">*File Mode:* </w:t>
+        <w:t xml:space="preserve">1. </w:t>
       </w:r>
       <w:r>
         <w:rPr>
           <w:b/>
         </w:rPr>
-        <w:t>Browse</w:t>
-      </w:r>
-      <w:r>
-        <w:t xml:space="preserve"> to the capture file. *Live Mode:* all transport settings now live in one place — press </w:t>
+        <w:t>Live Mode</w:t>
+      </w:r>
+      <w:r>
+        <w:t xml:space="preserve"> (Ctrl+2) → </w:t>
       </w:r>
       <w:r>
         <w:rPr>
@@ -895,61 +1779,47 @@
         <w:t>Configure Connections…</w:t>
       </w:r>
       <w:r>
-        <w:t xml:space="preserve"> to define your connection(s). The main window itself shows only the </w:t>
+        <w:t xml:space="preserve"> → </w:t>
       </w:r>
       <w:r>
         <w:rPr>
           <w:b/>
         </w:rPr>
-        <w:t>Configure Connections…</w:t>
-      </w:r>
-      <w:r>
-        <w:t xml:space="preserve"> button, the </w:t>
+        <w:t>Add</w:t>
+      </w:r>
+      <w:r>
+        <w:t xml:space="preserve"> a UDP connection (adapter + </w:t>
       </w:r>
       <w:r>
         <w:rPr>
           <w:b/>
         </w:rPr>
-        <w:t>Configure Messages</w:t>
-      </w:r>
-      <w:r>
-        <w:t xml:space="preserve"> button, </w:t>
+        <w:t>port</w:t>
+      </w:r>
+      <w:r>
+        <w:t>).</w:t>
+      </w:r>
+    </w:p>
+    <w:p>
+      <w:r>
+        <w:t xml:space="preserve">2. </w:t>
+      </w:r>
+      <w:r>
+        <w:t xml:space="preserve">Define messages/fields and (optionally) per-message </w:t>
       </w:r>
       <w:r>
         <w:rPr>
           <w:b/>
         </w:rPr>
-        <w:t>Start/Stop Live</w:t>
-      </w:r>
-      <w:r>
-        <w:t xml:space="preserve">, and a live </w:t>
-      </w:r>
-      <w:r>
-        <w:rPr>
-          <w:b/>
-        </w:rPr>
-        <w:t>status</w:t>
-      </w:r>
-      <w:r>
-        <w:t xml:space="preserve"> grid (Status, Packets received, </w:t>
-      </w:r>
-      <w:r>
-        <w:rPr>
-          <w:b/>
-        </w:rPr>
-        <w:t>Packets matched</w:t>
-      </w:r>
-      <w:r>
-        <w:t xml:space="preserve">, Rows written, Short packets, Last error). You must define </w:t>
-      </w:r>
-      <w:r>
-        <w:rPr>
-          <w:b/>
-        </w:rPr>
-        <w:t>at least one connection</w:t>
-      </w:r>
-      <w:r>
-        <w:t xml:space="preserve"> before </w:t>
+        <w:t>length filters</w:t>
+      </w:r>
+      <w:r>
+        <w:t>.</w:t>
+      </w:r>
+    </w:p>
+    <w:p>
+      <w:r>
+        <w:t xml:space="preserve">3. </w:t>
       </w:r>
       <w:r>
         <w:rPr>
@@ -958,53 +1828,16 @@
         <w:t>Start Live</w:t>
       </w:r>
       <w:r>
-        <w:t>.</w:t>
-      </w:r>
-    </w:p>
-    <w:p>
-      <w:r>
-        <w:drawing>
-          <wp:inline xmlns:a="http://schemas.openxmlformats.org/drawingml/2006/main" xmlns:pic="http://schemas.openxmlformats.org/drawingml/2006/picture">
-            <wp:extent cx="5760720" cy="6618798"/>
-            <wp:docPr id="5" name="Picture 5"/>
-            <wp:cNvGraphicFramePr>
-              <a:graphicFrameLocks noChangeAspect="1"/>
-            </wp:cNvGraphicFramePr>
-            <a:graphic>
-              <a:graphicData uri="http://schemas.openxmlformats.org/drawingml/2006/picture">
-                <pic:pic>
-                  <pic:nvPicPr>
-                    <pic:cNvPr id="0" name="main-live.png"/>
-                    <pic:cNvPicPr/>
-                  </pic:nvPicPr>
-                  <pic:blipFill>
-                    <a:blip r:embed="rId13"/>
-                    <a:stretch>
-                      <a:fillRect/>
-                    </a:stretch>
-                  </pic:blipFill>
-                  <pic:spPr>
-                    <a:xfrm>
-                      <a:off x="0" y="0"/>
-                      <a:ext cx="5760720" cy="6618798"/>
-                    </a:xfrm>
-                    <a:prstGeom prst="rect"/>
-                  </pic:spPr>
-                </pic:pic>
-              </a:graphicData>
-            </a:graphic>
-          </wp:inline>
-        </w:drawing>
-      </w:r>
-    </w:p>
-    <w:p>
+        <w:t xml:space="preserve">, pick an output folder; one Excel file per message is written as datagrams arrive. </w:t>
+      </w:r>
       <w:r>
         <w:rPr>
-          <w:i/>
-          <w:color w:val="666666"/>
-          <w:sz w:val="18"/>
+          <w:b/>
         </w:rPr>
-        <w:t>Live Mode — Configure Connections plus the live status / packet-match grid</w:t>
+        <w:t>Stop</w:t>
+      </w:r>
+      <w:r>
+        <w:t xml:space="preserve"> when done.</w:t>
       </w:r>
     </w:p>
     <w:p>
@@ -1012,10 +1845,22 @@
         <w:pStyle w:val="Heading2"/>
       </w:pPr>
       <w:r>
-        <w:t>Connections (Live Mode)</w:t>
+        <w:t>Decode a live TCP stream</w:t>
       </w:r>
     </w:p>
     <w:p>
+      <w:r>
+        <w:t xml:space="preserve">1. </w:t>
+      </w:r>
+      <w:r>
+        <w:rPr>
+          <w:b/>
+        </w:rPr>
+        <w:t>Live Mode</w:t>
+      </w:r>
+      <w:r>
+        <w:t xml:space="preserve"> (Ctrl+2) → </w:t>
+      </w:r>
       <w:r>
         <w:rPr>
           <w:b/>
@@ -1023,25 +1868,41 @@
         <w:t>Configure Connections…</w:t>
       </w:r>
       <w:r>
-        <w:t xml:space="preserve"> opens a manager where you add, edit or remove receive connections. Each connection picks a network </w:t>
+        <w:t xml:space="preserve"> → </w:t>
       </w:r>
       <w:r>
         <w:rPr>
           <w:b/>
         </w:rPr>
-        <w:t>adapter</w:t>
-      </w:r>
-      <w:r>
-        <w:t xml:space="preserve"> (chosen by number from the list, which always includes *Any adapter* and *Loopback*) and a </w:t>
+        <w:t>Add</w:t>
+      </w:r>
+      <w:r>
+        <w:t xml:space="preserve"> a TCP connection.</w:t>
+      </w:r>
+    </w:p>
+    <w:p>
+      <w:r>
+        <w:t xml:space="preserve">2. </w:t>
+      </w:r>
+      <w:r>
+        <w:t xml:space="preserve">Choose a </w:t>
       </w:r>
       <w:r>
         <w:rPr>
           <w:b/>
         </w:rPr>
-        <w:t>port</w:t>
-      </w:r>
-      <w:r>
-        <w:t xml:space="preserve"> — for UDP you never type an IP address, just the adapter and port. TCP connections add a Listen/Connect role. The reader binds a separate receiver per connection on </w:t>
+        <w:t>Role</w:t>
+      </w:r>
+      <w:r>
+        <w:t>: *Listen* (server, accept incoming) or *Connect* (dial a remote host); set the port (and host for Connect). Framing follows the bound message's payload length.</w:t>
+      </w:r>
+    </w:p>
+    <w:p>
+      <w:r>
+        <w:t xml:space="preserve">3. </w:t>
+      </w:r>
+      <w:r>
+        <w:t xml:space="preserve">Define messages/fields → </w:t>
       </w:r>
       <w:r>
         <w:rPr>
@@ -1050,62 +1911,7 @@
         <w:t>Start Live</w:t>
       </w:r>
       <w:r>
-        <w:t xml:space="preserve"> and decodes each message </w:t>
-      </w:r>
-      <w:r>
-        <w:rPr>
-          <w:b/>
-        </w:rPr>
-        <w:t>only</w:t>
-      </w:r>
-      <w:r>
-        <w:t xml:space="preserve"> against the connection it is bound to, so traffic from different adapters/ports never gets mixed. (Transport, port and adapter are configured here only — there is no separate Transport/Port row in the main window.)</w:t>
-      </w:r>
-    </w:p>
-    <w:p>
-      <w:r>
-        <w:drawing>
-          <wp:inline xmlns:a="http://schemas.openxmlformats.org/drawingml/2006/main" xmlns:pic="http://schemas.openxmlformats.org/drawingml/2006/picture">
-            <wp:extent cx="5760720" cy="3333584"/>
-            <wp:docPr id="6" name="Picture 6"/>
-            <wp:cNvGraphicFramePr>
-              <a:graphicFrameLocks noChangeAspect="1"/>
-            </wp:cNvGraphicFramePr>
-            <a:graphic>
-              <a:graphicData uri="http://schemas.openxmlformats.org/drawingml/2006/picture">
-                <pic:pic>
-                  <pic:nvPicPr>
-                    <pic:cNvPr id="0" name="connections.png"/>
-                    <pic:cNvPicPr/>
-                  </pic:nvPicPr>
-                  <pic:blipFill>
-                    <a:blip r:embed="rId14"/>
-                    <a:stretch>
-                      <a:fillRect/>
-                    </a:stretch>
-                  </pic:blipFill>
-                  <pic:spPr>
-                    <a:xfrm>
-                      <a:off x="0" y="0"/>
-                      <a:ext cx="5760720" cy="3333584"/>
-                    </a:xfrm>
-                    <a:prstGeom prst="rect"/>
-                  </pic:spPr>
-                </pic:pic>
-              </a:graphicData>
-            </a:graphic>
-          </wp:inline>
-        </w:drawing>
-      </w:r>
-    </w:p>
-    <w:p>
-      <w:r>
-        <w:rPr>
-          <w:i/>
-          <w:color w:val="666666"/>
-          <w:sz w:val="18"/>
-        </w:rPr>
-        <w:t>Configure Connections — bind each receiver to one adapter + port</w:t>
+        <w:t>. TCP data is framed and decoded the same way as UDP.</w:t>
       </w:r>
     </w:p>
     <w:p>
@@ -1113,30 +1919,73 @@
         <w:pStyle w:val="Heading2"/>
       </w:pPr>
       <w:r>
-        <w:t>Message Filters</w:t>
+        <w:t>Receive from multiple sources at once (connections)</w:t>
       </w:r>
     </w:p>
     <w:p>
       <w:r>
-        <w:t xml:space="preserve">Select </w:t>
+        <w:t xml:space="preserve">1. </w:t>
       </w:r>
       <w:r>
         <w:rPr>
           <w:b/>
         </w:rPr>
-        <w:t>Port</w:t>
-      </w:r>
-      <w:r>
-        <w:t xml:space="preserve"> or </w:t>
+        <w:t>Live Mode</w:t>
+      </w:r>
+      <w:r>
+        <w:t xml:space="preserve"> (Ctrl+2) → </w:t>
       </w:r>
       <w:r>
         <w:rPr>
           <w:b/>
         </w:rPr>
-        <w:t>Header</w:t>
-      </w:r>
-      <w:r>
-        <w:t xml:space="preserve"> filtering and set the number of filters. Each filter row has a port and a </w:t>
+        <w:t>Configure Connections…</w:t>
+      </w:r>
+      <w:r>
+        <w:t xml:space="preserve"> → </w:t>
+      </w:r>
+      <w:r>
+        <w:rPr>
+          <w:b/>
+        </w:rPr>
+        <w:t>Add</w:t>
+      </w:r>
+      <w:r>
+        <w:t xml:space="preserve"> one connection per source.</w:t>
+      </w:r>
+    </w:p>
+    <w:p>
+      <w:r>
+        <w:t xml:space="preserve">2. </w:t>
+      </w:r>
+      <w:r>
+        <w:t xml:space="preserve">For each, pick the </w:t>
+      </w:r>
+      <w:r>
+        <w:rPr>
+          <w:b/>
+        </w:rPr>
+        <w:t>adapter</w:t>
+      </w:r>
+      <w:r>
+        <w:t xml:space="preserve"> (by number; *Any* and *Loopback* are always listed) and the </w:t>
+      </w:r>
+      <w:r>
+        <w:rPr>
+          <w:b/>
+        </w:rPr>
+        <w:t>port</w:t>
+      </w:r>
+      <w:r>
+        <w:t>; for UDP that is all — no IP address. For TCP also pick Listen or Connect.</w:t>
+      </w:r>
+    </w:p>
+    <w:p>
+      <w:r>
+        <w:t xml:space="preserve">3. </w:t>
+      </w:r>
+      <w:r>
+        <w:t xml:space="preserve">Press </w:t>
       </w:r>
       <w:r>
         <w:rPr>
@@ -1145,127 +1994,30 @@
         <w:t>Configure Messages</w:t>
       </w:r>
       <w:r>
-        <w:t xml:space="preserve"> button (route messages by payload length) with a live message count. Header filtering lets you tell apart same-length messages by a leading signature.</w:t>
-      </w:r>
-    </w:p>
-    <w:p>
-      <w:r>
-        <w:t xml:space="preserve">The </w:t>
+        <w:t xml:space="preserve">, and in the </w:t>
       </w:r>
       <w:r>
         <w:rPr>
           <w:b/>
         </w:rPr>
-        <w:t>Configure Messages</w:t>
-      </w:r>
-      <w:r>
-        <w:t xml:space="preserve"> dialog manages the message definitions on a port — add, edit, remove, and import/export them as JSON, plus reach each message's fields and compare options:</w:t>
+        <w:t>Connection</w:t>
+      </w:r>
+      <w:r>
+        <w:t xml:space="preserve"> column bind each message to the connection it should be decoded from (leave a message on *(any connection)* to accept it from all of them).</w:t>
       </w:r>
     </w:p>
     <w:p>
       <w:r>
-        <w:drawing>
-          <wp:inline xmlns:a="http://schemas.openxmlformats.org/drawingml/2006/main" xmlns:pic="http://schemas.openxmlformats.org/drawingml/2006/picture">
-            <wp:extent cx="5760720" cy="3464529"/>
-            <wp:docPr id="7" name="Picture 7"/>
-            <wp:cNvGraphicFramePr>
-              <a:graphicFrameLocks noChangeAspect="1"/>
-            </wp:cNvGraphicFramePr>
-            <a:graphic>
-              <a:graphicData uri="http://schemas.openxmlformats.org/drawingml/2006/picture">
-                <pic:pic>
-                  <pic:nvPicPr>
-                    <pic:cNvPr id="0" name="configure-messages.png"/>
-                    <pic:cNvPicPr/>
-                  </pic:nvPicPr>
-                  <pic:blipFill>
-                    <a:blip r:embed="rId15"/>
-                    <a:stretch>
-                      <a:fillRect/>
-                    </a:stretch>
-                  </pic:blipFill>
-                  <pic:spPr>
-                    <a:xfrm>
-                      <a:off x="0" y="0"/>
-                      <a:ext cx="5760720" cy="3464529"/>
-                    </a:xfrm>
-                    <a:prstGeom prst="rect"/>
-                  </pic:spPr>
-                </pic:pic>
-              </a:graphicData>
-            </a:graphic>
-          </wp:inline>
-        </w:drawing>
-      </w:r>
-    </w:p>
-    <w:p>
-      <w:r>
-        <w:rPr>
-          <w:i/>
-          <w:color w:val="666666"/>
-          <w:sz w:val="18"/>
-        </w:rPr>
-        <w:t>Configure Messages — message definitions for a port</w:t>
-      </w:r>
-    </w:p>
-    <w:p>
-      <w:r>
-        <w:t xml:space="preserve">Each message's identity (name, payload length, optional header signature, data format) is edited in the </w:t>
+        <w:t xml:space="preserve">4. </w:t>
       </w:r>
       <w:r>
         <w:rPr>
           <w:b/>
         </w:rPr>
-        <w:t>Message Definition</w:t>
-      </w:r>
-      <w:r>
-        <w:t xml:space="preserve"> dialog:</w:t>
-      </w:r>
-    </w:p>
-    <w:p>
-      <w:r>
-        <w:drawing>
-          <wp:inline xmlns:a="http://schemas.openxmlformats.org/drawingml/2006/main" xmlns:pic="http://schemas.openxmlformats.org/drawingml/2006/picture">
-            <wp:extent cx="4972050" cy="3638551"/>
-            <wp:docPr id="8" name="Picture 8"/>
-            <wp:cNvGraphicFramePr>
-              <a:graphicFrameLocks noChangeAspect="1"/>
-            </wp:cNvGraphicFramePr>
-            <a:graphic>
-              <a:graphicData uri="http://schemas.openxmlformats.org/drawingml/2006/picture">
-                <pic:pic>
-                  <pic:nvPicPr>
-                    <pic:cNvPr id="0" name="message-def.png"/>
-                    <pic:cNvPicPr/>
-                  </pic:nvPicPr>
-                  <pic:blipFill>
-                    <a:blip r:embed="rId16"/>
-                    <a:stretch>
-                      <a:fillRect/>
-                    </a:stretch>
-                  </pic:blipFill>
-                  <pic:spPr>
-                    <a:xfrm>
-                      <a:off x="0" y="0"/>
-                      <a:ext cx="4972050" cy="3638551"/>
-                    </a:xfrm>
-                    <a:prstGeom prst="rect"/>
-                  </pic:spPr>
-                </pic:pic>
-              </a:graphicData>
-            </a:graphic>
-          </wp:inline>
-        </w:drawing>
-      </w:r>
-    </w:p>
-    <w:p>
-      <w:r>
-        <w:rPr>
-          <w:i/>
-          <w:color w:val="666666"/>
-          <w:sz w:val="18"/>
-        </w:rPr>
-        <w:t>Editing a message definition</w:t>
+        <w:t>Start Live</w:t>
+      </w:r>
+      <w:r>
+        <w:t xml:space="preserve"> — one receiver runs per connection and each message is only matched on its connection, so two sources on different adapters/ports are kept completely separate.</w:t>
       </w:r>
     </w:p>
     <w:p>
@@ -1273,171 +2025,39 @@
         <w:pStyle w:val="Heading2"/>
       </w:pPr>
       <w:r>
-        <w:t>Configured Messages</w:t>
+        <w:t>Import/export messages while configuring (JSON)</w:t>
       </w:r>
     </w:p>
     <w:p>
       <w:r>
-        <w:t xml:space="preserve">The list of messages to decode. Each has a name, payload length, port and fields. In Live Mode, when connections are defined, a </w:t>
+        <w:t xml:space="preserve">Inside the </w:t>
       </w:r>
       <w:r>
         <w:rPr>
           <w:b/>
         </w:rPr>
-        <w:t>Connection</w:t>
-      </w:r>
-      <w:r>
-        <w:t xml:space="preserve"> column shows (and lets you set, via the Configure Messages dialog) which connection each message is decoded from. </w:t>
+        <w:t>Configure Messages</w:t>
+      </w:r>
+      <w:r>
+        <w:t xml:space="preserve"> dialog, </w:t>
       </w:r>
       <w:r>
         <w:rPr>
           <w:b/>
         </w:rPr>
-        <w:t>Configure Fields</w:t>
-      </w:r>
-      <w:r>
-        <w:t xml:space="preserve"> opens the field editor (name, 1-based byte offset, data type, length, resolution / resolution expression). The field table is </w:t>
+        <w:t>Import JSON…</w:t>
+      </w:r>
+      <w:r>
+        <w:t xml:space="preserve"> appends message definitions from a JSON file and </w:t>
       </w:r>
       <w:r>
         <w:rPr>
           <w:b/>
         </w:rPr>
-        <w:t>fully editable</w:t>
-      </w:r>
-      <w:r>
-        <w:t xml:space="preserve">: edit any cell inline, </w:t>
-      </w:r>
-      <w:r>
-        <w:rPr>
-          <w:b/>
-        </w:rPr>
-        <w:t>multi-select</w:t>
-      </w:r>
-      <w:r>
-        <w:t xml:space="preserve"> rows (Ctrl/Shift-click), and </w:t>
-      </w:r>
-      <w:r>
-        <w:rPr>
-          <w:b/>
-        </w:rPr>
-        <w:t>drag a row to reorder</w:t>
-      </w:r>
-      <w:r>
-        <w:t xml:space="preserve"> it (or use </w:t>
-      </w:r>
-      <w:r>
-        <w:rPr>
-          <w:b/>
-        </w:rPr>
-        <w:t>Alt+Up / Alt+Down</w:t>
-      </w:r>
-      <w:r>
-        <w:t xml:space="preserve">) — decoders move with the row. An </w:t>
-      </w:r>
-      <w:r>
-        <w:rPr>
-          <w:b/>
-        </w:rPr>
-        <w:t>Offsets in</w:t>
-      </w:r>
-      <w:r>
-        <w:t xml:space="preserve"> selector lets you switch between </w:t>
-      </w:r>
-      <w:r>
-        <w:rPr>
-          <w:b/>
-        </w:rPr>
-        <w:t>Bytes</w:t>
-      </w:r>
-      <w:r>
-        <w:t xml:space="preserve"> and </w:t>
-      </w:r>
-      <w:r>
-        <w:rPr>
-          <w:b/>
-        </w:rPr>
-        <w:t>Words</w:t>
-      </w:r>
-      <w:r>
-        <w:t xml:space="preserve"> (1 word = 2 bytes) for display; field offsets are always stored in bytes internally. Fields can carry </w:t>
-      </w:r>
-      <w:r>
-        <w:rPr>
-          <w:b/>
-        </w:rPr>
-        <w:t>bitfield decoders</w:t>
-      </w:r>
-      <w:r>
-        <w:t xml:space="preserve"> and </w:t>
-      </w:r>
-      <w:r>
-        <w:rPr>
-          <w:b/>
-        </w:rPr>
-        <w:t>conditional bitfield decoders</w:t>
-      </w:r>
-      <w:r>
-        <w:t xml:space="preserve"> that expand a byte/word into named bit meanings. Tick </w:t>
-      </w:r>
-      <w:r>
-        <w:rPr>
-          <w:b/>
-        </w:rPr>
-        <w:t>Verify all configured messages before export</w:t>
-      </w:r>
-      <w:r>
-        <w:t xml:space="preserve"> to validate everything first.</w:t>
-      </w:r>
-    </w:p>
-    <w:p>
-      <w:r>
-        <w:drawing>
-          <wp:inline xmlns:a="http://schemas.openxmlformats.org/drawingml/2006/main" xmlns:pic="http://schemas.openxmlformats.org/drawingml/2006/picture">
-            <wp:extent cx="5760720" cy="2636113"/>
-            <wp:docPr id="9" name="Picture 9"/>
-            <wp:cNvGraphicFramePr>
-              <a:graphicFrameLocks noChangeAspect="1"/>
-            </wp:cNvGraphicFramePr>
-            <a:graphic>
-              <a:graphicData uri="http://schemas.openxmlformats.org/drawingml/2006/picture">
-                <pic:pic>
-                  <pic:nvPicPr>
-                    <pic:cNvPr id="0" name="field-config.png"/>
-                    <pic:cNvPicPr/>
-                  </pic:nvPicPr>
-                  <pic:blipFill>
-                    <a:blip r:embed="rId17"/>
-                    <a:stretch>
-                      <a:fillRect/>
-                    </a:stretch>
-                  </pic:blipFill>
-                  <pic:spPr>
-                    <a:xfrm>
-                      <a:off x="0" y="0"/>
-                      <a:ext cx="5760720" cy="2636113"/>
-                    </a:xfrm>
-                    <a:prstGeom prst="rect"/>
-                  </pic:spPr>
-                </pic:pic>
-              </a:graphicData>
-            </a:graphic>
-          </wp:inline>
-        </w:drawing>
-      </w:r>
-    </w:p>
-    <w:p>
-      <w:r>
-        <w:rPr>
-          <w:i/>
-          <w:color w:val="666666"/>
-          <w:sz w:val="18"/>
-        </w:rPr>
-        <w:t>Configure Fields — editable, drag-reorderable field table with JSON / Excel menus</w:t>
-      </w:r>
-    </w:p>
-    <w:p>
-      <w:r>
-        <w:t>There is no length cap on numeric fields — fields wider than 8 bytes are decoded to exact decimal values (or resolution-scaled doubles).</w:t>
+        <w:t>Export JSON…</w:t>
+      </w:r>
+      <w:r>
+        <w:t xml:space="preserve"> writes the current list out — the same format the simulator and the File menu use.</w:t>
       </w:r>
     </w:p>
     <w:p>
@@ -1445,125 +2065,21 @@
         <w:pStyle w:val="Heading2"/>
       </w:pPr>
       <w:r>
-        <w:t>Start and Output</w:t>
+        <w:t>Import message/field definitions from a Word ICD</w:t>
       </w:r>
     </w:p>
     <w:p>
+      <w:r>
+        <w:t xml:space="preserve">See the dedicated </w:t>
+      </w:r>
       <w:r>
         <w:rPr>
           <w:b/>
         </w:rPr>
-        <w:t>Start</w:t>
-      </w:r>
-      <w:r>
-        <w:t xml:space="preserve"> (F5) parses the input, applies the filters, decodes each message's fields and writes the output as </w:t>
-      </w:r>
-      <w:r>
-        <w:rPr>
-          <w:b/>
-        </w:rPr>
-        <w:t>Excel</w:t>
-      </w:r>
-      <w:r>
-        <w:t xml:space="preserve"> (</w:t>
-      </w:r>
-      <w:r>
-        <w:rPr>
-          <w:rFonts w:ascii="Consolas" w:hAnsi="Consolas"/>
-          <w:color w:val="C7254E"/>
-        </w:rPr>
-        <w:t>.xlsx</w:t>
-      </w:r>
-      <w:r>
-        <w:t xml:space="preserve">, one sheet/file per message). Every export dialog opens in your </w:t>
-      </w:r>
-      <w:r>
-        <w:rPr>
-          <w:b/>
-        </w:rPr>
-        <w:t>Documents → UniversalDataSuite → Output Files</w:t>
-      </w:r>
-      <w:r>
-        <w:t xml:space="preserve"> folder by default (you can still browse elsewhere). The </w:t>
-      </w:r>
-      <w:r>
-        <w:rPr>
-          <w:b/>
-        </w:rPr>
-        <w:t>Output Preview</w:t>
-      </w:r>
-      <w:r>
-        <w:t xml:space="preserve"> shows a sample of the decoded rows. In Live Mode, </w:t>
-      </w:r>
-      <w:r>
-        <w:rPr>
-          <w:b/>
-        </w:rPr>
-        <w:t>Stop</w:t>
-      </w:r>
-      <w:r>
-        <w:t xml:space="preserve"> (Shift+F5) ends the capture and writes the per-message Excel files.</w:t>
-      </w:r>
-    </w:p>
-    <w:p>
-      <w:r>
-        <w:drawing>
-          <wp:inline xmlns:a="http://schemas.openxmlformats.org/drawingml/2006/main" xmlns:pic="http://schemas.openxmlformats.org/drawingml/2006/picture">
-            <wp:extent cx="5760720" cy="6618798"/>
-            <wp:docPr id="10" name="Picture 10"/>
-            <wp:cNvGraphicFramePr>
-              <a:graphicFrameLocks noChangeAspect="1"/>
-            </wp:cNvGraphicFramePr>
-            <a:graphic>
-              <a:graphicData uri="http://schemas.openxmlformats.org/drawingml/2006/picture">
-                <pic:pic>
-                  <pic:nvPicPr>
-                    <pic:cNvPr id="0" name="output-preview.png"/>
-                    <pic:cNvPicPr/>
-                  </pic:nvPicPr>
-                  <pic:blipFill>
-                    <a:blip r:embed="rId18"/>
-                    <a:stretch>
-                      <a:fillRect/>
-                    </a:stretch>
-                  </pic:blipFill>
-                  <pic:spPr>
-                    <a:xfrm>
-                      <a:off x="0" y="0"/>
-                      <a:ext cx="5760720" cy="6618798"/>
-                    </a:xfrm>
-                    <a:prstGeom prst="rect"/>
-                  </pic:spPr>
-                </pic:pic>
-              </a:graphicData>
-            </a:graphic>
-          </wp:inline>
-        </w:drawing>
-      </w:r>
-    </w:p>
-    <w:p>
-      <w:r>
-        <w:rPr>
-          <w:i/>
-          <w:color w:val="666666"/>
-          <w:sz w:val="18"/>
-        </w:rPr>
-        <w:t>Output Preview filled with decoded rows after a successful export</w:t>
-      </w:r>
-    </w:p>
-    <w:p>
-      <w:pPr>
-        <w:pBdr>
-          <w:bottom w:val="single" w:sz="6" w:space="1" w:color="BBBBBB"/>
-        </w:pBdr>
-      </w:pPr>
-    </w:p>
-    <w:p>
-      <w:pPr>
-        <w:pStyle w:val="Heading1"/>
-      </w:pPr>
-      <w:r>
-        <w:t>Common functions</w:t>
+        <w:t>Import from a Word ICD</w:t>
+      </w:r>
+      <w:r>
+        <w:t xml:space="preserve"> section below.</w:t>
       </w:r>
     </w:p>
     <w:p>
@@ -1571,447 +2087,6 @@
         <w:pStyle w:val="Heading2"/>
       </w:pPr>
       <w:r>
-        <w:t>Decode a capture file to Excel</w:t>
-      </w:r>
-    </w:p>
-    <w:p>
-      <w:r>
-        <w:t xml:space="preserve">1. </w:t>
-      </w:r>
-      <w:r>
-        <w:rPr>
-          <w:b/>
-        </w:rPr>
-        <w:t>File Mode</w:t>
-      </w:r>
-      <w:r>
-        <w:t xml:space="preserve"> (Ctrl+1) → </w:t>
-      </w:r>
-      <w:r>
-        <w:rPr>
-          <w:b/>
-        </w:rPr>
-        <w:t>Browse</w:t>
-      </w:r>
-      <w:r>
-        <w:t xml:space="preserve"> to the </w:t>
-      </w:r>
-      <w:r>
-        <w:rPr>
-          <w:rFonts w:ascii="Consolas" w:hAnsi="Consolas"/>
-          <w:color w:val="C7254E"/>
-        </w:rPr>
-        <w:t>.pcap</w:t>
-      </w:r>
-      <w:r>
-        <w:t>/</w:t>
-      </w:r>
-      <w:r>
-        <w:rPr>
-          <w:rFonts w:ascii="Consolas" w:hAnsi="Consolas"/>
-          <w:color w:val="C7254E"/>
-        </w:rPr>
-        <w:t>.pcapng</w:t>
-      </w:r>
-      <w:r>
-        <w:t>.</w:t>
-      </w:r>
-    </w:p>
-    <w:p>
-      <w:r>
-        <w:t xml:space="preserve">2. </w:t>
-      </w:r>
-      <w:r>
-        <w:t xml:space="preserve">Add a </w:t>
-      </w:r>
-      <w:r>
-        <w:rPr>
-          <w:b/>
-        </w:rPr>
-        <w:t>Port</w:t>
-      </w:r>
-      <w:r>
-        <w:t xml:space="preserve"> filter (e.g. 5000) and define the message + fields (or </w:t>
-      </w:r>
-      <w:r>
-        <w:rPr>
-          <w:b/>
-        </w:rPr>
-        <w:t>Import ICD…</w:t>
-      </w:r>
-      <w:r>
-        <w:t>).</w:t>
-      </w:r>
-    </w:p>
-    <w:p>
-      <w:r>
-        <w:t xml:space="preserve">3. </w:t>
-      </w:r>
-      <w:r>
-        <w:rPr>
-          <w:b/>
-        </w:rPr>
-        <w:t>Start</w:t>
-      </w:r>
-      <w:r>
-        <w:t xml:space="preserve"> (F5). The decoded rows appear in the preview and an </w:t>
-      </w:r>
-      <w:r>
-        <w:rPr>
-          <w:rFonts w:ascii="Consolas" w:hAnsi="Consolas"/>
-          <w:color w:val="C7254E"/>
-        </w:rPr>
-        <w:t>.xlsx</w:t>
-      </w:r>
-      <w:r>
-        <w:t xml:space="preserve"> is written to </w:t>
-      </w:r>
-      <w:r>
-        <w:rPr>
-          <w:b/>
-        </w:rPr>
-        <w:t>Output Files</w:t>
-      </w:r>
-      <w:r>
-        <w:t>.</w:t>
-      </w:r>
-    </w:p>
-    <w:p>
-      <w:pPr>
-        <w:pStyle w:val="Heading2"/>
-      </w:pPr>
-      <w:r>
-        <w:t>Decode a live UDP stream</w:t>
-      </w:r>
-    </w:p>
-    <w:p>
-      <w:r>
-        <w:t xml:space="preserve">1. </w:t>
-      </w:r>
-      <w:r>
-        <w:rPr>
-          <w:b/>
-        </w:rPr>
-        <w:t>Live Mode</w:t>
-      </w:r>
-      <w:r>
-        <w:t xml:space="preserve"> (Ctrl+2) → </w:t>
-      </w:r>
-      <w:r>
-        <w:rPr>
-          <w:b/>
-        </w:rPr>
-        <w:t>Configure Connections…</w:t>
-      </w:r>
-      <w:r>
-        <w:t xml:space="preserve"> → </w:t>
-      </w:r>
-      <w:r>
-        <w:rPr>
-          <w:b/>
-        </w:rPr>
-        <w:t>Add</w:t>
-      </w:r>
-      <w:r>
-        <w:t xml:space="preserve"> a UDP connection (adapter + </w:t>
-      </w:r>
-      <w:r>
-        <w:rPr>
-          <w:b/>
-        </w:rPr>
-        <w:t>port</w:t>
-      </w:r>
-      <w:r>
-        <w:t>).</w:t>
-      </w:r>
-    </w:p>
-    <w:p>
-      <w:r>
-        <w:t xml:space="preserve">2. </w:t>
-      </w:r>
-      <w:r>
-        <w:t xml:space="preserve">Define messages/fields and (optionally) per-message </w:t>
-      </w:r>
-      <w:r>
-        <w:rPr>
-          <w:b/>
-        </w:rPr>
-        <w:t>length filters</w:t>
-      </w:r>
-      <w:r>
-        <w:t>.</w:t>
-      </w:r>
-    </w:p>
-    <w:p>
-      <w:r>
-        <w:t xml:space="preserve">3. </w:t>
-      </w:r>
-      <w:r>
-        <w:rPr>
-          <w:b/>
-        </w:rPr>
-        <w:t>Start Live</w:t>
-      </w:r>
-      <w:r>
-        <w:t xml:space="preserve">, pick an output folder; one Excel file per message is written as datagrams arrive. </w:t>
-      </w:r>
-      <w:r>
-        <w:rPr>
-          <w:b/>
-        </w:rPr>
-        <w:t>Stop</w:t>
-      </w:r>
-      <w:r>
-        <w:t xml:space="preserve"> when done.</w:t>
-      </w:r>
-    </w:p>
-    <w:p>
-      <w:pPr>
-        <w:pStyle w:val="Heading2"/>
-      </w:pPr>
-      <w:r>
-        <w:t>Decode a live TCP stream</w:t>
-      </w:r>
-    </w:p>
-    <w:p>
-      <w:r>
-        <w:t xml:space="preserve">1. </w:t>
-      </w:r>
-      <w:r>
-        <w:rPr>
-          <w:b/>
-        </w:rPr>
-        <w:t>Live Mode</w:t>
-      </w:r>
-      <w:r>
-        <w:t xml:space="preserve"> (Ctrl+2) → </w:t>
-      </w:r>
-      <w:r>
-        <w:rPr>
-          <w:b/>
-        </w:rPr>
-        <w:t>Configure Connections…</w:t>
-      </w:r>
-      <w:r>
-        <w:t xml:space="preserve"> → </w:t>
-      </w:r>
-      <w:r>
-        <w:rPr>
-          <w:b/>
-        </w:rPr>
-        <w:t>Add</w:t>
-      </w:r>
-      <w:r>
-        <w:t xml:space="preserve"> a TCP connection.</w:t>
-      </w:r>
-    </w:p>
-    <w:p>
-      <w:r>
-        <w:t xml:space="preserve">2. </w:t>
-      </w:r>
-      <w:r>
-        <w:t xml:space="preserve">Choose a </w:t>
-      </w:r>
-      <w:r>
-        <w:rPr>
-          <w:b/>
-        </w:rPr>
-        <w:t>Role</w:t>
-      </w:r>
-      <w:r>
-        <w:t>: *Listen* (server, accept incoming) or *Connect* (dial a remote host); set the port (and host for Connect). Framing follows the bound message's payload length.</w:t>
-      </w:r>
-    </w:p>
-    <w:p>
-      <w:r>
-        <w:t xml:space="preserve">3. </w:t>
-      </w:r>
-      <w:r>
-        <w:t xml:space="preserve">Define messages/fields → </w:t>
-      </w:r>
-      <w:r>
-        <w:rPr>
-          <w:b/>
-        </w:rPr>
-        <w:t>Start Live</w:t>
-      </w:r>
-      <w:r>
-        <w:t>. TCP data is framed and decoded the same way as UDP.</w:t>
-      </w:r>
-    </w:p>
-    <w:p>
-      <w:pPr>
-        <w:pStyle w:val="Heading2"/>
-      </w:pPr>
-      <w:r>
-        <w:t>Receive from multiple sources at once (connections)</w:t>
-      </w:r>
-    </w:p>
-    <w:p>
-      <w:r>
-        <w:t xml:space="preserve">1. </w:t>
-      </w:r>
-      <w:r>
-        <w:rPr>
-          <w:b/>
-        </w:rPr>
-        <w:t>Live Mode</w:t>
-      </w:r>
-      <w:r>
-        <w:t xml:space="preserve"> (Ctrl+2) → </w:t>
-      </w:r>
-      <w:r>
-        <w:rPr>
-          <w:b/>
-        </w:rPr>
-        <w:t>Configure Connections…</w:t>
-      </w:r>
-      <w:r>
-        <w:t xml:space="preserve"> → </w:t>
-      </w:r>
-      <w:r>
-        <w:rPr>
-          <w:b/>
-        </w:rPr>
-        <w:t>Add</w:t>
-      </w:r>
-      <w:r>
-        <w:t xml:space="preserve"> one connection per source.</w:t>
-      </w:r>
-    </w:p>
-    <w:p>
-      <w:r>
-        <w:t xml:space="preserve">2. </w:t>
-      </w:r>
-      <w:r>
-        <w:t xml:space="preserve">For each, pick the </w:t>
-      </w:r>
-      <w:r>
-        <w:rPr>
-          <w:b/>
-        </w:rPr>
-        <w:t>adapter</w:t>
-      </w:r>
-      <w:r>
-        <w:t xml:space="preserve"> (by number; *Any* and *Loopback* are always listed) and the </w:t>
-      </w:r>
-      <w:r>
-        <w:rPr>
-          <w:b/>
-        </w:rPr>
-        <w:t>port</w:t>
-      </w:r>
-      <w:r>
-        <w:t>; for UDP that is all — no IP address. For TCP also pick Listen or Connect.</w:t>
-      </w:r>
-    </w:p>
-    <w:p>
-      <w:r>
-        <w:t xml:space="preserve">3. </w:t>
-      </w:r>
-      <w:r>
-        <w:t xml:space="preserve">Press </w:t>
-      </w:r>
-      <w:r>
-        <w:rPr>
-          <w:b/>
-        </w:rPr>
-        <w:t>Configure Messages</w:t>
-      </w:r>
-      <w:r>
-        <w:t xml:space="preserve">, and in the </w:t>
-      </w:r>
-      <w:r>
-        <w:rPr>
-          <w:b/>
-        </w:rPr>
-        <w:t>Connection</w:t>
-      </w:r>
-      <w:r>
-        <w:t xml:space="preserve"> column bind each message to the connection it should be decoded from (leave a message on *(any connection)* to accept it from all of them).</w:t>
-      </w:r>
-    </w:p>
-    <w:p>
-      <w:r>
-        <w:t xml:space="preserve">4. </w:t>
-      </w:r>
-      <w:r>
-        <w:rPr>
-          <w:b/>
-        </w:rPr>
-        <w:t>Start Live</w:t>
-      </w:r>
-      <w:r>
-        <w:t xml:space="preserve"> — one receiver runs per connection and each message is only matched on its connection, so two sources on different adapters/ports are kept completely separate.</w:t>
-      </w:r>
-    </w:p>
-    <w:p>
-      <w:pPr>
-        <w:pStyle w:val="Heading2"/>
-      </w:pPr>
-      <w:r>
-        <w:t>Import/export messages while configuring (JSON)</w:t>
-      </w:r>
-    </w:p>
-    <w:p>
-      <w:r>
-        <w:t xml:space="preserve">Inside the </w:t>
-      </w:r>
-      <w:r>
-        <w:rPr>
-          <w:b/>
-        </w:rPr>
-        <w:t>Configure Messages</w:t>
-      </w:r>
-      <w:r>
-        <w:t xml:space="preserve"> dialog, </w:t>
-      </w:r>
-      <w:r>
-        <w:rPr>
-          <w:b/>
-        </w:rPr>
-        <w:t>Import JSON…</w:t>
-      </w:r>
-      <w:r>
-        <w:t xml:space="preserve"> appends message definitions from a JSON file and </w:t>
-      </w:r>
-      <w:r>
-        <w:rPr>
-          <w:b/>
-        </w:rPr>
-        <w:t>Export JSON…</w:t>
-      </w:r>
-      <w:r>
-        <w:t xml:space="preserve"> writes the current list out — the same format the simulator and the File menu use.</w:t>
-      </w:r>
-    </w:p>
-    <w:p>
-      <w:pPr>
-        <w:pStyle w:val="Heading2"/>
-      </w:pPr>
-      <w:r>
-        <w:t>Import message/field definitions from a Word ICD</w:t>
-      </w:r>
-    </w:p>
-    <w:p>
-      <w:r>
-        <w:t xml:space="preserve">See the dedicated </w:t>
-      </w:r>
-      <w:r>
-        <w:rPr>
-          <w:b/>
-        </w:rPr>
-        <w:t>Import from a Word ICD</w:t>
-      </w:r>
-      <w:r>
-        <w:t xml:space="preserve"> section below.</w:t>
-      </w:r>
-    </w:p>
-    <w:p>
-      <w:pPr>
-        <w:pStyle w:val="Heading2"/>
-      </w:pPr>
-      <w:r>
         <w:t>Add a bitfield decoder to a field</w:t>
       </w:r>
     </w:p>
@@ -2052,7 +2127,7 @@
         <w:drawing>
           <wp:inline xmlns:a="http://schemas.openxmlformats.org/drawingml/2006/main" xmlns:pic="http://schemas.openxmlformats.org/drawingml/2006/picture">
             <wp:extent cx="5760720" cy="3518414"/>
-            <wp:docPr id="11" name="Picture 11"/>
+            <wp:docPr id="10" name="Picture 10"/>
             <wp:cNvGraphicFramePr>
               <a:graphicFrameLocks noChangeAspect="1"/>
             </wp:cNvGraphicFramePr>
@@ -2064,7 +2139,7 @@
                     <pic:cNvPicPr/>
                   </pic:nvPicPr>
                   <pic:blipFill>
-                    <a:blip r:embed="rId19"/>
+                    <a:blip r:embed="rId17"/>
                     <a:stretch>
                       <a:fillRect/>
                     </a:stretch>
@@ -2103,7 +2178,7 @@
         <w:drawing>
           <wp:inline xmlns:a="http://schemas.openxmlformats.org/drawingml/2006/main" xmlns:pic="http://schemas.openxmlformats.org/drawingml/2006/picture">
             <wp:extent cx="5760720" cy="4650500"/>
-            <wp:docPr id="12" name="Picture 12"/>
+            <wp:docPr id="11" name="Picture 11"/>
             <wp:cNvGraphicFramePr>
               <a:graphicFrameLocks noChangeAspect="1"/>
             </wp:cNvGraphicFramePr>
@@ -2115,7 +2190,7 @@
                     <pic:cNvPicPr/>
                   </pic:nvPicPr>
                   <pic:blipFill>
-                    <a:blip r:embed="rId20"/>
+                    <a:blip r:embed="rId18"/>
                     <a:stretch>
                       <a:fillRect/>
                     </a:stretch>
@@ -2160,7 +2235,7 @@
         <w:drawing>
           <wp:inline xmlns:a="http://schemas.openxmlformats.org/drawingml/2006/main" xmlns:pic="http://schemas.openxmlformats.org/drawingml/2006/picture">
             <wp:extent cx="5760720" cy="4747680"/>
-            <wp:docPr id="13" name="Picture 13"/>
+            <wp:docPr id="12" name="Picture 12"/>
             <wp:cNvGraphicFramePr>
               <a:graphicFrameLocks noChangeAspect="1"/>
             </wp:cNvGraphicFramePr>
@@ -2172,7 +2247,7 @@
                     <pic:cNvPicPr/>
                   </pic:nvPicPr>
                   <pic:blipFill>
-                    <a:blip r:embed="rId21"/>
+                    <a:blip r:embed="rId19"/>
                     <a:stretch>
                       <a:fillRect/>
                     </a:stretch>
@@ -2504,7 +2579,7 @@
         <w:drawing>
           <wp:inline xmlns:a="http://schemas.openxmlformats.org/drawingml/2006/main" xmlns:pic="http://schemas.openxmlformats.org/drawingml/2006/picture">
             <wp:extent cx="5760720" cy="4199146"/>
-            <wp:docPr id="14" name="Picture 14"/>
+            <wp:docPr id="13" name="Picture 13"/>
             <wp:cNvGraphicFramePr>
               <a:graphicFrameLocks noChangeAspect="1"/>
             </wp:cNvGraphicFramePr>
@@ -2516,7 +2591,7 @@
                     <pic:cNvPicPr/>
                   </pic:nvPicPr>
                   <pic:blipFill>
-                    <a:blip r:embed="rId22"/>
+                    <a:blip r:embed="rId20"/>
                     <a:stretch>
                       <a:fillRect/>
                     </a:stretch>
@@ -2597,7 +2672,7 @@
         <w:drawing>
           <wp:inline xmlns:a="http://schemas.openxmlformats.org/drawingml/2006/main" xmlns:pic="http://schemas.openxmlformats.org/drawingml/2006/picture">
             <wp:extent cx="5760720" cy="3894091"/>
-            <wp:docPr id="15" name="Picture 15"/>
+            <wp:docPr id="14" name="Picture 14"/>
             <wp:cNvGraphicFramePr>
               <a:graphicFrameLocks noChangeAspect="1"/>
             </wp:cNvGraphicFramePr>
@@ -2609,7 +2684,7 @@
                     <pic:cNvPicPr/>
                   </pic:nvPicPr>
                   <pic:blipFill>
-                    <a:blip r:embed="rId23"/>
+                    <a:blip r:embed="rId21"/>
                     <a:stretch>
                       <a:fillRect/>
                     </a:stretch>
@@ -2690,7 +2765,7 @@
         <w:drawing>
           <wp:inline xmlns:a="http://schemas.openxmlformats.org/drawingml/2006/main" xmlns:pic="http://schemas.openxmlformats.org/drawingml/2006/picture">
             <wp:extent cx="5760720" cy="5271602"/>
-            <wp:docPr id="16" name="Picture 16"/>
+            <wp:docPr id="15" name="Picture 15"/>
             <wp:cNvGraphicFramePr>
               <a:graphicFrameLocks noChangeAspect="1"/>
             </wp:cNvGraphicFramePr>
@@ -2702,7 +2777,7 @@
                     <pic:cNvPicPr/>
                   </pic:nvPicPr>
                   <pic:blipFill>
-                    <a:blip r:embed="rId24"/>
+                    <a:blip r:embed="rId22"/>
                     <a:stretch>
                       <a:fillRect/>
                     </a:stretch>
@@ -2792,7 +2867,7 @@
         <w:drawing>
           <wp:inline xmlns:a="http://schemas.openxmlformats.org/drawingml/2006/main" xmlns:pic="http://schemas.openxmlformats.org/drawingml/2006/picture">
             <wp:extent cx="5760720" cy="4199146"/>
-            <wp:docPr id="17" name="Picture 17"/>
+            <wp:docPr id="16" name="Picture 16"/>
             <wp:cNvGraphicFramePr>
               <a:graphicFrameLocks noChangeAspect="1"/>
             </wp:cNvGraphicFramePr>
@@ -2804,7 +2879,7 @@
                     <pic:cNvPicPr/>
                   </pic:nvPicPr>
                   <pic:blipFill>
-                    <a:blip r:embed="rId25"/>
+                    <a:blip r:embed="rId23"/>
                     <a:stretch>
                       <a:fillRect/>
                     </a:stretch>
@@ -3058,7 +3133,7 @@
           <w:p>
             <w:r/>
             <w:r>
-              <w:t>Filters exclude everything, or the wrong port</w:t>
+              <w:t>A message's Port / Length doesn't match the traffic</w:t>
             </w:r>
           </w:p>
         </w:tc>
@@ -3069,16 +3144,25 @@
           <w:p>
             <w:r/>
             <w:r>
-              <w:t xml:space="preserve">Check the </w:t>
+              <w:t xml:space="preserve">Check each message's </w:t>
             </w:r>
             <w:r>
               <w:rPr>
                 <w:b/>
               </w:rPr>
-              <w:t>Port</w:t>
+              <w:t>UDP Port</w:t>
             </w:r>
             <w:r>
-              <w:t>/length filters match the traffic; widen or remove a filter to confirm.</w:t>
+              <w:t xml:space="preserve"> and </w:t>
+            </w:r>
+            <w:r>
+              <w:rPr>
+                <w:b/>
+              </w:rPr>
+              <w:t>Payload Length</w:t>
+            </w:r>
+            <w:r>
+              <w:t xml:space="preserve"> match the real packets (1-based byte offsets).</w:t>
             </w:r>
           </w:p>
         </w:tc>
@@ -3563,16 +3647,16 @@
           <w:p>
             <w:r/>
             <w:r>
-              <w:t xml:space="preserve">Add a </w:t>
+              <w:t xml:space="preserve">Give each message a distinct </w:t>
             </w:r>
             <w:r>
               <w:rPr>
                 <w:b/>
               </w:rPr>
-              <w:t>Header</w:t>
+              <w:t>Optional Header</w:t>
             </w:r>
             <w:r>
-              <w:t xml:space="preserve"> filter / optional-header signature to tell them apart.</w:t>
+              <w:t xml:space="preserve"> (hex signature) in its Message Definition to tell them apart.</w:t>
             </w:r>
           </w:p>
         </w:tc>
@@ -3915,10 +3999,10 @@
         <w:rPr>
           <w:b/>
         </w:rPr>
-        <w:t>Message filter</w:t>
-      </w:r>
-      <w:r>
-        <w:t xml:space="preserve"> — a rule (by port, header signature and/or payload length) selecting which datagrams map to which message definition.</w:t>
+        <w:t>Message routing key</w:t>
+      </w:r>
+      <w:r>
+        <w:t xml:space="preserve"> — how a packet is matched to a message: its UDP port + payload length (and an optional leading header signature to disambiguate same-length messages on the same port).</w:t>
       </w:r>
     </w:p>
     <w:p>

</xml_diff>

<commit_message>
docx manuals: cleaner format (title + Contents/TOC, page numbers, smaller images)
The generated .docx manuals looked messy with full-page screenshots. emit_docx
in make_manuals.py now produces a proper document:
- A title block + italic subtitle, then a real Word Table of Contents field
  (\o "1-2") that auto-populates page numbers on open (settings updateFields=true).
- Page numbers centered in the footer (PAGE field).
- Screenshots are scaled to fit (max 4.7in wide / 4.2in tall, aspect preserved)
  and centered, instead of spanning the whole page; captions centered.
- Slightly narrower margins; headings use Word's Title/Heading 1-2 styles for a
  clean, navigable hierarchy.

Regenerated both parser_manual.docx and simulator_manual.docx.

Co-Authored-By: Claude Opus 4.8 <noreply@anthropic.com>
</commit_message>
<xml_diff>
--- a/docs/manual/parser_manual.docx
+++ b/docs/manual/parser_manual.docx
@@ -5,9 +5,44 @@
     <w:p>
       <w:pPr>
         <w:pStyle w:val="Title"/>
+        <w:jc w:val="left"/>
       </w:pPr>
       <w:r>
-        <w:t>Universal Wireshark Log Reader — User Manual</w:t>
+        <w:t>Universal Wireshark Log Reader</w:t>
+      </w:r>
+    </w:p>
+    <w:p>
+      <w:r>
+        <w:rPr>
+          <w:i/>
+          <w:color w:val="606060"/>
+          <w:sz w:val="24"/>
+        </w:rPr>
+        <w:t>Universal Data Suite — user manual</w:t>
+      </w:r>
+    </w:p>
+    <w:p>
+      <w:r>
+        <w:rPr>
+          <w:b/>
+          <w:color w:val="312E81"/>
+          <w:sz w:val="30"/>
+        </w:rPr>
+        <w:t>Contents</w:t>
+      </w:r>
+    </w:p>
+    <w:p>
+      <w:r>
+        <w:fldChar w:fldCharType="begin"/>
+        <w:instrText xml:space="preserve">TOC \o "1-2" \h \z \u</w:instrText>
+        <w:fldChar w:fldCharType="separate"/>
+        <w:t>Update this field (select all, press F9) to build the contents with page numbers.</w:t>
+        <w:fldChar w:fldCharType="end"/>
+      </w:r>
+    </w:p>
+    <w:p>
+      <w:r>
+        <w:br w:type="page"/>
       </w:r>
     </w:p>
     <w:p>
@@ -255,10 +290,13 @@
       </w:r>
     </w:p>
     <w:p>
+      <w:pPr>
+        <w:jc w:val="center"/>
+      </w:pPr>
       <w:r>
         <w:drawing>
           <wp:inline xmlns:a="http://schemas.openxmlformats.org/drawingml/2006/main" xmlns:pic="http://schemas.openxmlformats.org/drawingml/2006/picture">
-            <wp:extent cx="5760720" cy="4305569"/>
+            <wp:extent cx="4297680" cy="3212091"/>
             <wp:docPr id="1" name="Picture 1"/>
             <wp:cNvGraphicFramePr>
               <a:graphicFrameLocks noChangeAspect="1"/>
@@ -271,7 +309,7 @@
                     <pic:cNvPicPr/>
                   </pic:nvPicPr>
                   <pic:blipFill>
-                    <a:blip r:embed="rId9"/>
+                    <a:blip r:embed="rId10"/>
                     <a:stretch>
                       <a:fillRect/>
                     </a:stretch>
@@ -279,7 +317,7 @@
                   <pic:spPr>
                     <a:xfrm>
                       <a:off x="0" y="0"/>
-                      <a:ext cx="5760720" cy="4305569"/>
+                      <a:ext cx="4297680" cy="3212091"/>
                     </a:xfrm>
                     <a:prstGeom prst="rect"/>
                   </pic:spPr>
@@ -291,6 +329,9 @@
       </w:r>
     </w:p>
     <w:p>
+      <w:pPr>
+        <w:jc w:val="center"/>
+      </w:pPr>
       <w:r>
         <w:rPr>
           <w:i/>
@@ -316,10 +357,13 @@
       </w:r>
     </w:p>
     <w:p>
+      <w:pPr>
+        <w:jc w:val="center"/>
+      </w:pPr>
       <w:r>
         <w:drawing>
           <wp:inline xmlns:a="http://schemas.openxmlformats.org/drawingml/2006/main" xmlns:pic="http://schemas.openxmlformats.org/drawingml/2006/picture">
-            <wp:extent cx="5760720" cy="3263169"/>
+            <wp:extent cx="4297680" cy="2434428"/>
             <wp:docPr id="2" name="Picture 2"/>
             <wp:cNvGraphicFramePr>
               <a:graphicFrameLocks noChangeAspect="1"/>
@@ -332,7 +376,7 @@
                     <pic:cNvPicPr/>
                   </pic:nvPicPr>
                   <pic:blipFill>
-                    <a:blip r:embed="rId10"/>
+                    <a:blip r:embed="rId11"/>
                     <a:stretch>
                       <a:fillRect/>
                     </a:stretch>
@@ -340,7 +384,7 @@
                   <pic:spPr>
                     <a:xfrm>
                       <a:off x="0" y="0"/>
-                      <a:ext cx="5760720" cy="3263169"/>
+                      <a:ext cx="4297680" cy="2434428"/>
                     </a:xfrm>
                     <a:prstGeom prst="rect"/>
                   </pic:spPr>
@@ -352,6 +396,9 @@
       </w:r>
     </w:p>
     <w:p>
+      <w:pPr>
+        <w:jc w:val="center"/>
+      </w:pPr>
       <w:r>
         <w:rPr>
           <w:i/>
@@ -496,10 +543,13 @@
       </w:r>
     </w:p>
     <w:p>
+      <w:pPr>
+        <w:jc w:val="center"/>
+      </w:pPr>
       <w:r>
         <w:drawing>
           <wp:inline xmlns:a="http://schemas.openxmlformats.org/drawingml/2006/main" xmlns:pic="http://schemas.openxmlformats.org/drawingml/2006/picture">
-            <wp:extent cx="5760720" cy="3263169"/>
+            <wp:extent cx="4297680" cy="2434428"/>
             <wp:docPr id="3" name="Picture 3"/>
             <wp:cNvGraphicFramePr>
               <a:graphicFrameLocks noChangeAspect="1"/>
@@ -512,7 +562,7 @@
                     <pic:cNvPicPr/>
                   </pic:nvPicPr>
                   <pic:blipFill>
-                    <a:blip r:embed="rId11"/>
+                    <a:blip r:embed="rId12"/>
                     <a:stretch>
                       <a:fillRect/>
                     </a:stretch>
@@ -520,7 +570,7 @@
                   <pic:spPr>
                     <a:xfrm>
                       <a:off x="0" y="0"/>
-                      <a:ext cx="5760720" cy="3263169"/>
+                      <a:ext cx="4297680" cy="2434428"/>
                     </a:xfrm>
                     <a:prstGeom prst="rect"/>
                   </pic:spPr>
@@ -532,6 +582,9 @@
       </w:r>
     </w:p>
     <w:p>
+      <w:pPr>
+        <w:jc w:val="center"/>
+      </w:pPr>
       <w:r>
         <w:rPr>
           <w:i/>
@@ -924,10 +977,13 @@
       </w:r>
     </w:p>
     <w:p>
+      <w:pPr>
+        <w:jc w:val="center"/>
+      </w:pPr>
       <w:r>
         <w:drawing>
           <wp:inline xmlns:a="http://schemas.openxmlformats.org/drawingml/2006/main" xmlns:pic="http://schemas.openxmlformats.org/drawingml/2006/picture">
-            <wp:extent cx="5760720" cy="3263169"/>
+            <wp:extent cx="4297680" cy="2434428"/>
             <wp:docPr id="4" name="Picture 4"/>
             <wp:cNvGraphicFramePr>
               <a:graphicFrameLocks noChangeAspect="1"/>
@@ -940,7 +996,7 @@
                     <pic:cNvPicPr/>
                   </pic:nvPicPr>
                   <pic:blipFill>
-                    <a:blip r:embed="rId12"/>
+                    <a:blip r:embed="rId13"/>
                     <a:stretch>
                       <a:fillRect/>
                     </a:stretch>
@@ -948,7 +1004,7 @@
                   <pic:spPr>
                     <a:xfrm>
                       <a:off x="0" y="0"/>
-                      <a:ext cx="5760720" cy="3263169"/>
+                      <a:ext cx="4297680" cy="2434428"/>
                     </a:xfrm>
                     <a:prstGeom prst="rect"/>
                   </pic:spPr>
@@ -960,6 +1016,9 @@
       </w:r>
     </w:p>
     <w:p>
+      <w:pPr>
+        <w:jc w:val="center"/>
+      </w:pPr>
       <w:r>
         <w:rPr>
           <w:i/>
@@ -1025,10 +1084,13 @@
       </w:r>
     </w:p>
     <w:p>
+      <w:pPr>
+        <w:jc w:val="center"/>
+      </w:pPr>
       <w:r>
         <w:drawing>
           <wp:inline xmlns:a="http://schemas.openxmlformats.org/drawingml/2006/main" xmlns:pic="http://schemas.openxmlformats.org/drawingml/2006/picture">
-            <wp:extent cx="5760720" cy="3333584"/>
+            <wp:extent cx="4297680" cy="2486960"/>
             <wp:docPr id="5" name="Picture 5"/>
             <wp:cNvGraphicFramePr>
               <a:graphicFrameLocks noChangeAspect="1"/>
@@ -1041,7 +1103,7 @@
                     <pic:cNvPicPr/>
                   </pic:nvPicPr>
                   <pic:blipFill>
-                    <a:blip r:embed="rId13"/>
+                    <a:blip r:embed="rId14"/>
                     <a:stretch>
                       <a:fillRect/>
                     </a:stretch>
@@ -1049,7 +1111,7 @@
                   <pic:spPr>
                     <a:xfrm>
                       <a:off x="0" y="0"/>
-                      <a:ext cx="5760720" cy="3333584"/>
+                      <a:ext cx="4297680" cy="2486960"/>
                     </a:xfrm>
                     <a:prstGeom prst="rect"/>
                   </pic:spPr>
@@ -1061,6 +1123,9 @@
       </w:r>
     </w:p>
     <w:p>
+      <w:pPr>
+        <w:jc w:val="center"/>
+      </w:pPr>
       <w:r>
         <w:rPr>
           <w:i/>
@@ -1210,10 +1275,13 @@
       </w:r>
     </w:p>
     <w:p>
+      <w:pPr>
+        <w:jc w:val="center"/>
+      </w:pPr>
       <w:r>
         <w:drawing>
           <wp:inline xmlns:a="http://schemas.openxmlformats.org/drawingml/2006/main" xmlns:pic="http://schemas.openxmlformats.org/drawingml/2006/picture">
-            <wp:extent cx="5760720" cy="3263169"/>
+            <wp:extent cx="4297680" cy="2434428"/>
             <wp:docPr id="6" name="Picture 6"/>
             <wp:cNvGraphicFramePr>
               <a:graphicFrameLocks noChangeAspect="1"/>
@@ -1226,7 +1294,7 @@
                     <pic:cNvPicPr/>
                   </pic:nvPicPr>
                   <pic:blipFill>
-                    <a:blip r:embed="rId10"/>
+                    <a:blip r:embed="rId11"/>
                     <a:stretch>
                       <a:fillRect/>
                     </a:stretch>
@@ -1234,7 +1302,7 @@
                   <pic:spPr>
                     <a:xfrm>
                       <a:off x="0" y="0"/>
-                      <a:ext cx="5760720" cy="3263169"/>
+                      <a:ext cx="4297680" cy="2434428"/>
                     </a:xfrm>
                     <a:prstGeom prst="rect"/>
                   </pic:spPr>
@@ -1246,6 +1314,9 @@
       </w:r>
     </w:p>
     <w:p>
+      <w:pPr>
+        <w:jc w:val="center"/>
+      </w:pPr>
       <w:r>
         <w:rPr>
           <w:i/>
@@ -1294,10 +1365,13 @@
       </w:r>
     </w:p>
     <w:p>
+      <w:pPr>
+        <w:jc w:val="center"/>
+      </w:pPr>
       <w:r>
         <w:drawing>
           <wp:inline xmlns:a="http://schemas.openxmlformats.org/drawingml/2006/main" xmlns:pic="http://schemas.openxmlformats.org/drawingml/2006/picture">
-            <wp:extent cx="4972050" cy="3638551"/>
+            <wp:extent cx="4297680" cy="3145046"/>
             <wp:docPr id="7" name="Picture 7"/>
             <wp:cNvGraphicFramePr>
               <a:graphicFrameLocks noChangeAspect="1"/>
@@ -1310,7 +1384,7 @@
                     <pic:cNvPicPr/>
                   </pic:nvPicPr>
                   <pic:blipFill>
-                    <a:blip r:embed="rId14"/>
+                    <a:blip r:embed="rId15"/>
                     <a:stretch>
                       <a:fillRect/>
                     </a:stretch>
@@ -1318,7 +1392,7 @@
                   <pic:spPr>
                     <a:xfrm>
                       <a:off x="0" y="0"/>
-                      <a:ext cx="4972050" cy="3638551"/>
+                      <a:ext cx="4297680" cy="3145046"/>
                     </a:xfrm>
                     <a:prstGeom prst="rect"/>
                   </pic:spPr>
@@ -1330,6 +1404,9 @@
       </w:r>
     </w:p>
     <w:p>
+      <w:pPr>
+        <w:jc w:val="center"/>
+      </w:pPr>
       <w:r>
         <w:rPr>
           <w:i/>
@@ -1441,10 +1518,13 @@
       </w:r>
     </w:p>
     <w:p>
+      <w:pPr>
+        <w:jc w:val="center"/>
+      </w:pPr>
       <w:r>
         <w:drawing>
           <wp:inline xmlns:a="http://schemas.openxmlformats.org/drawingml/2006/main" xmlns:pic="http://schemas.openxmlformats.org/drawingml/2006/picture">
-            <wp:extent cx="5760720" cy="2636113"/>
+            <wp:extent cx="4297680" cy="1966624"/>
             <wp:docPr id="8" name="Picture 8"/>
             <wp:cNvGraphicFramePr>
               <a:graphicFrameLocks noChangeAspect="1"/>
@@ -1457,7 +1537,7 @@
                     <pic:cNvPicPr/>
                   </pic:nvPicPr>
                   <pic:blipFill>
-                    <a:blip r:embed="rId15"/>
+                    <a:blip r:embed="rId16"/>
                     <a:stretch>
                       <a:fillRect/>
                     </a:stretch>
@@ -1465,7 +1545,7 @@
                   <pic:spPr>
                     <a:xfrm>
                       <a:off x="0" y="0"/>
-                      <a:ext cx="5760720" cy="2636113"/>
+                      <a:ext cx="4297680" cy="1966624"/>
                     </a:xfrm>
                     <a:prstGeom prst="rect"/>
                   </pic:spPr>
@@ -1477,6 +1557,9 @@
       </w:r>
     </w:p>
     <w:p>
+      <w:pPr>
+        <w:jc w:val="center"/>
+      </w:pPr>
       <w:r>
         <w:rPr>
           <w:i/>
@@ -1557,10 +1640,13 @@
       </w:r>
     </w:p>
     <w:p>
+      <w:pPr>
+        <w:jc w:val="center"/>
+      </w:pPr>
       <w:r>
         <w:drawing>
           <wp:inline xmlns:a="http://schemas.openxmlformats.org/drawingml/2006/main" xmlns:pic="http://schemas.openxmlformats.org/drawingml/2006/picture">
-            <wp:extent cx="5760720" cy="6618798"/>
+            <wp:extent cx="3342590" cy="3840480"/>
             <wp:docPr id="9" name="Picture 9"/>
             <wp:cNvGraphicFramePr>
               <a:graphicFrameLocks noChangeAspect="1"/>
@@ -1573,7 +1659,7 @@
                     <pic:cNvPicPr/>
                   </pic:nvPicPr>
                   <pic:blipFill>
-                    <a:blip r:embed="rId16"/>
+                    <a:blip r:embed="rId17"/>
                     <a:stretch>
                       <a:fillRect/>
                     </a:stretch>
@@ -1581,7 +1667,7 @@
                   <pic:spPr>
                     <a:xfrm>
                       <a:off x="0" y="0"/>
-                      <a:ext cx="5760720" cy="6618798"/>
+                      <a:ext cx="3342590" cy="3840480"/>
                     </a:xfrm>
                     <a:prstGeom prst="rect"/>
                   </pic:spPr>
@@ -1593,6 +1679,9 @@
       </w:r>
     </w:p>
     <w:p>
+      <w:pPr>
+        <w:jc w:val="center"/>
+      </w:pPr>
       <w:r>
         <w:rPr>
           <w:i/>
@@ -2123,10 +2212,13 @@
       </w:r>
     </w:p>
     <w:p>
+      <w:pPr>
+        <w:jc w:val="center"/>
+      </w:pPr>
       <w:r>
         <w:drawing>
           <wp:inline xmlns:a="http://schemas.openxmlformats.org/drawingml/2006/main" xmlns:pic="http://schemas.openxmlformats.org/drawingml/2006/picture">
-            <wp:extent cx="5760720" cy="3518414"/>
+            <wp:extent cx="4297680" cy="2624849"/>
             <wp:docPr id="10" name="Picture 10"/>
             <wp:cNvGraphicFramePr>
               <a:graphicFrameLocks noChangeAspect="1"/>
@@ -2139,7 +2231,7 @@
                     <pic:cNvPicPr/>
                   </pic:nvPicPr>
                   <pic:blipFill>
-                    <a:blip r:embed="rId17"/>
+                    <a:blip r:embed="rId18"/>
                     <a:stretch>
                       <a:fillRect/>
                     </a:stretch>
@@ -2147,7 +2239,7 @@
                   <pic:spPr>
                     <a:xfrm>
                       <a:off x="0" y="0"/>
-                      <a:ext cx="5760720" cy="3518414"/>
+                      <a:ext cx="4297680" cy="2624849"/>
                     </a:xfrm>
                     <a:prstGeom prst="rect"/>
                   </pic:spPr>
@@ -2159,6 +2251,9 @@
       </w:r>
     </w:p>
     <w:p>
+      <w:pPr>
+        <w:jc w:val="center"/>
+      </w:pPr>
       <w:r>
         <w:rPr>
           <w:i/>
@@ -2174,10 +2269,13 @@
       </w:r>
     </w:p>
     <w:p>
+      <w:pPr>
+        <w:jc w:val="center"/>
+      </w:pPr>
       <w:r>
         <w:drawing>
           <wp:inline xmlns:a="http://schemas.openxmlformats.org/drawingml/2006/main" xmlns:pic="http://schemas.openxmlformats.org/drawingml/2006/picture">
-            <wp:extent cx="5760720" cy="4650500"/>
+            <wp:extent cx="4297680" cy="3469421"/>
             <wp:docPr id="11" name="Picture 11"/>
             <wp:cNvGraphicFramePr>
               <a:graphicFrameLocks noChangeAspect="1"/>
@@ -2190,7 +2288,7 @@
                     <pic:cNvPicPr/>
                   </pic:nvPicPr>
                   <pic:blipFill>
-                    <a:blip r:embed="rId18"/>
+                    <a:blip r:embed="rId19"/>
                     <a:stretch>
                       <a:fillRect/>
                     </a:stretch>
@@ -2198,7 +2296,7 @@
                   <pic:spPr>
                     <a:xfrm>
                       <a:off x="0" y="0"/>
-                      <a:ext cx="5760720" cy="4650500"/>
+                      <a:ext cx="4297680" cy="3469421"/>
                     </a:xfrm>
                     <a:prstGeom prst="rect"/>
                   </pic:spPr>
@@ -2210,6 +2308,9 @@
       </w:r>
     </w:p>
     <w:p>
+      <w:pPr>
+        <w:jc w:val="center"/>
+      </w:pPr>
       <w:r>
         <w:rPr>
           <w:i/>
@@ -2231,10 +2332,13 @@
       </w:r>
     </w:p>
     <w:p>
+      <w:pPr>
+        <w:jc w:val="center"/>
+      </w:pPr>
       <w:r>
         <w:drawing>
           <wp:inline xmlns:a="http://schemas.openxmlformats.org/drawingml/2006/main" xmlns:pic="http://schemas.openxmlformats.org/drawingml/2006/picture">
-            <wp:extent cx="5760720" cy="4747680"/>
+            <wp:extent cx="4297680" cy="3541920"/>
             <wp:docPr id="12" name="Picture 12"/>
             <wp:cNvGraphicFramePr>
               <a:graphicFrameLocks noChangeAspect="1"/>
@@ -2247,7 +2351,7 @@
                     <pic:cNvPicPr/>
                   </pic:nvPicPr>
                   <pic:blipFill>
-                    <a:blip r:embed="rId19"/>
+                    <a:blip r:embed="rId20"/>
                     <a:stretch>
                       <a:fillRect/>
                     </a:stretch>
@@ -2255,7 +2359,7 @@
                   <pic:spPr>
                     <a:xfrm>
                       <a:off x="0" y="0"/>
-                      <a:ext cx="5760720" cy="4747680"/>
+                      <a:ext cx="4297680" cy="3541920"/>
                     </a:xfrm>
                     <a:prstGeom prst="rect"/>
                   </pic:spPr>
@@ -2267,6 +2371,9 @@
       </w:r>
     </w:p>
     <w:p>
+      <w:pPr>
+        <w:jc w:val="center"/>
+      </w:pPr>
       <w:r>
         <w:rPr>
           <w:i/>
@@ -2575,10 +2682,13 @@
       </w:r>
     </w:p>
     <w:p>
+      <w:pPr>
+        <w:jc w:val="center"/>
+      </w:pPr>
       <w:r>
         <w:drawing>
           <wp:inline xmlns:a="http://schemas.openxmlformats.org/drawingml/2006/main" xmlns:pic="http://schemas.openxmlformats.org/drawingml/2006/picture">
-            <wp:extent cx="5760720" cy="4199146"/>
+            <wp:extent cx="4297680" cy="3132696"/>
             <wp:docPr id="13" name="Picture 13"/>
             <wp:cNvGraphicFramePr>
               <a:graphicFrameLocks noChangeAspect="1"/>
@@ -2591,7 +2701,7 @@
                     <pic:cNvPicPr/>
                   </pic:nvPicPr>
                   <pic:blipFill>
-                    <a:blip r:embed="rId20"/>
+                    <a:blip r:embed="rId21"/>
                     <a:stretch>
                       <a:fillRect/>
                     </a:stretch>
@@ -2599,7 +2709,7 @@
                   <pic:spPr>
                     <a:xfrm>
                       <a:off x="0" y="0"/>
-                      <a:ext cx="5760720" cy="4199146"/>
+                      <a:ext cx="4297680" cy="3132696"/>
                     </a:xfrm>
                     <a:prstGeom prst="rect"/>
                   </pic:spPr>
@@ -2611,6 +2721,9 @@
       </w:r>
     </w:p>
     <w:p>
+      <w:pPr>
+        <w:jc w:val="center"/>
+      </w:pPr>
       <w:r>
         <w:rPr>
           <w:i/>
@@ -2668,10 +2781,13 @@
       </w:r>
     </w:p>
     <w:p>
+      <w:pPr>
+        <w:jc w:val="center"/>
+      </w:pPr>
       <w:r>
         <w:drawing>
           <wp:inline xmlns:a="http://schemas.openxmlformats.org/drawingml/2006/main" xmlns:pic="http://schemas.openxmlformats.org/drawingml/2006/picture">
-            <wp:extent cx="5760720" cy="3894091"/>
+            <wp:extent cx="4297680" cy="2905115"/>
             <wp:docPr id="14" name="Picture 14"/>
             <wp:cNvGraphicFramePr>
               <a:graphicFrameLocks noChangeAspect="1"/>
@@ -2684,7 +2800,7 @@
                     <pic:cNvPicPr/>
                   </pic:nvPicPr>
                   <pic:blipFill>
-                    <a:blip r:embed="rId21"/>
+                    <a:blip r:embed="rId22"/>
                     <a:stretch>
                       <a:fillRect/>
                     </a:stretch>
@@ -2692,7 +2808,7 @@
                   <pic:spPr>
                     <a:xfrm>
                       <a:off x="0" y="0"/>
-                      <a:ext cx="5760720" cy="3894091"/>
+                      <a:ext cx="4297680" cy="2905115"/>
                     </a:xfrm>
                     <a:prstGeom prst="rect"/>
                   </pic:spPr>
@@ -2704,6 +2820,9 @@
       </w:r>
     </w:p>
     <w:p>
+      <w:pPr>
+        <w:jc w:val="center"/>
+      </w:pPr>
       <w:r>
         <w:rPr>
           <w:i/>
@@ -2761,10 +2880,13 @@
       </w:r>
     </w:p>
     <w:p>
+      <w:pPr>
+        <w:jc w:val="center"/>
+      </w:pPr>
       <w:r>
         <w:drawing>
           <wp:inline xmlns:a="http://schemas.openxmlformats.org/drawingml/2006/main" xmlns:pic="http://schemas.openxmlformats.org/drawingml/2006/picture">
-            <wp:extent cx="5760720" cy="5271602"/>
+            <wp:extent cx="4196813" cy="3840480"/>
             <wp:docPr id="15" name="Picture 15"/>
             <wp:cNvGraphicFramePr>
               <a:graphicFrameLocks noChangeAspect="1"/>
@@ -2777,7 +2899,7 @@
                     <pic:cNvPicPr/>
                   </pic:nvPicPr>
                   <pic:blipFill>
-                    <a:blip r:embed="rId22"/>
+                    <a:blip r:embed="rId23"/>
                     <a:stretch>
                       <a:fillRect/>
                     </a:stretch>
@@ -2785,7 +2907,7 @@
                   <pic:spPr>
                     <a:xfrm>
                       <a:off x="0" y="0"/>
-                      <a:ext cx="5760720" cy="5271602"/>
+                      <a:ext cx="4196813" cy="3840480"/>
                     </a:xfrm>
                     <a:prstGeom prst="rect"/>
                   </pic:spPr>
@@ -2797,6 +2919,9 @@
       </w:r>
     </w:p>
     <w:p>
+      <w:pPr>
+        <w:jc w:val="center"/>
+      </w:pPr>
       <w:r>
         <w:rPr>
           <w:i/>
@@ -2863,10 +2988,13 @@
       </w:r>
     </w:p>
     <w:p>
+      <w:pPr>
+        <w:jc w:val="center"/>
+      </w:pPr>
       <w:r>
         <w:drawing>
           <wp:inline xmlns:a="http://schemas.openxmlformats.org/drawingml/2006/main" xmlns:pic="http://schemas.openxmlformats.org/drawingml/2006/picture">
-            <wp:extent cx="5760720" cy="4199146"/>
+            <wp:extent cx="4297680" cy="3132696"/>
             <wp:docPr id="16" name="Picture 16"/>
             <wp:cNvGraphicFramePr>
               <a:graphicFrameLocks noChangeAspect="1"/>
@@ -2879,7 +3007,7 @@
                     <pic:cNvPicPr/>
                   </pic:nvPicPr>
                   <pic:blipFill>
-                    <a:blip r:embed="rId23"/>
+                    <a:blip r:embed="rId24"/>
                     <a:stretch>
                       <a:fillRect/>
                     </a:stretch>
@@ -2887,7 +3015,7 @@
                   <pic:spPr>
                     <a:xfrm>
                       <a:off x="0" y="0"/>
-                      <a:ext cx="5760720" cy="4199146"/>
+                      <a:ext cx="4297680" cy="3132696"/>
                     </a:xfrm>
                     <a:prstGeom prst="rect"/>
                   </pic:spPr>
@@ -2899,6 +3027,9 @@
       </w:r>
     </w:p>
     <w:p>
+      <w:pPr>
+        <w:jc w:val="center"/>
+      </w:pPr>
       <w:r>
         <w:rPr>
           <w:i/>
@@ -2990,14 +3121,14 @@
         <w:tblLook w:firstColumn="1" w:firstRow="1" w:lastColumn="0" w:lastRow="0" w:noHBand="0" w:noVBand="1" w:val="04A0"/>
       </w:tblPr>
       <w:tblGrid>
-        <w:gridCol w:w="2880"/>
-        <w:gridCol w:w="2880"/>
-        <w:gridCol w:w="2880"/>
+        <w:gridCol w:w="3120"/>
+        <w:gridCol w:w="3120"/>
+        <w:gridCol w:w="3120"/>
       </w:tblGrid>
       <w:tr>
         <w:tc>
           <w:tcPr>
-            <w:tcW w:type="dxa" w:w="2880"/>
+            <w:tcW w:type="dxa" w:w="3120"/>
             <w:shd w:val="clear" w:fill="DDEBFF"/>
           </w:tcPr>
           <w:p>
@@ -3016,7 +3147,7 @@
         </w:tc>
         <w:tc>
           <w:tcPr>
-            <w:tcW w:type="dxa" w:w="2880"/>
+            <w:tcW w:type="dxa" w:w="3120"/>
             <w:shd w:val="clear" w:fill="DDEBFF"/>
           </w:tcPr>
           <w:p>
@@ -3035,7 +3166,7 @@
         </w:tc>
         <w:tc>
           <w:tcPr>
-            <w:tcW w:type="dxa" w:w="2880"/>
+            <w:tcW w:type="dxa" w:w="3120"/>
             <w:shd w:val="clear" w:fill="DDEBFF"/>
           </w:tcPr>
           <w:p>
@@ -3056,7 +3187,7 @@
       <w:tr>
         <w:tc>
           <w:tcPr>
-            <w:tcW w:type="dxa" w:w="2880"/>
+            <w:tcW w:type="dxa" w:w="3120"/>
           </w:tcPr>
           <w:p>
             <w:r/>
@@ -3067,7 +3198,7 @@
         </w:tc>
         <w:tc>
           <w:tcPr>
-            <w:tcW w:type="dxa" w:w="2880"/>
+            <w:tcW w:type="dxa" w:w="3120"/>
           </w:tcPr>
           <w:p>
             <w:r/>
@@ -3078,7 +3209,7 @@
         </w:tc>
         <w:tc>
           <w:tcPr>
-            <w:tcW w:type="dxa" w:w="2880"/>
+            <w:tcW w:type="dxa" w:w="3120"/>
           </w:tcPr>
           <w:p>
             <w:r/>
@@ -3117,7 +3248,7 @@
       <w:tr>
         <w:tc>
           <w:tcPr>
-            <w:tcW w:type="dxa" w:w="2880"/>
+            <w:tcW w:type="dxa" w:w="3120"/>
           </w:tcPr>
           <w:p>
             <w:r/>
@@ -3128,7 +3259,7 @@
         </w:tc>
         <w:tc>
           <w:tcPr>
-            <w:tcW w:type="dxa" w:w="2880"/>
+            <w:tcW w:type="dxa" w:w="3120"/>
           </w:tcPr>
           <w:p>
             <w:r/>
@@ -3139,7 +3270,7 @@
         </w:tc>
         <w:tc>
           <w:tcPr>
-            <w:tcW w:type="dxa" w:w="2880"/>
+            <w:tcW w:type="dxa" w:w="3120"/>
           </w:tcPr>
           <w:p>
             <w:r/>
@@ -3170,7 +3301,7 @@
       <w:tr>
         <w:tc>
           <w:tcPr>
-            <w:tcW w:type="dxa" w:w="2880"/>
+            <w:tcW w:type="dxa" w:w="3120"/>
           </w:tcPr>
           <w:p>
             <w:r/>
@@ -3181,7 +3312,7 @@
         </w:tc>
         <w:tc>
           <w:tcPr>
-            <w:tcW w:type="dxa" w:w="2880"/>
+            <w:tcW w:type="dxa" w:w="3120"/>
           </w:tcPr>
           <w:p>
             <w:r/>
@@ -3192,7 +3323,7 @@
         </w:tc>
         <w:tc>
           <w:tcPr>
-            <w:tcW w:type="dxa" w:w="2880"/>
+            <w:tcW w:type="dxa" w:w="3120"/>
           </w:tcPr>
           <w:p>
             <w:r/>
@@ -3232,7 +3363,7 @@
       <w:tr>
         <w:tc>
           <w:tcPr>
-            <w:tcW w:type="dxa" w:w="2880"/>
+            <w:tcW w:type="dxa" w:w="3120"/>
           </w:tcPr>
           <w:p>
             <w:r/>
@@ -3243,7 +3374,7 @@
         </w:tc>
         <w:tc>
           <w:tcPr>
-            <w:tcW w:type="dxa" w:w="2880"/>
+            <w:tcW w:type="dxa" w:w="3120"/>
           </w:tcPr>
           <w:p>
             <w:r/>
@@ -3254,7 +3385,7 @@
         </w:tc>
         <w:tc>
           <w:tcPr>
-            <w:tcW w:type="dxa" w:w="2880"/>
+            <w:tcW w:type="dxa" w:w="3120"/>
           </w:tcPr>
           <w:p>
             <w:r/>
@@ -3294,7 +3425,7 @@
       <w:tr>
         <w:tc>
           <w:tcPr>
-            <w:tcW w:type="dxa" w:w="2880"/>
+            <w:tcW w:type="dxa" w:w="3120"/>
           </w:tcPr>
           <w:p>
             <w:r/>
@@ -3305,7 +3436,7 @@
         </w:tc>
         <w:tc>
           <w:tcPr>
-            <w:tcW w:type="dxa" w:w="2880"/>
+            <w:tcW w:type="dxa" w:w="3120"/>
           </w:tcPr>
           <w:p>
             <w:r/>
@@ -3316,7 +3447,7 @@
         </w:tc>
         <w:tc>
           <w:tcPr>
-            <w:tcW w:type="dxa" w:w="2880"/>
+            <w:tcW w:type="dxa" w:w="3120"/>
           </w:tcPr>
           <w:p>
             <w:r/>
@@ -3329,7 +3460,7 @@
       <w:tr>
         <w:tc>
           <w:tcPr>
-            <w:tcW w:type="dxa" w:w="2880"/>
+            <w:tcW w:type="dxa" w:w="3120"/>
           </w:tcPr>
           <w:p>
             <w:r/>
@@ -3340,7 +3471,7 @@
         </w:tc>
         <w:tc>
           <w:tcPr>
-            <w:tcW w:type="dxa" w:w="2880"/>
+            <w:tcW w:type="dxa" w:w="3120"/>
           </w:tcPr>
           <w:p>
             <w:r/>
@@ -3351,7 +3482,7 @@
         </w:tc>
         <w:tc>
           <w:tcPr>
-            <w:tcW w:type="dxa" w:w="2880"/>
+            <w:tcW w:type="dxa" w:w="3120"/>
           </w:tcPr>
           <w:p>
             <w:r/>
@@ -3364,7 +3495,7 @@
       <w:tr>
         <w:tc>
           <w:tcPr>
-            <w:tcW w:type="dxa" w:w="2880"/>
+            <w:tcW w:type="dxa" w:w="3120"/>
           </w:tcPr>
           <w:p>
             <w:r/>
@@ -3375,7 +3506,7 @@
         </w:tc>
         <w:tc>
           <w:tcPr>
-            <w:tcW w:type="dxa" w:w="2880"/>
+            <w:tcW w:type="dxa" w:w="3120"/>
           </w:tcPr>
           <w:p>
             <w:r/>
@@ -3386,7 +3517,7 @@
         </w:tc>
         <w:tc>
           <w:tcPr>
-            <w:tcW w:type="dxa" w:w="2880"/>
+            <w:tcW w:type="dxa" w:w="3120"/>
           </w:tcPr>
           <w:p>
             <w:r/>
@@ -3426,7 +3557,7 @@
       <w:tr>
         <w:tc>
           <w:tcPr>
-            <w:tcW w:type="dxa" w:w="2880"/>
+            <w:tcW w:type="dxa" w:w="3120"/>
           </w:tcPr>
           <w:p>
             <w:r/>
@@ -3437,7 +3568,7 @@
         </w:tc>
         <w:tc>
           <w:tcPr>
-            <w:tcW w:type="dxa" w:w="2880"/>
+            <w:tcW w:type="dxa" w:w="3120"/>
           </w:tcPr>
           <w:p>
             <w:r/>
@@ -3448,7 +3579,7 @@
         </w:tc>
         <w:tc>
           <w:tcPr>
-            <w:tcW w:type="dxa" w:w="2880"/>
+            <w:tcW w:type="dxa" w:w="3120"/>
           </w:tcPr>
           <w:p>
             <w:r/>
@@ -3479,7 +3610,7 @@
       <w:tr>
         <w:tc>
           <w:tcPr>
-            <w:tcW w:type="dxa" w:w="2880"/>
+            <w:tcW w:type="dxa" w:w="3120"/>
           </w:tcPr>
           <w:p>
             <w:r/>
@@ -3490,7 +3621,7 @@
         </w:tc>
         <w:tc>
           <w:tcPr>
-            <w:tcW w:type="dxa" w:w="2880"/>
+            <w:tcW w:type="dxa" w:w="3120"/>
           </w:tcPr>
           <w:p>
             <w:r/>
@@ -3501,7 +3632,7 @@
         </w:tc>
         <w:tc>
           <w:tcPr>
-            <w:tcW w:type="dxa" w:w="2880"/>
+            <w:tcW w:type="dxa" w:w="3120"/>
           </w:tcPr>
           <w:p>
             <w:r/>
@@ -3532,7 +3663,7 @@
       <w:tr>
         <w:tc>
           <w:tcPr>
-            <w:tcW w:type="dxa" w:w="2880"/>
+            <w:tcW w:type="dxa" w:w="3120"/>
           </w:tcPr>
           <w:p>
             <w:r/>
@@ -3543,7 +3674,7 @@
         </w:tc>
         <w:tc>
           <w:tcPr>
-            <w:tcW w:type="dxa" w:w="2880"/>
+            <w:tcW w:type="dxa" w:w="3120"/>
           </w:tcPr>
           <w:p>
             <w:r/>
@@ -3554,7 +3685,7 @@
         </w:tc>
         <w:tc>
           <w:tcPr>
-            <w:tcW w:type="dxa" w:w="2880"/>
+            <w:tcW w:type="dxa" w:w="3120"/>
           </w:tcPr>
           <w:p>
             <w:r/>
@@ -3576,7 +3707,7 @@
       <w:tr>
         <w:tc>
           <w:tcPr>
-            <w:tcW w:type="dxa" w:w="2880"/>
+            <w:tcW w:type="dxa" w:w="3120"/>
           </w:tcPr>
           <w:p>
             <w:r/>
@@ -3587,7 +3718,7 @@
         </w:tc>
         <w:tc>
           <w:tcPr>
-            <w:tcW w:type="dxa" w:w="2880"/>
+            <w:tcW w:type="dxa" w:w="3120"/>
           </w:tcPr>
           <w:p>
             <w:r/>
@@ -3598,7 +3729,7 @@
         </w:tc>
         <w:tc>
           <w:tcPr>
-            <w:tcW w:type="dxa" w:w="2880"/>
+            <w:tcW w:type="dxa" w:w="3120"/>
           </w:tcPr>
           <w:p>
             <w:r/>
@@ -3620,7 +3751,7 @@
       <w:tr>
         <w:tc>
           <w:tcPr>
-            <w:tcW w:type="dxa" w:w="2880"/>
+            <w:tcW w:type="dxa" w:w="3120"/>
           </w:tcPr>
           <w:p>
             <w:r/>
@@ -3631,7 +3762,7 @@
         </w:tc>
         <w:tc>
           <w:tcPr>
-            <w:tcW w:type="dxa" w:w="2880"/>
+            <w:tcW w:type="dxa" w:w="3120"/>
           </w:tcPr>
           <w:p>
             <w:r/>
@@ -3642,7 +3773,7 @@
         </w:tc>
         <w:tc>
           <w:tcPr>
-            <w:tcW w:type="dxa" w:w="2880"/>
+            <w:tcW w:type="dxa" w:w="3120"/>
           </w:tcPr>
           <w:p>
             <w:r/>
@@ -3664,7 +3795,7 @@
       <w:tr>
         <w:tc>
           <w:tcPr>
-            <w:tcW w:type="dxa" w:w="2880"/>
+            <w:tcW w:type="dxa" w:w="3120"/>
           </w:tcPr>
           <w:p>
             <w:r/>
@@ -3675,7 +3806,7 @@
         </w:tc>
         <w:tc>
           <w:tcPr>
-            <w:tcW w:type="dxa" w:w="2880"/>
+            <w:tcW w:type="dxa" w:w="3120"/>
           </w:tcPr>
           <w:p>
             <w:r/>
@@ -3686,7 +3817,7 @@
         </w:tc>
         <w:tc>
           <w:tcPr>
-            <w:tcW w:type="dxa" w:w="2880"/>
+            <w:tcW w:type="dxa" w:w="3120"/>
           </w:tcPr>
           <w:p>
             <w:r/>
@@ -3721,13 +3852,13 @@
         <w:tblLook w:firstColumn="1" w:firstRow="1" w:lastColumn="0" w:lastRow="0" w:noHBand="0" w:noVBand="1" w:val="04A0"/>
       </w:tblPr>
       <w:tblGrid>
-        <w:gridCol w:w="4320"/>
-        <w:gridCol w:w="4320"/>
+        <w:gridCol w:w="4680"/>
+        <w:gridCol w:w="4680"/>
       </w:tblGrid>
       <w:tr>
         <w:tc>
           <w:tcPr>
-            <w:tcW w:type="dxa" w:w="4320"/>
+            <w:tcW w:type="dxa" w:w="4680"/>
             <w:shd w:val="clear" w:fill="DDEBFF"/>
           </w:tcPr>
           <w:p>
@@ -3746,7 +3877,7 @@
         </w:tc>
         <w:tc>
           <w:tcPr>
-            <w:tcW w:type="dxa" w:w="4320"/>
+            <w:tcW w:type="dxa" w:w="4680"/>
             <w:shd w:val="clear" w:fill="DDEBFF"/>
           </w:tcPr>
           <w:p>
@@ -3767,7 +3898,7 @@
       <w:tr>
         <w:tc>
           <w:tcPr>
-            <w:tcW w:type="dxa" w:w="4320"/>
+            <w:tcW w:type="dxa" w:w="4680"/>
           </w:tcPr>
           <w:p>
             <w:r/>
@@ -3778,7 +3909,7 @@
         </w:tc>
         <w:tc>
           <w:tcPr>
-            <w:tcW w:type="dxa" w:w="4320"/>
+            <w:tcW w:type="dxa" w:w="4680"/>
           </w:tcPr>
           <w:p>
             <w:r/>
@@ -3791,7 +3922,7 @@
       <w:tr>
         <w:tc>
           <w:tcPr>
-            <w:tcW w:type="dxa" w:w="4320"/>
+            <w:tcW w:type="dxa" w:w="4680"/>
           </w:tcPr>
           <w:p>
             <w:r/>
@@ -3802,7 +3933,7 @@
         </w:tc>
         <w:tc>
           <w:tcPr>
-            <w:tcW w:type="dxa" w:w="4320"/>
+            <w:tcW w:type="dxa" w:w="4680"/>
           </w:tcPr>
           <w:p>
             <w:r/>
@@ -3815,7 +3946,7 @@
       <w:tr>
         <w:tc>
           <w:tcPr>
-            <w:tcW w:type="dxa" w:w="4320"/>
+            <w:tcW w:type="dxa" w:w="4680"/>
           </w:tcPr>
           <w:p>
             <w:r/>
@@ -3826,7 +3957,7 @@
         </w:tc>
         <w:tc>
           <w:tcPr>
-            <w:tcW w:type="dxa" w:w="4320"/>
+            <w:tcW w:type="dxa" w:w="4680"/>
           </w:tcPr>
           <w:p>
             <w:r/>
@@ -3839,7 +3970,7 @@
       <w:tr>
         <w:tc>
           <w:tcPr>
-            <w:tcW w:type="dxa" w:w="4320"/>
+            <w:tcW w:type="dxa" w:w="4680"/>
           </w:tcPr>
           <w:p>
             <w:r/>
@@ -3850,7 +3981,7 @@
         </w:tc>
         <w:tc>
           <w:tcPr>
-            <w:tcW w:type="dxa" w:w="4320"/>
+            <w:tcW w:type="dxa" w:w="4680"/>
           </w:tcPr>
           <w:p>
             <w:r/>
@@ -3863,7 +3994,7 @@
       <w:tr>
         <w:tc>
           <w:tcPr>
-            <w:tcW w:type="dxa" w:w="4320"/>
+            <w:tcW w:type="dxa" w:w="4680"/>
           </w:tcPr>
           <w:p>
             <w:r/>
@@ -3874,7 +4005,7 @@
         </w:tc>
         <w:tc>
           <w:tcPr>
-            <w:tcW w:type="dxa" w:w="4320"/>
+            <w:tcW w:type="dxa" w:w="4680"/>
           </w:tcPr>
           <w:p>
             <w:r/>
@@ -3887,7 +4018,7 @@
       <w:tr>
         <w:tc>
           <w:tcPr>
-            <w:tcW w:type="dxa" w:w="4320"/>
+            <w:tcW w:type="dxa" w:w="4680"/>
           </w:tcPr>
           <w:p>
             <w:r/>
@@ -3898,7 +4029,7 @@
         </w:tc>
         <w:tc>
           <w:tcPr>
-            <w:tcW w:type="dxa" w:w="4320"/>
+            <w:tcW w:type="dxa" w:w="4680"/>
           </w:tcPr>
           <w:p>
             <w:r/>
@@ -3911,7 +4042,7 @@
       <w:tr>
         <w:tc>
           <w:tcPr>
-            <w:tcW w:type="dxa" w:w="4320"/>
+            <w:tcW w:type="dxa" w:w="4680"/>
           </w:tcPr>
           <w:p>
             <w:r/>
@@ -3922,7 +4053,7 @@
         </w:tc>
         <w:tc>
           <w:tcPr>
-            <w:tcW w:type="dxa" w:w="4320"/>
+            <w:tcW w:type="dxa" w:w="4680"/>
           </w:tcPr>
           <w:p>
             <w:r/>
@@ -4133,13 +4264,37 @@
       </w:r>
     </w:p>
     <w:sectPr>
+      <w:footerReference w:type="default" r:id="rId9"/>
       <w:pgSz w:w="12240" w:h="15840"/>
-      <w:pgMar w:top="1440" w:right="1800" w:bottom="1440" w:left="1800" w:header="720" w:footer="720" w:gutter="0"/>
+      <w:pgMar w:top="1296" w:right="1440" w:bottom="1296" w:left="1440" w:header="720" w:footer="720" w:gutter="0"/>
       <w:cols w:space="720"/>
       <w:docGrid w:linePitch="360"/>
     </w:sectPr>
   </w:body>
 </w:document>
+</file>
+
+<file path=word/footer1.xml><?xml version="1.0" encoding="utf-8"?>
+<w:ftr xmlns:m="http://schemas.openxmlformats.org/officeDocument/2006/math" xmlns:mc="http://schemas.openxmlformats.org/markup-compatibility/2006" xmlns:mo="http://schemas.microsoft.com/office/mac/office/2008/main" xmlns:mv="urn:schemas-microsoft-com:mac:vml" xmlns:o="urn:schemas-microsoft-com:office:office" xmlns:r="http://schemas.openxmlformats.org/officeDocument/2006/relationships" xmlns:v="urn:schemas-microsoft-com:vml" xmlns:w10="urn:schemas-microsoft-com:office:word" xmlns:w14="http://schemas.microsoft.com/office/word/2010/wordml" xmlns:w="http://schemas.openxmlformats.org/wordprocessingml/2006/main" xmlns:wne="http://schemas.microsoft.com/office/word/2006/wordml" xmlns:wp14="http://schemas.microsoft.com/office/word/2010/wordprocessingDrawing" xmlns:wp="http://schemas.openxmlformats.org/drawingml/2006/wordprocessingDrawing" xmlns:wpc="http://schemas.microsoft.com/office/word/2010/wordprocessingCanvas" xmlns:wpg="http://schemas.microsoft.com/office/word/2010/wordprocessingGroup" xmlns:wpi="http://schemas.microsoft.com/office/word/2010/wordprocessingInk" xmlns:wps="http://schemas.microsoft.com/office/word/2010/wordprocessingShape" mc:Ignorable="w14 wp14">
+  <w:p>
+    <w:pPr>
+      <w:pStyle w:val="Footer"/>
+      <w:jc w:val="center"/>
+    </w:pPr>
+    <w:r>
+      <w:rPr>
+        <w:color w:val="808080"/>
+        <w:sz w:val="18"/>
+      </w:rPr>
+      <w:t xml:space="preserve">Page </w:t>
+      <w:fldChar w:fldCharType="begin"/>
+      <w:instrText xml:space="preserve">PAGE</w:instrText>
+      <w:fldChar w:fldCharType="separate"/>
+      <w:t>1</w:t>
+      <w:fldChar w:fldCharType="end"/>
+    </w:r>
+  </w:p>
+</w:ftr>
 </file>
 
 <file path=word/numbering.xml><?xml version="1.0" encoding="utf-8"?>

</xml_diff>